<commit_message>
test(rfq): end-to-end render test and example outputs
</commit_message>
<xml_diff>
--- a/backend/saz/examples/templates/rfq_template.docx
+++ b/backend/saz/examples/templates/rfq_template.docx
@@ -701,7 +701,7 @@
           <w:sz w:val="20"/>
           <w:highlight w:val="yellow"/>
         </w:rPr>
-        <w:t>{{extra_1}}</w:t>
+        <w:t>© GÉANT Vereniging, 2024</w:t>
       </w:r>
     </w:p>
     <w:p>
@@ -2063,7 +2063,7 @@
           <w:szCs w:val="18"/>
           <w:highlight w:val="yellow"/>
         </w:rPr>
-        <w:t>{{extra_2}}</w:t>
+        <w:t>E:</w:t>
       </w:r>
       <w:r>
         <w:rPr>
@@ -2073,6 +2073,7 @@
           <w:szCs w:val="18"/>
           <w:highlight w:val="yellow"/>
         </w:rPr>
+        <w:t xml:space="preserve"> </w:t>
       </w:r>
       <w:hyperlink r:id="rId21">
         <w:r>
@@ -2895,7 +2896,7 @@
           <w:szCs w:val="18"/>
           <w:highlight w:val="yellow"/>
         </w:rPr>
-        <w:t>{{extra_3}}</w:t>
+        <w:t xml:space="preserve">Evaluation Phase 2 will consist of demonstrations provided by all Bidders who can theoretically still win the Tender after Evaluation Phase 1. </w:t>
       </w:r>
       <w:r>
         <w:rPr>
@@ -2905,6 +2906,7 @@
           <w:szCs w:val="18"/>
           <w:highlight w:val="yellow"/>
         </w:rPr>
+        <w:t>Section 6.1 will elaborate further on the implications this has on scoring. The demos will take a maximum of 75 minutes, of which at least 15 minutes are dedicated to questions.</w:t>
       </w:r>
     </w:p>
     <w:p>
@@ -2934,7 +2936,7 @@
           <w:szCs w:val="18"/>
           <w:highlight w:val="yellow"/>
         </w:rPr>
-        <w:t>{{extra_4}}</w:t>
+        <w:t>The demos will be scored based on the criteria in Q1. Bidders will be asked to elaborate only on features they mentioned in their responses to Q1 – no additional features or functionalities will be taken into account by the Evaluation team.</w:t>
       </w:r>
       <w:r>
         <w:rPr>
@@ -3336,7 +3338,7 @@
           <w:szCs w:val="18"/>
           <w:highlight w:val="yellow"/>
         </w:rPr>
-        <w:t>{{extra_5}}</w:t>
+        <w:t>By submitting a Proposal, you indicate your agreement with the following minimum requirements.</w:t>
       </w:r>
     </w:p>
     <w:tbl>
@@ -3384,7 +3386,7 @@
                 <w:color w:val="000000" w:themeColor="text1"/>
                 <w:highlight w:val="yellow"/>
               </w:rPr>
-              <w:t>{{extra_18}}</w:t>
+              <w:t>#</w:t>
             </w:r>
           </w:p>
         </w:tc>
@@ -3418,7 +3420,7 @@
                 <w:color w:val="000000" w:themeColor="text1"/>
                 <w:highlight w:val="yellow"/>
               </w:rPr>
-              <w:t>{{extra_19}}</w:t>
+              <w:t>Requirement</w:t>
             </w:r>
           </w:p>
         </w:tc>
@@ -3453,7 +3455,7 @@
                 <w:rFonts w:ascii="Calibri Light" w:eastAsia="Calibri Light" w:hAnsi="Calibri Light" w:cs="Calibri Light"/>
                 <w:highlight w:val="yellow"/>
               </w:rPr>
-              <w:t>{{extra_20}}</w:t>
+              <w:t>1.</w:t>
             </w:r>
           </w:p>
         </w:tc>
@@ -3518,7 +3520,7 @@
                 <w:rFonts w:ascii="Calibri Light" w:eastAsia="Calibri Light" w:hAnsi="Calibri Light" w:cs="Calibri Light"/>
                 <w:highlight w:val="yellow"/>
               </w:rPr>
-              <w:t>{{extra_21}}</w:t>
+              <w:t>2.</w:t>
             </w:r>
           </w:p>
         </w:tc>
@@ -3548,7 +3550,7 @@
                 <w:rFonts w:ascii="Calibri Light" w:eastAsia="Calibri Light" w:hAnsi="Calibri Light" w:cs="Calibri Light"/>
                 <w:highlight w:val="yellow"/>
               </w:rPr>
-              <w:t>{{extra_22}}</w:t>
+              <w:t>Data storage and backup storage takes place within the EU or UK.</w:t>
             </w:r>
           </w:p>
         </w:tc>
@@ -3583,7 +3585,7 @@
                 <w:rFonts w:ascii="Calibri Light" w:eastAsia="Calibri Light" w:hAnsi="Calibri Light" w:cs="Calibri Light"/>
                 <w:highlight w:val="yellow"/>
               </w:rPr>
-              <w:t>{{extra_23}}</w:t>
+              <w:t>3.</w:t>
             </w:r>
           </w:p>
         </w:tc>
@@ -3613,7 +3615,7 @@
                 <w:rFonts w:ascii="Calibri Light" w:eastAsia="Calibri Light" w:hAnsi="Calibri Light" w:cs="Calibri Light"/>
                 <w:highlight w:val="yellow"/>
               </w:rPr>
-              <w:t>{{extra_24}}</w:t>
+              <w:t>The solution provides encryption in transit (TLS1.2 or above) and, if provided as a SaaS solution, provides encryption at rest.</w:t>
             </w:r>
           </w:p>
         </w:tc>
@@ -3648,7 +3650,7 @@
                 <w:rFonts w:ascii="Calibri Light" w:eastAsia="Calibri Light" w:hAnsi="Calibri Light" w:cs="Calibri Light"/>
                 <w:highlight w:val="yellow"/>
               </w:rPr>
-              <w:t>{{extra_25}}</w:t>
+              <w:t>4.</w:t>
             </w:r>
           </w:p>
         </w:tc>
@@ -3678,7 +3680,7 @@
                 <w:rFonts w:ascii="Calibri Light" w:eastAsia="Calibri Light" w:hAnsi="Calibri Light" w:cs="Calibri Light"/>
                 <w:highlight w:val="yellow"/>
               </w:rPr>
-              <w:t>{{extra_26}}</w:t>
+              <w:t>The system integrates with Office 365 and Azure (Entra).</w:t>
             </w:r>
           </w:p>
         </w:tc>
@@ -3713,7 +3715,7 @@
                 <w:rFonts w:ascii="Calibri Light" w:eastAsia="Calibri Light" w:hAnsi="Calibri Light" w:cs="Calibri Light"/>
                 <w:highlight w:val="yellow"/>
               </w:rPr>
-              <w:t>{{extra_27}}</w:t>
+              <w:t>5.</w:t>
             </w:r>
           </w:p>
         </w:tc>
@@ -3740,7 +3742,7 @@
                 <w:rFonts w:ascii="Calibri Light" w:eastAsia="Calibri Light" w:hAnsi="Calibri Light" w:cs="Calibri Light"/>
                 <w:highlight w:val="yellow"/>
               </w:rPr>
-              <w:t>{{extra_28}}</w:t>
+              <w:t>The system is able to work seamlessly across UK and NL (and to expand to other countries if needed), including storing salaries in multiple currencies and enabling different set ups for different countries (for example holidays, bank holidays, sick pay etc).</w:t>
             </w:r>
           </w:p>
         </w:tc>
@@ -4034,7 +4036,7 @@
                 <w:szCs w:val="18"/>
                 <w:highlight w:val="yellow"/>
               </w:rPr>
-              <w:t>{{extra_29}}</w:t>
+              <w:t>Q1 – User Experience</w:t>
             </w:r>
           </w:p>
           <w:p>
@@ -4055,7 +4057,7 @@
                 <w:szCs w:val="18"/>
                 <w:highlight w:val="yellow"/>
               </w:rPr>
-              <w:t>{{extra_30}}</w:t>
+              <w:t xml:space="preserve"> </w:t>
             </w:r>
           </w:p>
         </w:tc>
@@ -4111,7 +4113,7 @@
                 <w:highlight w:val="yellow"/>
                 <w:lang w:val="en-US"/>
               </w:rPr>
-              <w:t>{{extra_31}}</w:t>
+              <w:t>User Interfac</w:t>
             </w:r>
             <w:r>
               <w:rPr>
@@ -4123,6 +4125,7 @@
                 <w:highlight w:val="yellow"/>
                 <w:lang w:val="en-US"/>
               </w:rPr>
+              <w:t>e and Employee Self-Service</w:t>
             </w:r>
           </w:p>
           <w:p>
@@ -4142,133 +4145,147 @@
                 <w:highlight w:val="yellow"/>
                 <w:lang w:val="en-US"/>
               </w:rPr>
-              <w:t>{{extra_32}}</w:t>
-            </w:r>
-            <w:r>
-              <w:rPr>
-                <w:rFonts w:asciiTheme="majorHAnsi" w:eastAsia="Calibri" w:hAnsiTheme="majorHAnsi" w:cstheme="majorHAnsi"/>
-                <w:sz w:val="18"/>
-                <w:szCs w:val="18"/>
-                <w:highlight w:val="yellow"/>
-                <w:lang w:val="en-US"/>
-              </w:rPr>
-            </w:r>
-            <w:r>
-              <w:rPr>
-                <w:rFonts w:asciiTheme="majorHAnsi" w:eastAsia="Calibri" w:hAnsiTheme="majorHAnsi" w:cstheme="majorHAnsi"/>
-                <w:sz w:val="18"/>
-                <w:szCs w:val="18"/>
-                <w:highlight w:val="yellow"/>
-                <w:lang w:val="en-US"/>
-              </w:rPr>
-            </w:r>
-            <w:r>
-              <w:rPr>
-                <w:rFonts w:asciiTheme="majorHAnsi" w:eastAsia="Calibri" w:hAnsiTheme="majorHAnsi" w:cstheme="majorHAnsi"/>
-                <w:sz w:val="18"/>
-                <w:szCs w:val="18"/>
-                <w:highlight w:val="yellow"/>
-                <w:lang w:val="en-US"/>
-              </w:rPr>
-            </w:r>
-            <w:r>
-              <w:rPr>
-                <w:rFonts w:asciiTheme="majorHAnsi" w:eastAsia="Calibri" w:hAnsiTheme="majorHAnsi" w:cstheme="majorHAnsi"/>
-                <w:sz w:val="18"/>
-                <w:szCs w:val="18"/>
-                <w:highlight w:val="yellow"/>
-                <w:lang w:val="en-US"/>
-              </w:rPr>
-            </w:r>
-            <w:r>
-              <w:rPr>
-                <w:rFonts w:asciiTheme="majorHAnsi" w:eastAsia="Calibri" w:hAnsiTheme="majorHAnsi" w:cstheme="majorHAnsi"/>
-                <w:sz w:val="18"/>
-                <w:szCs w:val="18"/>
-                <w:highlight w:val="yellow"/>
-                <w:lang w:val="en-US"/>
-              </w:rPr>
-            </w:r>
-            <w:r>
-              <w:rPr>
-                <w:rFonts w:asciiTheme="majorHAnsi" w:eastAsia="Calibri" w:hAnsiTheme="majorHAnsi" w:cstheme="majorHAnsi"/>
-                <w:sz w:val="18"/>
-                <w:szCs w:val="18"/>
-                <w:highlight w:val="yellow"/>
-                <w:lang w:val="en-US"/>
-              </w:rPr>
-            </w:r>
-            <w:r>
-              <w:rPr>
-                <w:rFonts w:asciiTheme="majorHAnsi" w:eastAsia="Calibri" w:hAnsiTheme="majorHAnsi" w:cstheme="majorHAnsi"/>
-                <w:sz w:val="18"/>
-                <w:szCs w:val="18"/>
-                <w:highlight w:val="yellow"/>
-                <w:lang w:val="en-US"/>
-              </w:rPr>
-            </w:r>
-            <w:r>
-              <w:rPr>
-                <w:rFonts w:asciiTheme="majorHAnsi" w:eastAsia="Calibri" w:hAnsiTheme="majorHAnsi" w:cstheme="majorHAnsi"/>
-                <w:sz w:val="18"/>
-                <w:szCs w:val="18"/>
-                <w:highlight w:val="yellow"/>
-                <w:lang w:val="en-US"/>
-              </w:rPr>
-            </w:r>
-            <w:r>
-              <w:rPr>
-                <w:rFonts w:asciiTheme="majorHAnsi" w:eastAsia="Calibri" w:hAnsiTheme="majorHAnsi" w:cstheme="majorHAnsi"/>
-                <w:sz w:val="18"/>
-                <w:szCs w:val="18"/>
-                <w:highlight w:val="yellow"/>
-                <w:lang w:val="en-US"/>
-              </w:rPr>
-            </w:r>
-            <w:r>
-              <w:rPr>
-                <w:rFonts w:asciiTheme="majorHAnsi" w:eastAsia="Calibri" w:hAnsiTheme="majorHAnsi" w:cstheme="majorHAnsi"/>
-                <w:sz w:val="18"/>
-                <w:szCs w:val="18"/>
-                <w:highlight w:val="yellow"/>
-                <w:lang w:val="en-US"/>
-              </w:rPr>
-            </w:r>
-            <w:r>
-              <w:rPr>
-                <w:rFonts w:asciiTheme="majorHAnsi" w:eastAsia="Calibri" w:hAnsiTheme="majorHAnsi" w:cstheme="majorHAnsi"/>
-                <w:sz w:val="18"/>
-                <w:szCs w:val="18"/>
-                <w:highlight w:val="yellow"/>
-                <w:lang w:val="en-US"/>
-              </w:rPr>
-            </w:r>
-            <w:r>
-              <w:rPr>
-                <w:rFonts w:asciiTheme="majorHAnsi" w:eastAsia="Calibri" w:hAnsiTheme="majorHAnsi" w:cstheme="majorHAnsi"/>
-                <w:sz w:val="18"/>
-                <w:szCs w:val="18"/>
-                <w:highlight w:val="yellow"/>
-                <w:lang w:val="en-US"/>
-              </w:rPr>
-            </w:r>
-            <w:r>
-              <w:rPr>
-                <w:rFonts w:asciiTheme="majorHAnsi" w:eastAsia="Calibri" w:hAnsiTheme="majorHAnsi" w:cstheme="majorHAnsi"/>
-                <w:sz w:val="18"/>
-                <w:szCs w:val="18"/>
-                <w:highlight w:val="yellow"/>
-                <w:lang w:val="en-US"/>
-              </w:rPr>
-            </w:r>
-            <w:r>
-              <w:rPr>
-                <w:rFonts w:asciiTheme="majorHAnsi" w:eastAsia="Calibri" w:hAnsiTheme="majorHAnsi" w:cstheme="majorHAnsi"/>
-                <w:sz w:val="18"/>
-                <w:szCs w:val="18"/>
-                <w:highlight w:val="yellow"/>
-                <w:lang w:val="en-US"/>
-              </w:rPr>
+              <w:t xml:space="preserve">The system needs to have a </w:t>
+            </w:r>
+            <w:r>
+              <w:rPr>
+                <w:rFonts w:asciiTheme="majorHAnsi" w:eastAsia="Calibri" w:hAnsiTheme="majorHAnsi" w:cstheme="majorHAnsi"/>
+                <w:sz w:val="18"/>
+                <w:szCs w:val="18"/>
+                <w:highlight w:val="yellow"/>
+                <w:lang w:val="en-US"/>
+              </w:rPr>
+              <w:t>modern, well-crafted,</w:t>
+            </w:r>
+            <w:r>
+              <w:rPr>
+                <w:rFonts w:asciiTheme="majorHAnsi" w:eastAsia="Calibri" w:hAnsiTheme="majorHAnsi" w:cstheme="majorHAnsi"/>
+                <w:sz w:val="18"/>
+                <w:szCs w:val="18"/>
+                <w:highlight w:val="yellow"/>
+                <w:lang w:val="en-US"/>
+              </w:rPr>
+              <w:t xml:space="preserve"> and user-friendly interface</w:t>
+            </w:r>
+            <w:r>
+              <w:rPr>
+                <w:rFonts w:asciiTheme="majorHAnsi" w:eastAsia="Calibri" w:hAnsiTheme="majorHAnsi" w:cstheme="majorHAnsi"/>
+                <w:sz w:val="18"/>
+                <w:szCs w:val="18"/>
+                <w:highlight w:val="yellow"/>
+                <w:lang w:val="en-US"/>
+              </w:rPr>
+              <w:t>, w</w:t>
+            </w:r>
+            <w:r>
+              <w:rPr>
+                <w:rFonts w:asciiTheme="majorHAnsi" w:eastAsia="Calibri" w:hAnsiTheme="majorHAnsi" w:cstheme="majorHAnsi"/>
+                <w:sz w:val="18"/>
+                <w:szCs w:val="18"/>
+                <w:highlight w:val="yellow"/>
+                <w:lang w:val="en-US"/>
+              </w:rPr>
+              <w:t>ith</w:t>
+            </w:r>
+            <w:r>
+              <w:rPr>
+                <w:rFonts w:asciiTheme="majorHAnsi" w:eastAsia="Calibri" w:hAnsiTheme="majorHAnsi" w:cstheme="majorHAnsi"/>
+                <w:sz w:val="18"/>
+                <w:szCs w:val="18"/>
+                <w:highlight w:val="yellow"/>
+                <w:lang w:val="en-US"/>
+              </w:rPr>
+              <w:t xml:space="preserve"> clear navigation, intuitive controls and visually appealing design</w:t>
+            </w:r>
+            <w:r>
+              <w:rPr>
+                <w:rFonts w:asciiTheme="majorHAnsi" w:eastAsia="Calibri" w:hAnsiTheme="majorHAnsi" w:cstheme="majorHAnsi"/>
+                <w:sz w:val="18"/>
+                <w:szCs w:val="18"/>
+                <w:highlight w:val="yellow"/>
+                <w:lang w:val="en-US"/>
+              </w:rPr>
+              <w:t xml:space="preserve">, </w:t>
+            </w:r>
+            <w:r>
+              <w:rPr>
+                <w:rFonts w:asciiTheme="majorHAnsi" w:eastAsia="Calibri" w:hAnsiTheme="majorHAnsi" w:cstheme="majorHAnsi"/>
+                <w:sz w:val="18"/>
+                <w:szCs w:val="18"/>
+                <w:highlight w:val="yellow"/>
+                <w:lang w:val="en-US"/>
+              </w:rPr>
+              <w:t>to e</w:t>
+            </w:r>
+            <w:r>
+              <w:rPr>
+                <w:rFonts w:asciiTheme="majorHAnsi" w:eastAsia="Calibri" w:hAnsiTheme="majorHAnsi" w:cstheme="majorHAnsi"/>
+                <w:sz w:val="18"/>
+                <w:szCs w:val="18"/>
+                <w:highlight w:val="yellow"/>
+                <w:lang w:val="en-US"/>
+              </w:rPr>
+              <w:t>ncourage</w:t>
+            </w:r>
+            <w:r>
+              <w:rPr>
+                <w:rFonts w:asciiTheme="majorHAnsi" w:eastAsia="Calibri" w:hAnsiTheme="majorHAnsi" w:cstheme="majorHAnsi"/>
+                <w:sz w:val="18"/>
+                <w:szCs w:val="18"/>
+                <w:highlight w:val="yellow"/>
+                <w:lang w:val="en-US"/>
+              </w:rPr>
+              <w:t xml:space="preserve"> </w:t>
+            </w:r>
+            <w:r>
+              <w:rPr>
+                <w:rFonts w:asciiTheme="majorHAnsi" w:eastAsia="Calibri" w:hAnsiTheme="majorHAnsi" w:cstheme="majorHAnsi"/>
+                <w:sz w:val="18"/>
+                <w:szCs w:val="18"/>
+                <w:highlight w:val="yellow"/>
+                <w:lang w:val="en-US"/>
+              </w:rPr>
+              <w:t>all our users</w:t>
+            </w:r>
+            <w:r>
+              <w:rPr>
+                <w:rFonts w:asciiTheme="majorHAnsi" w:eastAsia="Calibri" w:hAnsiTheme="majorHAnsi" w:cstheme="majorHAnsi"/>
+                <w:sz w:val="18"/>
+                <w:szCs w:val="18"/>
+                <w:highlight w:val="yellow"/>
+                <w:lang w:val="en-US"/>
+              </w:rPr>
+              <w:t xml:space="preserve"> to engage with the system and take full advantage of its capabilities. This is as important for key users, who will be regularly viewing and inputting data, as it is for the majority of users who will be accessing the system less frequently.  </w:t>
+            </w:r>
+            <w:r>
+              <w:rPr>
+                <w:rFonts w:asciiTheme="majorHAnsi" w:eastAsia="Calibri" w:hAnsiTheme="majorHAnsi" w:cstheme="majorHAnsi"/>
+                <w:sz w:val="18"/>
+                <w:szCs w:val="18"/>
+                <w:highlight w:val="yellow"/>
+                <w:lang w:val="en-US"/>
+              </w:rPr>
+              <w:t>Please provide a detailed description</w:t>
+            </w:r>
+            <w:r>
+              <w:rPr>
+                <w:rFonts w:asciiTheme="majorHAnsi" w:eastAsia="Calibri" w:hAnsiTheme="majorHAnsi" w:cstheme="majorHAnsi"/>
+                <w:sz w:val="18"/>
+                <w:szCs w:val="18"/>
+                <w:highlight w:val="yellow"/>
+                <w:lang w:val="en-US"/>
+              </w:rPr>
+              <w:t xml:space="preserve"> of your user interface</w:t>
+            </w:r>
+            <w:r>
+              <w:rPr>
+                <w:rFonts w:asciiTheme="majorHAnsi" w:eastAsia="Calibri" w:hAnsiTheme="majorHAnsi" w:cstheme="majorHAnsi"/>
+                <w:sz w:val="18"/>
+                <w:szCs w:val="18"/>
+                <w:highlight w:val="yellow"/>
+                <w:lang w:val="en-US"/>
+              </w:rPr>
+              <w:t xml:space="preserve">, including: </w:t>
             </w:r>
           </w:p>
           <w:p>
@@ -4288,7 +4305,7 @@
                 <w:highlight w:val="yellow"/>
                 <w:lang w:val="en-US"/>
               </w:rPr>
-              <w:t>{{extra_33}}</w:t>
+              <w:t xml:space="preserve"> </w:t>
             </w:r>
           </w:p>
           <w:p>
@@ -4314,7 +4331,7 @@
                 <w:highlight w:val="yellow"/>
                 <w:lang w:val="en-US"/>
               </w:rPr>
-              <w:t>{{extra_34}}</w:t>
+              <w:t>How often your UI is updated</w:t>
             </w:r>
           </w:p>
           <w:p>
@@ -4340,7 +4357,7 @@
                 <w:highlight w:val="yellow"/>
                 <w:lang w:val="en-US"/>
               </w:rPr>
-              <w:t>{{extra_35}}</w:t>
+              <w:t xml:space="preserve">Whether the UI can be </w:t>
             </w:r>
             <w:proofErr w:type="spellStart"/>
             <w:r>
@@ -4351,6 +4368,7 @@
                 <w:highlight w:val="yellow"/>
                 <w:lang w:val="en-US"/>
               </w:rPr>
+              <w:t>customised</w:t>
             </w:r>
             <w:proofErr w:type="spellEnd"/>
             <w:r>
@@ -4361,6 +4379,7 @@
                 <w:highlight w:val="yellow"/>
                 <w:lang w:val="en-US"/>
               </w:rPr>
+              <w:t>, and if so to what extent</w:t>
             </w:r>
           </w:p>
           <w:p>
@@ -4386,7 +4405,7 @@
                 <w:highlight w:val="yellow"/>
                 <w:lang w:val="en-US"/>
               </w:rPr>
-              <w:t>{{extra_36}}</w:t>
+              <w:t>Whether key activities, such as booking holiday, approving holiday, and running reports, can easily be carried out by a standard user without the need for training or instruction</w:t>
             </w:r>
           </w:p>
           <w:p>
@@ -4412,7 +4431,7 @@
                 <w:highlight w:val="yellow"/>
                 <w:lang w:val="en-US"/>
               </w:rPr>
-              <w:t>{{extra_37}}</w:t>
+              <w:t>If the UI has been through any usability testing – please summarize what was done and what the outcome was</w:t>
             </w:r>
           </w:p>
           <w:p>
@@ -4443,43 +4462,47 @@
                 <w:highlight w:val="yellow"/>
                 <w:lang w:val="en-US"/>
               </w:rPr>
-              <w:t>{{extra_38}}</w:t>
-            </w:r>
-            <w:r>
-              <w:rPr>
-                <w:rFonts w:asciiTheme="majorHAnsi" w:eastAsia="Calibri" w:hAnsiTheme="majorHAnsi" w:cstheme="majorHAnsi"/>
-                <w:sz w:val="18"/>
-                <w:szCs w:val="18"/>
-                <w:highlight w:val="yellow"/>
-                <w:lang w:val="en-US"/>
-              </w:rPr>
-            </w:r>
-            <w:r>
-              <w:rPr>
-                <w:rFonts w:asciiTheme="majorHAnsi" w:eastAsia="Calibri" w:hAnsiTheme="majorHAnsi" w:cstheme="majorHAnsi"/>
-                <w:sz w:val="18"/>
-                <w:szCs w:val="18"/>
-                <w:highlight w:val="yellow"/>
-                <w:lang w:val="en-US"/>
-              </w:rPr>
-            </w:r>
-            <w:r>
-              <w:rPr>
-                <w:rFonts w:asciiTheme="majorHAnsi" w:eastAsia="Calibri" w:hAnsiTheme="majorHAnsi" w:cstheme="majorHAnsi"/>
-                <w:sz w:val="18"/>
-                <w:szCs w:val="18"/>
-                <w:highlight w:val="yellow"/>
-                <w:lang w:val="en-US"/>
-              </w:rPr>
-            </w:r>
-            <w:r>
-              <w:rPr>
-                <w:rFonts w:asciiTheme="majorHAnsi" w:eastAsia="Calibri" w:hAnsiTheme="majorHAnsi" w:cstheme="majorHAnsi"/>
-                <w:sz w:val="18"/>
-                <w:szCs w:val="18"/>
-                <w:highlight w:val="yellow"/>
-                <w:lang w:val="en-US"/>
-              </w:rPr>
+              <w:t>In addition, the system should have a self-service function enabling all employees to quickly and easily access their data and undertake activities such as booking / viewing holiday, and for managers, running reports on team data and being able to quickly approve tasks such as holiday requests with easy access to relevant information (e</w:t>
+            </w:r>
+            <w:r>
+              <w:rPr>
+                <w:rFonts w:asciiTheme="majorHAnsi" w:eastAsia="Calibri" w:hAnsiTheme="majorHAnsi" w:cstheme="majorHAnsi"/>
+                <w:sz w:val="18"/>
+                <w:szCs w:val="18"/>
+                <w:highlight w:val="yellow"/>
+                <w:lang w:val="en-US"/>
+              </w:rPr>
+              <w:t>.</w:t>
+            </w:r>
+            <w:r>
+              <w:rPr>
+                <w:rFonts w:asciiTheme="majorHAnsi" w:eastAsia="Calibri" w:hAnsiTheme="majorHAnsi" w:cstheme="majorHAnsi"/>
+                <w:sz w:val="18"/>
+                <w:szCs w:val="18"/>
+                <w:highlight w:val="yellow"/>
+                <w:lang w:val="en-US"/>
+              </w:rPr>
+              <w:t>g</w:t>
+            </w:r>
+            <w:r>
+              <w:rPr>
+                <w:rFonts w:asciiTheme="majorHAnsi" w:eastAsia="Calibri" w:hAnsiTheme="majorHAnsi" w:cstheme="majorHAnsi"/>
+                <w:sz w:val="18"/>
+                <w:szCs w:val="18"/>
+                <w:highlight w:val="yellow"/>
+                <w:lang w:val="en-US"/>
+              </w:rPr>
+              <w:t>.</w:t>
+            </w:r>
+            <w:r>
+              <w:rPr>
+                <w:rFonts w:asciiTheme="majorHAnsi" w:eastAsia="Calibri" w:hAnsiTheme="majorHAnsi" w:cstheme="majorHAnsi"/>
+                <w:sz w:val="18"/>
+                <w:szCs w:val="18"/>
+                <w:highlight w:val="yellow"/>
+                <w:lang w:val="en-US"/>
+              </w:rPr>
+              <w:t xml:space="preserve"> who else in the team is off on the requested dates). Please detail your employee self-service and manager access functionality and describe how it meets our needs as above</w:t>
             </w:r>
             <w:r>
               <w:rPr>
@@ -4489,6 +4512,7 @@
                 <w:highlight w:val="yellow"/>
                 <w:lang w:val="en-US"/>
               </w:rPr>
+              <w:t xml:space="preserve">.  </w:t>
             </w:r>
           </w:p>
           <w:p>
@@ -4518,7 +4542,7 @@
                 <w:highlight w:val="yellow"/>
                 <w:lang w:val="en-US"/>
               </w:rPr>
-              <w:t>{{extra_39}}</w:t>
+              <w:t xml:space="preserve">Please also provide at least 4 screenshots for us to review what your UI looks like on the main employee self-service page, a page viewing employee information, a page showing manager’s dashboard, and a workflow page. </w:t>
             </w:r>
           </w:p>
           <w:p>
@@ -4550,16 +4574,17 @@
                 <w:highlight w:val="yellow"/>
                 <w:lang w:val="en-US"/>
               </w:rPr>
-              <w:t>{{extra_40}}</w:t>
-            </w:r>
-            <w:r>
-              <w:rPr>
-                <w:rFonts w:asciiTheme="majorHAnsi" w:eastAsia="Calibri" w:hAnsiTheme="majorHAnsi" w:cstheme="majorHAnsi"/>
-                <w:sz w:val="18"/>
-                <w:szCs w:val="18"/>
-                <w:highlight w:val="yellow"/>
-                <w:lang w:val="en-US"/>
-              </w:rPr>
+              <w:t>Reporting</w:t>
+            </w:r>
+            <w:r>
+              <w:rPr>
+                <w:rFonts w:asciiTheme="majorHAnsi" w:eastAsia="Calibri" w:hAnsiTheme="majorHAnsi" w:cstheme="majorHAnsi"/>
+                <w:sz w:val="18"/>
+                <w:szCs w:val="18"/>
+                <w:highlight w:val="yellow"/>
+                <w:lang w:val="en-US"/>
+              </w:rPr>
+              <w:t xml:space="preserve"> </w:t>
             </w:r>
           </w:p>
           <w:p>
@@ -4579,43 +4604,47 @@
                 <w:highlight w:val="yellow"/>
                 <w:lang w:val="en-US"/>
               </w:rPr>
-              <w:t>{{extra_41}}</w:t>
-            </w:r>
-            <w:r>
-              <w:rPr>
-                <w:rFonts w:asciiTheme="majorHAnsi" w:eastAsia="Calibri" w:hAnsiTheme="majorHAnsi" w:cstheme="majorHAnsi"/>
-                <w:sz w:val="18"/>
-                <w:szCs w:val="18"/>
-                <w:highlight w:val="yellow"/>
-                <w:lang w:val="en-US"/>
-              </w:rPr>
-            </w:r>
-            <w:r>
-              <w:rPr>
-                <w:rFonts w:asciiTheme="majorHAnsi" w:eastAsia="Calibri" w:hAnsiTheme="majorHAnsi" w:cstheme="majorHAnsi"/>
-                <w:sz w:val="18"/>
-                <w:szCs w:val="18"/>
-                <w:highlight w:val="yellow"/>
-                <w:lang w:val="en-US"/>
-              </w:rPr>
-            </w:r>
-            <w:r>
-              <w:rPr>
-                <w:rFonts w:asciiTheme="majorHAnsi" w:eastAsia="Calibri" w:hAnsiTheme="majorHAnsi" w:cstheme="majorHAnsi"/>
-                <w:sz w:val="18"/>
-                <w:szCs w:val="18"/>
-                <w:highlight w:val="yellow"/>
-                <w:lang w:val="en-US"/>
-              </w:rPr>
-            </w:r>
-            <w:r>
-              <w:rPr>
-                <w:rFonts w:asciiTheme="majorHAnsi" w:eastAsia="Calibri" w:hAnsiTheme="majorHAnsi" w:cstheme="majorHAnsi"/>
-                <w:sz w:val="18"/>
-                <w:szCs w:val="18"/>
-                <w:highlight w:val="yellow"/>
-                <w:lang w:val="en-US"/>
-              </w:rPr>
+              <w:t xml:space="preserve">As a HR team, we need to be able to pull data from the system easily and download to Excel as well as present as charts </w:t>
+            </w:r>
+            <w:r>
+              <w:rPr>
+                <w:rFonts w:asciiTheme="majorHAnsi" w:eastAsia="Calibri" w:hAnsiTheme="majorHAnsi" w:cstheme="majorHAnsi"/>
+                <w:sz w:val="18"/>
+                <w:szCs w:val="18"/>
+                <w:highlight w:val="yellow"/>
+                <w:lang w:val="en-US"/>
+              </w:rPr>
+              <w:t>and</w:t>
+            </w:r>
+            <w:r>
+              <w:rPr>
+                <w:rFonts w:asciiTheme="majorHAnsi" w:eastAsia="Calibri" w:hAnsiTheme="majorHAnsi" w:cstheme="majorHAnsi"/>
+                <w:sz w:val="18"/>
+                <w:szCs w:val="18"/>
+                <w:highlight w:val="yellow"/>
+                <w:lang w:val="en-US"/>
+              </w:rPr>
+              <w:t xml:space="preserve"> graphics in presentations. Please provide details on your reporting tools</w:t>
+            </w:r>
+            <w:r>
+              <w:rPr>
+                <w:rFonts w:asciiTheme="majorHAnsi" w:eastAsia="Calibri" w:hAnsiTheme="majorHAnsi" w:cstheme="majorHAnsi"/>
+                <w:sz w:val="18"/>
+                <w:szCs w:val="18"/>
+                <w:highlight w:val="yellow"/>
+                <w:lang w:val="en-US"/>
+              </w:rPr>
+              <w:t xml:space="preserve"> </w:t>
+            </w:r>
+            <w:r>
+              <w:rPr>
+                <w:rFonts w:asciiTheme="majorHAnsi" w:eastAsia="Calibri" w:hAnsiTheme="majorHAnsi" w:cstheme="majorHAnsi"/>
+                <w:sz w:val="18"/>
+                <w:szCs w:val="18"/>
+                <w:highlight w:val="yellow"/>
+                <w:lang w:val="en-US"/>
+              </w:rPr>
+              <w:t xml:space="preserve">including: </w:t>
             </w:r>
           </w:p>
           <w:p>
@@ -4635,7 +4664,7 @@
                 <w:highlight w:val="yellow"/>
                 <w:lang w:val="en-US"/>
               </w:rPr>
-              <w:t>{{extra_42}}</w:t>
+              <w:t xml:space="preserve"> </w:t>
             </w:r>
           </w:p>
           <w:p>
@@ -4661,34 +4690,37 @@
                 <w:highlight w:val="yellow"/>
                 <w:lang w:val="en-US"/>
               </w:rPr>
-              <w:t>{{extra_43}}</w:t>
-            </w:r>
-            <w:r>
-              <w:rPr>
-                <w:rFonts w:asciiTheme="majorHAnsi" w:eastAsia="Calibri" w:hAnsiTheme="majorHAnsi" w:cstheme="majorHAnsi"/>
-                <w:sz w:val="18"/>
-                <w:szCs w:val="18"/>
-                <w:highlight w:val="yellow"/>
-                <w:lang w:val="en-US"/>
-              </w:rPr>
-            </w:r>
-            <w:r>
-              <w:rPr>
-                <w:rFonts w:asciiTheme="majorHAnsi" w:eastAsia="Calibri" w:hAnsiTheme="majorHAnsi" w:cstheme="majorHAnsi"/>
-                <w:sz w:val="18"/>
-                <w:szCs w:val="18"/>
-                <w:highlight w:val="yellow"/>
-                <w:lang w:val="en-US"/>
-              </w:rPr>
-            </w:r>
-            <w:r>
-              <w:rPr>
-                <w:rFonts w:asciiTheme="majorHAnsi" w:eastAsia="Calibri" w:hAnsiTheme="majorHAnsi" w:cstheme="majorHAnsi"/>
-                <w:sz w:val="18"/>
-                <w:szCs w:val="18"/>
-                <w:highlight w:val="yellow"/>
-                <w:lang w:val="en-US"/>
-              </w:rPr>
+              <w:t>Whether there are pre-built reports on standard HR metrics (e.g. headcount, turnover, sickness absence, diversity</w:t>
+            </w:r>
+            <w:r>
+              <w:rPr>
+                <w:rFonts w:asciiTheme="majorHAnsi" w:eastAsia="Calibri" w:hAnsiTheme="majorHAnsi" w:cstheme="majorHAnsi"/>
+                <w:sz w:val="18"/>
+                <w:szCs w:val="18"/>
+                <w:highlight w:val="yellow"/>
+                <w:lang w:val="en-US"/>
+              </w:rPr>
+              <w:t>, contract end dates etc</w:t>
+            </w:r>
+            <w:r>
+              <w:rPr>
+                <w:rFonts w:asciiTheme="majorHAnsi" w:eastAsia="Calibri" w:hAnsiTheme="majorHAnsi" w:cstheme="majorHAnsi"/>
+                <w:sz w:val="18"/>
+                <w:szCs w:val="18"/>
+                <w:highlight w:val="yellow"/>
+                <w:lang w:val="en-US"/>
+              </w:rPr>
+              <w:t>.</w:t>
+            </w:r>
+            <w:r>
+              <w:rPr>
+                <w:rFonts w:asciiTheme="majorHAnsi" w:eastAsia="Calibri" w:hAnsiTheme="majorHAnsi" w:cstheme="majorHAnsi"/>
+                <w:sz w:val="18"/>
+                <w:szCs w:val="18"/>
+                <w:highlight w:val="yellow"/>
+                <w:lang w:val="en-US"/>
+              </w:rPr>
+              <w:t xml:space="preserve">) </w:t>
             </w:r>
           </w:p>
           <w:p>
@@ -4714,7 +4746,7 @@
                 <w:highlight w:val="yellow"/>
                 <w:lang w:val="en-US"/>
               </w:rPr>
-              <w:t>{{extra_44}}</w:t>
+              <w:t xml:space="preserve">If the pre-built reports can be </w:t>
             </w:r>
             <w:proofErr w:type="spellStart"/>
             <w:r>
@@ -4725,6 +4757,7 @@
                 <w:highlight w:val="yellow"/>
                 <w:lang w:val="en-US"/>
               </w:rPr>
+              <w:t>customised</w:t>
             </w:r>
             <w:proofErr w:type="spellEnd"/>
             <w:r>
@@ -4735,6 +4768,7 @@
                 <w:highlight w:val="yellow"/>
                 <w:lang w:val="en-US"/>
               </w:rPr>
+              <w:t xml:space="preserve"> </w:t>
             </w:r>
           </w:p>
           <w:p>
@@ -4760,7 +4794,7 @@
                 <w:highlight w:val="yellow"/>
                 <w:lang w:val="en-US"/>
               </w:rPr>
-              <w:t>{{extra_45}}</w:t>
+              <w:t xml:space="preserve">Whether reports can be run on calendar months as well as number of weeks </w:t>
             </w:r>
           </w:p>
           <w:p>
@@ -4786,34 +4820,37 @@
                 <w:highlight w:val="yellow"/>
                 <w:lang w:val="en-US"/>
               </w:rPr>
-              <w:t>{{extra_46}}</w:t>
-            </w:r>
-            <w:r>
-              <w:rPr>
-                <w:rFonts w:asciiTheme="majorHAnsi" w:eastAsia="Calibri" w:hAnsiTheme="majorHAnsi" w:cstheme="majorHAnsi"/>
-                <w:sz w:val="18"/>
-                <w:szCs w:val="18"/>
-                <w:highlight w:val="yellow"/>
-                <w:lang w:val="en-US"/>
-              </w:rPr>
-            </w:r>
-            <w:r>
-              <w:rPr>
-                <w:rFonts w:asciiTheme="majorHAnsi" w:eastAsia="Calibri" w:hAnsiTheme="majorHAnsi" w:cstheme="majorHAnsi"/>
-                <w:sz w:val="18"/>
-                <w:szCs w:val="18"/>
-                <w:highlight w:val="yellow"/>
-                <w:lang w:val="en-US"/>
-              </w:rPr>
-            </w:r>
-            <w:r>
-              <w:rPr>
-                <w:rFonts w:asciiTheme="majorHAnsi" w:eastAsia="Calibri" w:hAnsiTheme="majorHAnsi" w:cstheme="majorHAnsi"/>
-                <w:sz w:val="18"/>
-                <w:szCs w:val="18"/>
-                <w:highlight w:val="yellow"/>
-                <w:lang w:val="en-US"/>
-              </w:rPr>
+              <w:t>Whether</w:t>
+            </w:r>
+            <w:r>
+              <w:rPr>
+                <w:rFonts w:asciiTheme="majorHAnsi" w:eastAsia="Calibri" w:hAnsiTheme="majorHAnsi" w:cstheme="majorHAnsi"/>
+                <w:sz w:val="18"/>
+                <w:szCs w:val="18"/>
+                <w:highlight w:val="yellow"/>
+                <w:lang w:val="en-US"/>
+              </w:rPr>
+              <w:t xml:space="preserve"> new reports can be </w:t>
+            </w:r>
+            <w:r>
+              <w:rPr>
+                <w:rFonts w:asciiTheme="majorHAnsi" w:eastAsia="Calibri" w:hAnsiTheme="majorHAnsi" w:cstheme="majorHAnsi"/>
+                <w:sz w:val="18"/>
+                <w:szCs w:val="18"/>
+                <w:highlight w:val="yellow"/>
+                <w:lang w:val="en-US"/>
+              </w:rPr>
+              <w:t xml:space="preserve">easily </w:t>
+            </w:r>
+            <w:r>
+              <w:rPr>
+                <w:rFonts w:asciiTheme="majorHAnsi" w:eastAsia="Calibri" w:hAnsiTheme="majorHAnsi" w:cstheme="majorHAnsi"/>
+                <w:sz w:val="18"/>
+                <w:szCs w:val="18"/>
+                <w:highlight w:val="yellow"/>
+                <w:lang w:val="en-US"/>
+              </w:rPr>
+              <w:t xml:space="preserve">built by admin users of the system  </w:t>
             </w:r>
           </w:p>
           <w:p>
@@ -4839,16 +4876,17 @@
                 <w:highlight w:val="yellow"/>
                 <w:lang w:val="en-US"/>
               </w:rPr>
-              <w:t>{{extra_47}}</w:t>
-            </w:r>
-            <w:r>
-              <w:rPr>
-                <w:rFonts w:asciiTheme="majorHAnsi" w:eastAsia="Calibri" w:hAnsiTheme="majorHAnsi" w:cstheme="majorHAnsi"/>
-                <w:sz w:val="18"/>
-                <w:szCs w:val="18"/>
-                <w:highlight w:val="yellow"/>
-                <w:lang w:val="en-US"/>
-              </w:rPr>
+              <w:t>If</w:t>
+            </w:r>
+            <w:r>
+              <w:rPr>
+                <w:rFonts w:asciiTheme="majorHAnsi" w:eastAsia="Calibri" w:hAnsiTheme="majorHAnsi" w:cstheme="majorHAnsi"/>
+                <w:sz w:val="18"/>
+                <w:szCs w:val="18"/>
+                <w:highlight w:val="yellow"/>
+                <w:lang w:val="en-US"/>
+              </w:rPr>
+              <w:t xml:space="preserve"> </w:t>
             </w:r>
             <w:proofErr w:type="spellStart"/>
             <w:r>
@@ -4859,6 +4897,7 @@
                 <w:highlight w:val="yellow"/>
                 <w:lang w:val="en-US"/>
               </w:rPr>
+              <w:t>customised</w:t>
             </w:r>
             <w:proofErr w:type="spellEnd"/>
             <w:r>
@@ -4869,33 +4908,37 @@
                 <w:highlight w:val="yellow"/>
                 <w:lang w:val="en-US"/>
               </w:rPr>
-            </w:r>
-            <w:r>
-              <w:rPr>
-                <w:rFonts w:asciiTheme="majorHAnsi" w:eastAsia="Calibri" w:hAnsiTheme="majorHAnsi" w:cstheme="majorHAnsi"/>
-                <w:sz w:val="18"/>
-                <w:szCs w:val="18"/>
-                <w:highlight w:val="yellow"/>
-                <w:lang w:val="en-US"/>
-              </w:rPr>
-            </w:r>
-            <w:r>
-              <w:rPr>
-                <w:rFonts w:asciiTheme="majorHAnsi" w:eastAsia="Calibri" w:hAnsiTheme="majorHAnsi" w:cstheme="majorHAnsi"/>
-                <w:sz w:val="18"/>
-                <w:szCs w:val="18"/>
-                <w:highlight w:val="yellow"/>
-                <w:lang w:val="en-US"/>
-              </w:rPr>
-            </w:r>
-            <w:r>
-              <w:rPr>
-                <w:rFonts w:asciiTheme="majorHAnsi" w:eastAsia="Calibri" w:hAnsiTheme="majorHAnsi" w:cstheme="majorHAnsi"/>
-                <w:sz w:val="18"/>
-                <w:szCs w:val="18"/>
-                <w:highlight w:val="yellow"/>
-                <w:lang w:val="en-US"/>
-              </w:rPr>
+              <w:t xml:space="preserve"> reporting </w:t>
+            </w:r>
+            <w:r>
+              <w:rPr>
+                <w:rFonts w:asciiTheme="majorHAnsi" w:eastAsia="Calibri" w:hAnsiTheme="majorHAnsi" w:cstheme="majorHAnsi"/>
+                <w:sz w:val="18"/>
+                <w:szCs w:val="18"/>
+                <w:highlight w:val="yellow"/>
+                <w:lang w:val="en-US"/>
+              </w:rPr>
+              <w:t xml:space="preserve">is </w:t>
+            </w:r>
+            <w:r>
+              <w:rPr>
+                <w:rFonts w:asciiTheme="majorHAnsi" w:eastAsia="Calibri" w:hAnsiTheme="majorHAnsi" w:cstheme="majorHAnsi"/>
+                <w:sz w:val="18"/>
+                <w:szCs w:val="18"/>
+                <w:highlight w:val="yellow"/>
+                <w:lang w:val="en-US"/>
+              </w:rPr>
+              <w:t>available on all fields in the employee database and can these be accessed easily without requiring additional set up</w:t>
+            </w:r>
+            <w:r>
+              <w:rPr>
+                <w:rFonts w:asciiTheme="majorHAnsi" w:eastAsia="Calibri" w:hAnsiTheme="majorHAnsi" w:cstheme="majorHAnsi"/>
+                <w:sz w:val="18"/>
+                <w:szCs w:val="18"/>
+                <w:highlight w:val="yellow"/>
+                <w:lang w:val="en-US"/>
+              </w:rPr>
+              <w:t xml:space="preserve">  </w:t>
             </w:r>
           </w:p>
           <w:p>
@@ -4921,25 +4964,27 @@
                 <w:highlight w:val="yellow"/>
                 <w:lang w:val="en-US"/>
               </w:rPr>
-              <w:t>{{extra_48}}</w:t>
-            </w:r>
-            <w:r>
-              <w:rPr>
-                <w:rFonts w:asciiTheme="majorHAnsi" w:eastAsia="Calibri" w:hAnsiTheme="majorHAnsi" w:cstheme="majorHAnsi"/>
-                <w:sz w:val="18"/>
-                <w:szCs w:val="18"/>
-                <w:highlight w:val="yellow"/>
-                <w:lang w:val="en-US"/>
-              </w:rPr>
-            </w:r>
-            <w:r>
-              <w:rPr>
-                <w:rFonts w:asciiTheme="majorHAnsi" w:eastAsia="Calibri" w:hAnsiTheme="majorHAnsi" w:cstheme="majorHAnsi"/>
-                <w:sz w:val="18"/>
-                <w:szCs w:val="18"/>
-                <w:highlight w:val="yellow"/>
-                <w:lang w:val="en-US"/>
-              </w:rPr>
+              <w:t>What options you offer for data download</w:t>
+            </w:r>
+            <w:r>
+              <w:rPr>
+                <w:rFonts w:asciiTheme="majorHAnsi" w:eastAsia="Calibri" w:hAnsiTheme="majorHAnsi" w:cstheme="majorHAnsi"/>
+                <w:sz w:val="18"/>
+                <w:szCs w:val="18"/>
+                <w:highlight w:val="yellow"/>
+                <w:lang w:val="en-US"/>
+              </w:rPr>
+              <w:t>, export</w:t>
+            </w:r>
+            <w:r>
+              <w:rPr>
+                <w:rFonts w:asciiTheme="majorHAnsi" w:eastAsia="Calibri" w:hAnsiTheme="majorHAnsi" w:cstheme="majorHAnsi"/>
+                <w:sz w:val="18"/>
+                <w:szCs w:val="18"/>
+                <w:highlight w:val="yellow"/>
+                <w:lang w:val="en-US"/>
+              </w:rPr>
+              <w:t xml:space="preserve"> and presentation  </w:t>
             </w:r>
           </w:p>
           <w:p>
@@ -4965,66 +5010,69 @@
                 <w:highlight w:val="yellow"/>
                 <w:lang w:val="en-US"/>
               </w:rPr>
-              <w:t>{{extra_49}}</w:t>
-            </w:r>
-            <w:r>
-              <w:rPr>
-                <w:rFonts w:asciiTheme="majorHAnsi" w:eastAsia="Calibri" w:hAnsiTheme="majorHAnsi" w:cstheme="majorHAnsi"/>
-                <w:sz w:val="18"/>
-                <w:szCs w:val="18"/>
-                <w:highlight w:val="yellow"/>
-                <w:lang w:val="en-US"/>
-              </w:rPr>
-            </w:r>
-            <w:r>
-              <w:rPr>
-                <w:rFonts w:asciiTheme="majorHAnsi" w:eastAsia="Calibri" w:hAnsiTheme="majorHAnsi" w:cstheme="majorHAnsi"/>
-                <w:sz w:val="18"/>
-                <w:szCs w:val="18"/>
-                <w:highlight w:val="yellow"/>
-                <w:lang w:val="en-US"/>
-              </w:rPr>
-            </w:r>
-            <w:r>
-              <w:rPr>
-                <w:rFonts w:asciiTheme="majorHAnsi" w:eastAsia="Calibri" w:hAnsiTheme="majorHAnsi" w:cstheme="majorHAnsi"/>
-                <w:sz w:val="18"/>
-                <w:szCs w:val="18"/>
-                <w:highlight w:val="yellow"/>
-                <w:lang w:val="en-US"/>
-              </w:rPr>
-            </w:r>
-          </w:p>
-          <w:p>
-            <w:pPr>
-              <w:rPr>
-                <w:rFonts w:asciiTheme="majorHAnsi" w:eastAsia="Calibri" w:hAnsiTheme="majorHAnsi" w:cstheme="majorHAnsi"/>
-                <w:sz w:val="18"/>
-                <w:szCs w:val="18"/>
-                <w:highlight w:val="yellow"/>
-                <w:lang w:val="en-US"/>
-              </w:rPr>
-            </w:pPr>
-          </w:p>
-          <w:p>
-            <w:pPr>
-              <w:rPr>
-                <w:rFonts w:asciiTheme="majorHAnsi" w:eastAsia="Calibri" w:hAnsiTheme="majorHAnsi" w:cstheme="majorHAnsi"/>
-                <w:sz w:val="18"/>
-                <w:szCs w:val="18"/>
-                <w:highlight w:val="yellow"/>
-                <w:lang w:val="en-US"/>
-              </w:rPr>
-            </w:pPr>
-            <w:r>
-              <w:rPr>
-                <w:rFonts w:asciiTheme="majorHAnsi" w:eastAsia="Calibri" w:hAnsiTheme="majorHAnsi" w:cstheme="majorHAnsi"/>
-                <w:sz w:val="18"/>
-                <w:szCs w:val="18"/>
-                <w:highlight w:val="yellow"/>
-                <w:lang w:val="en-US"/>
-              </w:rPr>
-              <w:t>{{extra_50}}</w:t>
+              <w:t>If</w:t>
+            </w:r>
+            <w:r>
+              <w:rPr>
+                <w:rFonts w:asciiTheme="majorHAnsi" w:eastAsia="Calibri" w:hAnsiTheme="majorHAnsi" w:cstheme="majorHAnsi"/>
+                <w:sz w:val="18"/>
+                <w:szCs w:val="18"/>
+                <w:highlight w:val="yellow"/>
+                <w:lang w:val="en-US"/>
+              </w:rPr>
+              <w:t xml:space="preserve"> reports</w:t>
+            </w:r>
+            <w:r>
+              <w:rPr>
+                <w:rFonts w:asciiTheme="majorHAnsi" w:eastAsia="Calibri" w:hAnsiTheme="majorHAnsi" w:cstheme="majorHAnsi"/>
+                <w:sz w:val="18"/>
+                <w:szCs w:val="18"/>
+                <w:highlight w:val="yellow"/>
+                <w:lang w:val="en-US"/>
+              </w:rPr>
+              <w:t xml:space="preserve"> can</w:t>
+            </w:r>
+            <w:r>
+              <w:rPr>
+                <w:rFonts w:asciiTheme="majorHAnsi" w:eastAsia="Calibri" w:hAnsiTheme="majorHAnsi" w:cstheme="majorHAnsi"/>
+                <w:sz w:val="18"/>
+                <w:szCs w:val="18"/>
+                <w:highlight w:val="yellow"/>
+                <w:lang w:val="en-US"/>
+              </w:rPr>
+              <w:t xml:space="preserve"> be emailed to specific users on an automated basis</w:t>
+            </w:r>
+          </w:p>
+          <w:p>
+            <w:pPr>
+              <w:rPr>
+                <w:rFonts w:asciiTheme="majorHAnsi" w:eastAsia="Calibri" w:hAnsiTheme="majorHAnsi" w:cstheme="majorHAnsi"/>
+                <w:sz w:val="18"/>
+                <w:szCs w:val="18"/>
+                <w:highlight w:val="yellow"/>
+                <w:lang w:val="en-US"/>
+              </w:rPr>
+            </w:pPr>
+          </w:p>
+          <w:p>
+            <w:pPr>
+              <w:rPr>
+                <w:rFonts w:asciiTheme="majorHAnsi" w:eastAsia="Calibri" w:hAnsiTheme="majorHAnsi" w:cstheme="majorHAnsi"/>
+                <w:sz w:val="18"/>
+                <w:szCs w:val="18"/>
+                <w:highlight w:val="yellow"/>
+                <w:lang w:val="en-US"/>
+              </w:rPr>
+            </w:pPr>
+            <w:r>
+              <w:rPr>
+                <w:rFonts w:asciiTheme="majorHAnsi" w:eastAsia="Calibri" w:hAnsiTheme="majorHAnsi" w:cstheme="majorHAnsi"/>
+                <w:sz w:val="18"/>
+                <w:szCs w:val="18"/>
+                <w:highlight w:val="yellow"/>
+                <w:lang w:val="en-US"/>
+              </w:rPr>
+              <w:t>In addition, we need to be able to report on data including:</w:t>
             </w:r>
           </w:p>
           <w:p>
@@ -5061,7 +5109,7 @@
                 <w:highlight w:val="yellow"/>
                 <w:lang w:val="en-US"/>
               </w:rPr>
-              <w:t>{{extra_51}}</w:t>
+              <w:t>Working patterns (for example 9 day fortnights, 4.5 day weeks, as well as P/T on different days)</w:t>
             </w:r>
           </w:p>
           <w:p>
@@ -5087,16 +5135,17 @@
                 <w:highlight w:val="yellow"/>
                 <w:lang w:val="en-US"/>
               </w:rPr>
-              <w:t>{{extra_52}}</w:t>
-            </w:r>
-            <w:r>
-              <w:rPr>
-                <w:rFonts w:asciiTheme="majorHAnsi" w:eastAsia="Calibri" w:hAnsiTheme="majorHAnsi" w:cstheme="majorHAnsi"/>
-                <w:sz w:val="18"/>
-                <w:szCs w:val="18"/>
-                <w:highlight w:val="yellow"/>
-                <w:lang w:val="en-US"/>
-              </w:rPr>
+              <w:t>Job families and clusters</w:t>
+            </w:r>
+            <w:r>
+              <w:rPr>
+                <w:rFonts w:asciiTheme="majorHAnsi" w:eastAsia="Calibri" w:hAnsiTheme="majorHAnsi" w:cstheme="majorHAnsi"/>
+                <w:sz w:val="18"/>
+                <w:szCs w:val="18"/>
+                <w:highlight w:val="yellow"/>
+                <w:lang w:val="en-US"/>
+              </w:rPr>
+              <w:t xml:space="preserve"> (</w:t>
             </w:r>
             <w:proofErr w:type="spellStart"/>
             <w:r>
@@ -5107,6 +5156,7 @@
                 <w:highlight w:val="yellow"/>
                 <w:lang w:val="en-US"/>
               </w:rPr>
+              <w:t>customised</w:t>
             </w:r>
             <w:proofErr w:type="spellEnd"/>
             <w:r>
@@ -5117,6 +5167,7 @@
                 <w:highlight w:val="yellow"/>
                 <w:lang w:val="en-US"/>
               </w:rPr>
+              <w:t xml:space="preserve"> to our career framework)</w:t>
             </w:r>
           </w:p>
           <w:p>
@@ -5142,70 +5193,77 @@
                 <w:highlight w:val="yellow"/>
                 <w:lang w:val="en-US"/>
               </w:rPr>
-              <w:t>{{extra_53}}</w:t>
-            </w:r>
-            <w:r>
-              <w:rPr>
-                <w:rFonts w:asciiTheme="majorHAnsi" w:eastAsia="Calibri" w:hAnsiTheme="majorHAnsi" w:cstheme="majorHAnsi"/>
-                <w:sz w:val="18"/>
-                <w:szCs w:val="18"/>
-                <w:highlight w:val="yellow"/>
-                <w:lang w:val="en-US"/>
-              </w:rPr>
-            </w:r>
-            <w:r>
-              <w:rPr>
-                <w:rFonts w:asciiTheme="majorHAnsi" w:eastAsia="Calibri" w:hAnsiTheme="majorHAnsi" w:cstheme="majorHAnsi"/>
-                <w:sz w:val="18"/>
-                <w:szCs w:val="18"/>
-                <w:highlight w:val="yellow"/>
-                <w:lang w:val="en-US"/>
-              </w:rPr>
-            </w:r>
-            <w:r>
-              <w:rPr>
-                <w:rFonts w:asciiTheme="majorHAnsi" w:eastAsia="Calibri" w:hAnsiTheme="majorHAnsi" w:cstheme="majorHAnsi"/>
-                <w:sz w:val="18"/>
-                <w:szCs w:val="18"/>
-                <w:highlight w:val="yellow"/>
-                <w:lang w:val="en-US"/>
-              </w:rPr>
-            </w:r>
-            <w:r>
-              <w:rPr>
-                <w:rFonts w:asciiTheme="majorHAnsi" w:eastAsia="Calibri" w:hAnsiTheme="majorHAnsi" w:cstheme="majorHAnsi"/>
-                <w:sz w:val="18"/>
-                <w:szCs w:val="18"/>
-                <w:highlight w:val="yellow"/>
-                <w:lang w:val="en-US"/>
-              </w:rPr>
-            </w:r>
-            <w:r>
-              <w:rPr>
-                <w:rFonts w:asciiTheme="majorHAnsi" w:eastAsia="Calibri" w:hAnsiTheme="majorHAnsi" w:cstheme="majorHAnsi"/>
-                <w:sz w:val="18"/>
-                <w:szCs w:val="18"/>
-                <w:highlight w:val="yellow"/>
-                <w:lang w:val="en-US"/>
-              </w:rPr>
-            </w:r>
-            <w:r>
-              <w:rPr>
-                <w:rFonts w:asciiTheme="majorHAnsi" w:eastAsia="Calibri" w:hAnsiTheme="majorHAnsi" w:cstheme="majorHAnsi"/>
-                <w:sz w:val="18"/>
-                <w:szCs w:val="18"/>
-                <w:highlight w:val="yellow"/>
-                <w:lang w:val="en-US"/>
-              </w:rPr>
-            </w:r>
-            <w:r>
-              <w:rPr>
-                <w:rFonts w:asciiTheme="majorHAnsi" w:eastAsia="Calibri" w:hAnsiTheme="majorHAnsi" w:cstheme="majorHAnsi"/>
-                <w:sz w:val="18"/>
-                <w:szCs w:val="18"/>
-                <w:highlight w:val="yellow"/>
-                <w:lang w:val="en-US"/>
-              </w:rPr>
+              <w:t>Job categories (i</w:t>
+            </w:r>
+            <w:r>
+              <w:rPr>
+                <w:rFonts w:asciiTheme="majorHAnsi" w:eastAsia="Calibri" w:hAnsiTheme="majorHAnsi" w:cstheme="majorHAnsi"/>
+                <w:sz w:val="18"/>
+                <w:szCs w:val="18"/>
+                <w:highlight w:val="yellow"/>
+                <w:lang w:val="en-US"/>
+              </w:rPr>
+              <w:t>.</w:t>
+            </w:r>
+            <w:r>
+              <w:rPr>
+                <w:rFonts w:asciiTheme="majorHAnsi" w:eastAsia="Calibri" w:hAnsiTheme="majorHAnsi" w:cstheme="majorHAnsi"/>
+                <w:sz w:val="18"/>
+                <w:szCs w:val="18"/>
+                <w:highlight w:val="yellow"/>
+                <w:lang w:val="en-US"/>
+              </w:rPr>
+              <w:t>e</w:t>
+            </w:r>
+            <w:r>
+              <w:rPr>
+                <w:rFonts w:asciiTheme="majorHAnsi" w:eastAsia="Calibri" w:hAnsiTheme="majorHAnsi" w:cstheme="majorHAnsi"/>
+                <w:sz w:val="18"/>
+                <w:szCs w:val="18"/>
+                <w:highlight w:val="yellow"/>
+                <w:lang w:val="en-US"/>
+              </w:rPr>
+              <w:t>.</w:t>
+            </w:r>
+            <w:r>
+              <w:rPr>
+                <w:rFonts w:asciiTheme="majorHAnsi" w:eastAsia="Calibri" w:hAnsiTheme="majorHAnsi" w:cstheme="majorHAnsi"/>
+                <w:sz w:val="18"/>
+                <w:szCs w:val="18"/>
+                <w:highlight w:val="yellow"/>
+                <w:lang w:val="en-US"/>
+              </w:rPr>
+              <w:t xml:space="preserve"> technical / professional</w:t>
+            </w:r>
+            <w:r>
+              <w:rPr>
+                <w:rFonts w:asciiTheme="majorHAnsi" w:eastAsia="Calibri" w:hAnsiTheme="majorHAnsi" w:cstheme="majorHAnsi"/>
+                <w:sz w:val="18"/>
+                <w:szCs w:val="18"/>
+                <w:highlight w:val="yellow"/>
+                <w:lang w:val="en-US"/>
+              </w:rPr>
+              <w:t xml:space="preserve"> / support</w:t>
+            </w:r>
+            <w:r>
+              <w:rPr>
+                <w:rFonts w:asciiTheme="majorHAnsi" w:eastAsia="Calibri" w:hAnsiTheme="majorHAnsi" w:cstheme="majorHAnsi"/>
+                <w:sz w:val="18"/>
+                <w:szCs w:val="18"/>
+                <w:highlight w:val="yellow"/>
+                <w:lang w:val="en-US"/>
+              </w:rPr>
+              <w:t>)</w:t>
+            </w:r>
+            <w:r>
+              <w:rPr>
+                <w:rFonts w:asciiTheme="majorHAnsi" w:eastAsia="Calibri" w:hAnsiTheme="majorHAnsi" w:cstheme="majorHAnsi"/>
+                <w:sz w:val="18"/>
+                <w:szCs w:val="18"/>
+                <w:highlight w:val="yellow"/>
+                <w:lang w:val="en-US"/>
+              </w:rPr>
+              <w:t xml:space="preserve"> </w:t>
             </w:r>
           </w:p>
           <w:p>
@@ -5231,39 +5289,40 @@
                 <w:highlight w:val="yellow"/>
                 <w:lang w:val="en-US"/>
               </w:rPr>
-              <w:t>{{extra_54}}</w:t>
-            </w:r>
-          </w:p>
-          <w:p>
-            <w:pPr>
-              <w:rPr>
-                <w:rFonts w:asciiTheme="majorHAnsi" w:eastAsia="Calibri" w:hAnsiTheme="majorHAnsi" w:cstheme="majorHAnsi"/>
-                <w:sz w:val="18"/>
-                <w:szCs w:val="18"/>
-                <w:highlight w:val="yellow"/>
-                <w:lang w:val="en-US"/>
-              </w:rPr>
-            </w:pPr>
-          </w:p>
-          <w:p>
-            <w:pPr>
-              <w:rPr>
-                <w:rFonts w:asciiTheme="majorHAnsi" w:eastAsia="Calibri" w:hAnsiTheme="majorHAnsi" w:cstheme="majorHAnsi"/>
-                <w:sz w:val="18"/>
-                <w:szCs w:val="18"/>
-                <w:highlight w:val="yellow"/>
-                <w:lang w:val="en-US"/>
-              </w:rPr>
-            </w:pPr>
-            <w:r>
-              <w:rPr>
-                <w:rFonts w:asciiTheme="majorHAnsi" w:eastAsia="Calibri" w:hAnsiTheme="majorHAnsi" w:cstheme="majorHAnsi"/>
-                <w:sz w:val="18"/>
-                <w:szCs w:val="18"/>
-                <w:highlight w:val="yellow"/>
-                <w:lang w:val="en-US"/>
-              </w:rPr>
-              <w:t>{{extra_55}}</w:t>
+              <w:t>Training records</w:t>
+            </w:r>
+          </w:p>
+          <w:p>
+            <w:pPr>
+              <w:rPr>
+                <w:rFonts w:asciiTheme="majorHAnsi" w:eastAsia="Calibri" w:hAnsiTheme="majorHAnsi" w:cstheme="majorHAnsi"/>
+                <w:sz w:val="18"/>
+                <w:szCs w:val="18"/>
+                <w:highlight w:val="yellow"/>
+                <w:lang w:val="en-US"/>
+              </w:rPr>
+            </w:pPr>
+          </w:p>
+          <w:p>
+            <w:pPr>
+              <w:rPr>
+                <w:rFonts w:asciiTheme="majorHAnsi" w:eastAsia="Calibri" w:hAnsiTheme="majorHAnsi" w:cstheme="majorHAnsi"/>
+                <w:sz w:val="18"/>
+                <w:szCs w:val="18"/>
+                <w:highlight w:val="yellow"/>
+                <w:lang w:val="en-US"/>
+              </w:rPr>
+            </w:pPr>
+            <w:r>
+              <w:rPr>
+                <w:rFonts w:asciiTheme="majorHAnsi" w:eastAsia="Calibri" w:hAnsiTheme="majorHAnsi" w:cstheme="majorHAnsi"/>
+                <w:sz w:val="18"/>
+                <w:szCs w:val="18"/>
+                <w:highlight w:val="yellow"/>
+                <w:lang w:val="en-US"/>
+              </w:rPr>
+              <w:lastRenderedPageBreak/>
+              <w:t xml:space="preserve">Please detail whether these are standard fields in the system or if we can add them as custom fields and report on them?  If there are any limitations around adding custom fields, please provide further details.  </w:t>
             </w:r>
           </w:p>
           <w:p>
@@ -5283,7 +5342,7 @@
                 <w:highlight w:val="yellow"/>
                 <w:lang w:val="en-US"/>
               </w:rPr>
-              <w:t>{{extra_56}}</w:t>
+              <w:t xml:space="preserve"> </w:t>
             </w:r>
           </w:p>
           <w:p>
@@ -5303,46 +5362,48 @@
                 <w:highlight w:val="yellow"/>
                 <w:lang w:val="en-US"/>
               </w:rPr>
-              <w:t>{{extra_57}}</w:t>
-            </w:r>
-            <w:r>
-              <w:rPr>
-                <w:rFonts w:asciiTheme="majorHAnsi" w:eastAsia="Calibri" w:hAnsiTheme="majorHAnsi" w:cstheme="majorHAnsi"/>
-                <w:sz w:val="18"/>
-                <w:szCs w:val="18"/>
-                <w:highlight w:val="yellow"/>
-                <w:lang w:val="en-US"/>
-              </w:rPr>
-            </w:r>
-            <w:r>
-              <w:rPr>
-                <w:rFonts w:asciiTheme="majorHAnsi" w:eastAsia="Calibri" w:hAnsiTheme="majorHAnsi" w:cstheme="majorHAnsi"/>
-                <w:sz w:val="18"/>
-                <w:szCs w:val="18"/>
-                <w:highlight w:val="yellow"/>
-                <w:lang w:val="en-US"/>
-              </w:rPr>
-            </w:r>
-          </w:p>
-          <w:p>
-            <w:pPr>
-              <w:rPr>
-                <w:rFonts w:asciiTheme="majorHAnsi" w:eastAsia="Calibri" w:hAnsiTheme="majorHAnsi" w:cstheme="majorHAnsi"/>
-                <w:sz w:val="18"/>
-                <w:szCs w:val="18"/>
-                <w:highlight w:val="yellow"/>
-                <w:lang w:val="en-US"/>
-              </w:rPr>
-            </w:pPr>
-            <w:r>
-              <w:rPr>
-                <w:rFonts w:asciiTheme="majorHAnsi" w:eastAsia="Calibri" w:hAnsiTheme="majorHAnsi" w:cstheme="majorHAnsi"/>
-                <w:sz w:val="18"/>
-                <w:szCs w:val="18"/>
-                <w:highlight w:val="yellow"/>
-                <w:lang w:val="en-US"/>
-              </w:rPr>
-              <w:t>{{extra_58}}</w:t>
+              <w:t xml:space="preserve">Please also detail how we do bulk uploads to your system, if there are any limitations, and whether this can be done </w:t>
+            </w:r>
+            <w:r>
+              <w:rPr>
+                <w:rFonts w:asciiTheme="majorHAnsi" w:eastAsia="Calibri" w:hAnsiTheme="majorHAnsi" w:cstheme="majorHAnsi"/>
+                <w:sz w:val="18"/>
+                <w:szCs w:val="18"/>
+                <w:highlight w:val="yellow"/>
+                <w:lang w:val="en-US"/>
+              </w:rPr>
+              <w:t xml:space="preserve">directly </w:t>
+            </w:r>
+            <w:r>
+              <w:rPr>
+                <w:rFonts w:asciiTheme="majorHAnsi" w:eastAsia="Calibri" w:hAnsiTheme="majorHAnsi" w:cstheme="majorHAnsi"/>
+                <w:sz w:val="18"/>
+                <w:szCs w:val="18"/>
+                <w:highlight w:val="yellow"/>
+                <w:lang w:val="en-US"/>
+              </w:rPr>
+              <w:t xml:space="preserve">by our admin users. </w:t>
+            </w:r>
+          </w:p>
+          <w:p>
+            <w:pPr>
+              <w:rPr>
+                <w:rFonts w:asciiTheme="majorHAnsi" w:eastAsia="Calibri" w:hAnsiTheme="majorHAnsi" w:cstheme="majorHAnsi"/>
+                <w:sz w:val="18"/>
+                <w:szCs w:val="18"/>
+                <w:highlight w:val="yellow"/>
+                <w:lang w:val="en-US"/>
+              </w:rPr>
+            </w:pPr>
+            <w:r>
+              <w:rPr>
+                <w:rFonts w:asciiTheme="majorHAnsi" w:eastAsia="Calibri" w:hAnsiTheme="majorHAnsi" w:cstheme="majorHAnsi"/>
+                <w:sz w:val="18"/>
+                <w:szCs w:val="18"/>
+                <w:highlight w:val="yellow"/>
+                <w:lang w:val="en-US"/>
+              </w:rPr>
+              <w:t xml:space="preserve"> </w:t>
             </w:r>
           </w:p>
           <w:p>
@@ -5364,73 +5425,78 @@
                 <w:highlight w:val="yellow"/>
                 <w:lang w:val="en-US"/>
               </w:rPr>
-              <w:t>{{extra_59}}</w:t>
-            </w:r>
-          </w:p>
-          <w:p>
-            <w:pPr>
-              <w:rPr>
-                <w:rFonts w:asciiTheme="majorHAnsi" w:eastAsia="Calibri" w:hAnsiTheme="majorHAnsi" w:cstheme="majorHAnsi"/>
-                <w:sz w:val="18"/>
-                <w:szCs w:val="18"/>
-                <w:highlight w:val="yellow"/>
-                <w:lang w:val="en-US"/>
-              </w:rPr>
-            </w:pPr>
-            <w:r>
-              <w:rPr>
-                <w:rFonts w:asciiTheme="majorHAnsi" w:eastAsia="Calibri" w:hAnsiTheme="majorHAnsi" w:cstheme="majorHAnsi"/>
-                <w:sz w:val="18"/>
-                <w:szCs w:val="18"/>
-                <w:highlight w:val="yellow"/>
-                <w:lang w:val="en-US"/>
-              </w:rPr>
-              <w:t>{{extra_60}}</w:t>
-            </w:r>
-            <w:r>
-              <w:rPr>
-                <w:rFonts w:asciiTheme="majorHAnsi" w:eastAsia="Calibri" w:hAnsiTheme="majorHAnsi" w:cstheme="majorHAnsi"/>
-                <w:sz w:val="18"/>
-                <w:szCs w:val="18"/>
-                <w:highlight w:val="yellow"/>
-                <w:lang w:val="en-US"/>
-              </w:rPr>
-            </w:r>
-            <w:r>
-              <w:rPr>
-                <w:rFonts w:asciiTheme="majorHAnsi" w:eastAsia="Calibri" w:hAnsiTheme="majorHAnsi" w:cstheme="majorHAnsi"/>
-                <w:sz w:val="18"/>
-                <w:szCs w:val="18"/>
-                <w:highlight w:val="yellow"/>
-                <w:lang w:val="en-US"/>
-              </w:rPr>
-            </w:r>
-            <w:r>
-              <w:rPr>
-                <w:rFonts w:asciiTheme="majorHAnsi" w:eastAsia="Calibri" w:hAnsiTheme="majorHAnsi" w:cstheme="majorHAnsi"/>
-                <w:sz w:val="18"/>
-                <w:szCs w:val="18"/>
-                <w:highlight w:val="yellow"/>
-                <w:lang w:val="en-US"/>
-              </w:rPr>
-            </w:r>
-            <w:r>
-              <w:rPr>
-                <w:rFonts w:asciiTheme="majorHAnsi" w:eastAsia="Calibri" w:hAnsiTheme="majorHAnsi" w:cstheme="majorHAnsi"/>
-                <w:sz w:val="18"/>
-                <w:szCs w:val="18"/>
-                <w:highlight w:val="yellow"/>
-                <w:lang w:val="en-US"/>
-              </w:rPr>
-            </w:r>
-            <w:r>
-              <w:rPr>
-                <w:rFonts w:asciiTheme="majorHAnsi" w:eastAsia="Calibri" w:hAnsiTheme="majorHAnsi" w:cstheme="majorHAnsi"/>
-                <w:sz w:val="18"/>
-                <w:szCs w:val="18"/>
-                <w:highlight w:val="yellow"/>
-                <w:lang w:val="en-US"/>
-              </w:rPr>
+              <w:t>Performance Management</w:t>
+            </w:r>
+          </w:p>
+          <w:p>
+            <w:pPr>
+              <w:rPr>
+                <w:rFonts w:asciiTheme="majorHAnsi" w:eastAsia="Calibri" w:hAnsiTheme="majorHAnsi" w:cstheme="majorHAnsi"/>
+                <w:sz w:val="18"/>
+                <w:szCs w:val="18"/>
+                <w:highlight w:val="yellow"/>
+                <w:lang w:val="en-US"/>
+              </w:rPr>
+            </w:pPr>
+            <w:r>
+              <w:rPr>
+                <w:rFonts w:asciiTheme="majorHAnsi" w:eastAsia="Calibri" w:hAnsiTheme="majorHAnsi" w:cstheme="majorHAnsi"/>
+                <w:sz w:val="18"/>
+                <w:szCs w:val="18"/>
+                <w:highlight w:val="yellow"/>
+                <w:lang w:val="en-US"/>
+              </w:rPr>
+              <w:t xml:space="preserve">We </w:t>
+            </w:r>
+            <w:r>
+              <w:rPr>
+                <w:rFonts w:asciiTheme="majorHAnsi" w:eastAsia="Calibri" w:hAnsiTheme="majorHAnsi" w:cstheme="majorHAnsi"/>
+                <w:sz w:val="18"/>
+                <w:szCs w:val="18"/>
+                <w:highlight w:val="yellow"/>
+                <w:lang w:val="en-US"/>
+              </w:rPr>
+              <w:t xml:space="preserve">currently </w:t>
+            </w:r>
+            <w:r>
+              <w:rPr>
+                <w:rFonts w:asciiTheme="majorHAnsi" w:eastAsia="Calibri" w:hAnsiTheme="majorHAnsi" w:cstheme="majorHAnsi"/>
+                <w:sz w:val="18"/>
+                <w:szCs w:val="18"/>
+                <w:highlight w:val="yellow"/>
+                <w:lang w:val="en-US"/>
+              </w:rPr>
+              <w:t>use our HR system for performance management activities, including</w:t>
+            </w:r>
+            <w:r>
+              <w:rPr>
+                <w:rFonts w:asciiTheme="majorHAnsi" w:eastAsia="Calibri" w:hAnsiTheme="majorHAnsi" w:cstheme="majorHAnsi"/>
+                <w:sz w:val="18"/>
+                <w:szCs w:val="18"/>
+                <w:highlight w:val="yellow"/>
+                <w:lang w:val="en-US"/>
+              </w:rPr>
+              <w:t xml:space="preserve"> recording and monitoring probation objectives as well as managing our </w:t>
+            </w:r>
+            <w:r>
+              <w:rPr>
+                <w:rFonts w:asciiTheme="majorHAnsi" w:eastAsia="Calibri" w:hAnsiTheme="majorHAnsi" w:cstheme="majorHAnsi"/>
+                <w:sz w:val="18"/>
+                <w:szCs w:val="18"/>
+                <w:highlight w:val="yellow"/>
+                <w:lang w:val="en-US"/>
+              </w:rPr>
+              <w:t>bi-annual appraisals</w:t>
+            </w:r>
+            <w:r>
+              <w:rPr>
+                <w:rFonts w:asciiTheme="majorHAnsi" w:eastAsia="Calibri" w:hAnsiTheme="majorHAnsi" w:cstheme="majorHAnsi"/>
+                <w:sz w:val="18"/>
+                <w:szCs w:val="18"/>
+                <w:highlight w:val="yellow"/>
+                <w:lang w:val="en-US"/>
+              </w:rPr>
+              <w:t xml:space="preserve">. Going forwards we’d like to make better use of performance management functionality on our HRIS. </w:t>
             </w:r>
           </w:p>
           <w:p>
@@ -5461,52 +5527,57 @@
                 <w:highlight w:val="yellow"/>
                 <w:lang w:val="en-US"/>
               </w:rPr>
-              <w:t>{{extra_61}}</w:t>
-            </w:r>
-            <w:r>
-              <w:rPr>
-                <w:rFonts w:asciiTheme="majorHAnsi" w:eastAsia="Calibri" w:hAnsiTheme="majorHAnsi" w:cstheme="majorHAnsi"/>
-                <w:sz w:val="18"/>
-                <w:szCs w:val="18"/>
-                <w:highlight w:val="yellow"/>
-                <w:lang w:val="en-US"/>
-              </w:rPr>
-            </w:r>
-            <w:r>
-              <w:rPr>
-                <w:rFonts w:asciiTheme="majorHAnsi" w:eastAsia="Calibri" w:hAnsiTheme="majorHAnsi" w:cstheme="majorHAnsi"/>
-                <w:sz w:val="18"/>
-                <w:szCs w:val="18"/>
-                <w:highlight w:val="yellow"/>
-                <w:lang w:val="en-US"/>
-              </w:rPr>
-            </w:r>
-            <w:r>
-              <w:rPr>
-                <w:rFonts w:asciiTheme="majorHAnsi" w:eastAsia="Calibri" w:hAnsiTheme="majorHAnsi" w:cstheme="majorHAnsi"/>
-                <w:sz w:val="18"/>
-                <w:szCs w:val="18"/>
-                <w:highlight w:val="yellow"/>
-                <w:lang w:val="en-US"/>
-              </w:rPr>
-            </w:r>
-            <w:r>
-              <w:rPr>
-                <w:rFonts w:asciiTheme="majorHAnsi" w:eastAsia="Calibri" w:hAnsiTheme="majorHAnsi" w:cstheme="majorHAnsi"/>
-                <w:sz w:val="18"/>
-                <w:szCs w:val="18"/>
-                <w:highlight w:val="yellow"/>
-                <w:lang w:val="en-US"/>
-              </w:rPr>
-            </w:r>
-            <w:r>
-              <w:rPr>
-                <w:rFonts w:asciiTheme="majorHAnsi" w:eastAsia="Calibri" w:hAnsiTheme="majorHAnsi" w:cstheme="majorHAnsi"/>
-                <w:sz w:val="18"/>
-                <w:szCs w:val="18"/>
-                <w:highlight w:val="yellow"/>
-                <w:lang w:val="en-US"/>
-              </w:rPr>
+              <w:t xml:space="preserve">Please describe the performance management capabilities of your system </w:t>
+            </w:r>
+            <w:r>
+              <w:rPr>
+                <w:rFonts w:asciiTheme="majorHAnsi" w:eastAsia="Calibri" w:hAnsiTheme="majorHAnsi" w:cstheme="majorHAnsi"/>
+                <w:sz w:val="18"/>
+                <w:szCs w:val="18"/>
+                <w:highlight w:val="yellow"/>
+                <w:lang w:val="en-US"/>
+              </w:rPr>
+              <w:t>detailing to what extent they match t</w:t>
+            </w:r>
+            <w:r>
+              <w:rPr>
+                <w:rFonts w:asciiTheme="majorHAnsi" w:eastAsia="Calibri" w:hAnsiTheme="majorHAnsi" w:cstheme="majorHAnsi"/>
+                <w:sz w:val="18"/>
+                <w:szCs w:val="18"/>
+                <w:highlight w:val="yellow"/>
+                <w:lang w:val="en-US"/>
+              </w:rPr>
+              <w:t>he following requirements</w:t>
+            </w:r>
+            <w:r>
+              <w:rPr>
+                <w:rFonts w:asciiTheme="majorHAnsi" w:eastAsia="Calibri" w:hAnsiTheme="majorHAnsi" w:cstheme="majorHAnsi"/>
+                <w:sz w:val="18"/>
+                <w:szCs w:val="18"/>
+                <w:highlight w:val="yellow"/>
+                <w:lang w:val="en-US"/>
+              </w:rPr>
+              <w:t xml:space="preserve"> and if any additional functionality is available</w:t>
+            </w:r>
+            <w:r>
+              <w:rPr>
+                <w:rFonts w:asciiTheme="majorHAnsi" w:eastAsia="Calibri" w:hAnsiTheme="majorHAnsi" w:cstheme="majorHAnsi"/>
+                <w:sz w:val="18"/>
+                <w:szCs w:val="18"/>
+                <w:highlight w:val="yellow"/>
+                <w:lang w:val="en-US"/>
+              </w:rPr>
+              <w:t>:</w:t>
+            </w:r>
+            <w:r>
+              <w:rPr>
+                <w:rFonts w:asciiTheme="majorHAnsi" w:eastAsia="Calibri" w:hAnsiTheme="majorHAnsi" w:cstheme="majorHAnsi"/>
+                <w:sz w:val="18"/>
+                <w:szCs w:val="18"/>
+                <w:highlight w:val="yellow"/>
+                <w:lang w:val="en-US"/>
+              </w:rPr>
+              <w:t xml:space="preserve"> </w:t>
             </w:r>
           </w:p>
           <w:p>
@@ -5526,7 +5597,7 @@
                 <w:highlight w:val="yellow"/>
                 <w:lang w:val="en-US"/>
               </w:rPr>
-              <w:t>{{extra_62}}</w:t>
+              <w:t xml:space="preserve"> </w:t>
             </w:r>
           </w:p>
           <w:p>
@@ -5552,7 +5623,7 @@
                 <w:highlight w:val="yellow"/>
                 <w:lang w:val="en-US"/>
               </w:rPr>
-              <w:t>{{extra_63}}</w:t>
+              <w:t>Goal setting</w:t>
             </w:r>
           </w:p>
           <w:p>
@@ -5579,7 +5650,7 @@
                 <w:highlight w:val="yellow"/>
                 <w:lang w:val="en-US"/>
               </w:rPr>
-              <w:t>{{extra_64}}</w:t>
+              <w:t>Customisable</w:t>
             </w:r>
             <w:proofErr w:type="spellEnd"/>
             <w:r>
@@ -5590,15 +5661,17 @@
                 <w:highlight w:val="yellow"/>
                 <w:lang w:val="en-US"/>
               </w:rPr>
-            </w:r>
-            <w:r>
-              <w:rPr>
-                <w:rFonts w:asciiTheme="majorHAnsi" w:eastAsia="Calibri" w:hAnsiTheme="majorHAnsi" w:cstheme="majorHAnsi"/>
-                <w:sz w:val="18"/>
-                <w:szCs w:val="18"/>
-                <w:highlight w:val="yellow"/>
-                <w:lang w:val="en-US"/>
-              </w:rPr>
+              <w:t xml:space="preserve"> a</w:t>
+            </w:r>
+            <w:r>
+              <w:rPr>
+                <w:rFonts w:asciiTheme="majorHAnsi" w:eastAsia="Calibri" w:hAnsiTheme="majorHAnsi" w:cstheme="majorHAnsi"/>
+                <w:sz w:val="18"/>
+                <w:szCs w:val="18"/>
+                <w:highlight w:val="yellow"/>
+                <w:lang w:val="en-US"/>
+              </w:rPr>
+              <w:t>utomated review cycles</w:t>
             </w:r>
           </w:p>
           <w:p>
@@ -5625,7 +5698,7 @@
                 <w:highlight w:val="yellow"/>
                 <w:lang w:val="en-US"/>
               </w:rPr>
-              <w:t>{{extra_65}}</w:t>
+              <w:t>Customisable</w:t>
             </w:r>
             <w:proofErr w:type="spellEnd"/>
             <w:r>
@@ -5636,24 +5709,27 @@
                 <w:highlight w:val="yellow"/>
                 <w:lang w:val="en-US"/>
               </w:rPr>
-            </w:r>
-            <w:r>
-              <w:rPr>
-                <w:rFonts w:asciiTheme="majorHAnsi" w:eastAsia="Calibri" w:hAnsiTheme="majorHAnsi" w:cstheme="majorHAnsi"/>
-                <w:sz w:val="18"/>
-                <w:szCs w:val="18"/>
-                <w:highlight w:val="yellow"/>
-                <w:lang w:val="en-US"/>
-              </w:rPr>
-            </w:r>
-            <w:r>
-              <w:rPr>
-                <w:rFonts w:asciiTheme="majorHAnsi" w:eastAsia="Calibri" w:hAnsiTheme="majorHAnsi" w:cstheme="majorHAnsi"/>
-                <w:sz w:val="18"/>
-                <w:szCs w:val="18"/>
-                <w:highlight w:val="yellow"/>
-                <w:lang w:val="en-US"/>
-              </w:rPr>
+              <w:t xml:space="preserve"> r</w:t>
+            </w:r>
+            <w:r>
+              <w:rPr>
+                <w:rFonts w:asciiTheme="majorHAnsi" w:eastAsia="Calibri" w:hAnsiTheme="majorHAnsi" w:cstheme="majorHAnsi"/>
+                <w:sz w:val="18"/>
+                <w:szCs w:val="18"/>
+                <w:highlight w:val="yellow"/>
+                <w:lang w:val="en-US"/>
+              </w:rPr>
+              <w:t>eview templates</w:t>
+            </w:r>
+            <w:r>
+              <w:rPr>
+                <w:rFonts w:asciiTheme="majorHAnsi" w:eastAsia="Calibri" w:hAnsiTheme="majorHAnsi" w:cstheme="majorHAnsi"/>
+                <w:sz w:val="18"/>
+                <w:szCs w:val="18"/>
+                <w:highlight w:val="yellow"/>
+                <w:lang w:val="en-US"/>
+              </w:rPr>
+              <w:t xml:space="preserve"> </w:t>
             </w:r>
           </w:p>
           <w:p>
@@ -5679,7 +5755,7 @@
                 <w:highlight w:val="yellow"/>
                 <w:lang w:val="en-US"/>
               </w:rPr>
-              <w:t>{{extra_66}}</w:t>
+              <w:t>Options for 360 degree feedback</w:t>
             </w:r>
           </w:p>
           <w:p>
@@ -5705,7 +5781,7 @@
                 <w:highlight w:val="yellow"/>
                 <w:lang w:val="en-US"/>
               </w:rPr>
-              <w:t>{{extra_67}}</w:t>
+              <w:t>Options to record feedback from regular 1-2-1’s</w:t>
             </w:r>
           </w:p>
           <w:p>
@@ -5731,7 +5807,7 @@
                 <w:highlight w:val="yellow"/>
                 <w:lang w:val="en-US"/>
               </w:rPr>
-              <w:t>{{extra_68}}</w:t>
+              <w:t>Reporting on training needs identified in reviews</w:t>
             </w:r>
           </w:p>
           <w:p>
@@ -5757,7 +5833,7 @@
                 <w:highlight w:val="yellow"/>
                 <w:lang w:val="en-US"/>
               </w:rPr>
-              <w:t>{{extra_69}}</w:t>
+              <w:t xml:space="preserve">Requesting and approving ad-hoc training </w:t>
             </w:r>
           </w:p>
           <w:p>
@@ -5783,7 +5859,7 @@
                 <w:highlight w:val="yellow"/>
                 <w:lang w:val="en-US"/>
               </w:rPr>
-              <w:t>{{extra_70}}</w:t>
+              <w:t>Options for succession planning</w:t>
             </w:r>
           </w:p>
           <w:p>
@@ -5815,16 +5891,17 @@
                 <w:highlight w:val="yellow"/>
                 <w:lang w:val="en-US"/>
               </w:rPr>
-              <w:t>{{extra_71}}</w:t>
-            </w:r>
-            <w:r>
-              <w:rPr>
-                <w:rFonts w:asciiTheme="majorHAnsi" w:eastAsia="Calibri" w:hAnsiTheme="majorHAnsi" w:cstheme="majorHAnsi"/>
-                <w:sz w:val="18"/>
-                <w:szCs w:val="18"/>
-                <w:highlight w:val="yellow"/>
-                <w:lang w:val="en-US"/>
-              </w:rPr>
+              <w:t>Workflows</w:t>
+            </w:r>
+            <w:r>
+              <w:rPr>
+                <w:rFonts w:asciiTheme="majorHAnsi" w:eastAsia="Calibri" w:hAnsiTheme="majorHAnsi" w:cstheme="majorHAnsi"/>
+                <w:sz w:val="18"/>
+                <w:szCs w:val="18"/>
+                <w:highlight w:val="yellow"/>
+                <w:lang w:val="en-US"/>
+              </w:rPr>
+              <w:t xml:space="preserve"> </w:t>
             </w:r>
           </w:p>
           <w:p>
@@ -5844,7 +5921,7 @@
                 <w:highlight w:val="yellow"/>
                 <w:lang w:val="en-US"/>
               </w:rPr>
-              <w:t>{{extra_72}}</w:t>
+              <w:t xml:space="preserve">We rely heavily on the use of workflows for activities such as new starter notifications, leavers, end of fixed term contracts etc. Please give further details on your workflow functionality, including:  </w:t>
             </w:r>
           </w:p>
           <w:p>
@@ -5864,7 +5941,7 @@
                 <w:highlight w:val="yellow"/>
                 <w:lang w:val="en-US"/>
               </w:rPr>
-              <w:t>{{extra_73}}</w:t>
+              <w:t xml:space="preserve"> </w:t>
             </w:r>
           </w:p>
           <w:p>
@@ -5890,25 +5967,27 @@
                 <w:highlight w:val="yellow"/>
                 <w:lang w:val="en-US"/>
               </w:rPr>
-              <w:t>{{extra_74}}</w:t>
-            </w:r>
-            <w:r>
-              <w:rPr>
-                <w:rFonts w:asciiTheme="majorHAnsi" w:eastAsia="Calibri" w:hAnsiTheme="majorHAnsi" w:cstheme="majorHAnsi"/>
-                <w:sz w:val="18"/>
-                <w:szCs w:val="18"/>
-                <w:highlight w:val="yellow"/>
-                <w:lang w:val="en-US"/>
-              </w:rPr>
-            </w:r>
-            <w:r>
-              <w:rPr>
-                <w:rFonts w:asciiTheme="majorHAnsi" w:eastAsia="Calibri" w:hAnsiTheme="majorHAnsi" w:cstheme="majorHAnsi"/>
-                <w:sz w:val="18"/>
-                <w:szCs w:val="18"/>
-                <w:highlight w:val="yellow"/>
-                <w:lang w:val="en-US"/>
-              </w:rPr>
+              <w:t xml:space="preserve">Whether there are pre-built options </w:t>
+            </w:r>
+            <w:r>
+              <w:rPr>
+                <w:rFonts w:asciiTheme="majorHAnsi" w:eastAsia="Calibri" w:hAnsiTheme="majorHAnsi" w:cstheme="majorHAnsi"/>
+                <w:sz w:val="18"/>
+                <w:szCs w:val="18"/>
+                <w:highlight w:val="yellow"/>
+                <w:lang w:val="en-US"/>
+              </w:rPr>
+              <w:t>and if they</w:t>
+            </w:r>
+            <w:r>
+              <w:rPr>
+                <w:rFonts w:asciiTheme="majorHAnsi" w:eastAsia="Calibri" w:hAnsiTheme="majorHAnsi" w:cstheme="majorHAnsi"/>
+                <w:sz w:val="18"/>
+                <w:szCs w:val="18"/>
+                <w:highlight w:val="yellow"/>
+                <w:lang w:val="en-US"/>
+              </w:rPr>
+              <w:t xml:space="preserve"> can be </w:t>
             </w:r>
             <w:proofErr w:type="spellStart"/>
             <w:r>
@@ -5919,6 +5998,7 @@
                 <w:highlight w:val="yellow"/>
                 <w:lang w:val="en-US"/>
               </w:rPr>
+              <w:t>customised</w:t>
             </w:r>
             <w:proofErr w:type="spellEnd"/>
             <w:r>
@@ -5929,6 +6009,7 @@
                 <w:highlight w:val="yellow"/>
                 <w:lang w:val="en-US"/>
               </w:rPr>
+              <w:t xml:space="preserve"> </w:t>
             </w:r>
           </w:p>
           <w:p>
@@ -5954,43 +6035,47 @@
                 <w:highlight w:val="yellow"/>
                 <w:lang w:val="en-US"/>
               </w:rPr>
-              <w:t>{{extra_75}}</w:t>
-            </w:r>
-            <w:r>
-              <w:rPr>
-                <w:rFonts w:asciiTheme="majorHAnsi" w:eastAsia="Calibri" w:hAnsiTheme="majorHAnsi" w:cstheme="majorHAnsi"/>
-                <w:sz w:val="18"/>
-                <w:szCs w:val="18"/>
-                <w:highlight w:val="yellow"/>
-                <w:lang w:val="en-US"/>
-              </w:rPr>
-            </w:r>
-            <w:r>
-              <w:rPr>
-                <w:rFonts w:asciiTheme="majorHAnsi" w:eastAsia="Calibri" w:hAnsiTheme="majorHAnsi" w:cstheme="majorHAnsi"/>
-                <w:sz w:val="18"/>
-                <w:szCs w:val="18"/>
-                <w:highlight w:val="yellow"/>
-                <w:lang w:val="en-US"/>
-              </w:rPr>
-            </w:r>
-            <w:r>
-              <w:rPr>
-                <w:rFonts w:asciiTheme="majorHAnsi" w:eastAsia="Calibri" w:hAnsiTheme="majorHAnsi" w:cstheme="majorHAnsi"/>
-                <w:sz w:val="18"/>
-                <w:szCs w:val="18"/>
-                <w:highlight w:val="yellow"/>
-                <w:lang w:val="en-US"/>
-              </w:rPr>
-            </w:r>
-            <w:r>
-              <w:rPr>
-                <w:rFonts w:asciiTheme="majorHAnsi" w:eastAsia="Calibri" w:hAnsiTheme="majorHAnsi" w:cstheme="majorHAnsi"/>
-                <w:sz w:val="18"/>
-                <w:szCs w:val="18"/>
-                <w:highlight w:val="yellow"/>
-                <w:lang w:val="en-US"/>
-              </w:rPr>
+              <w:t xml:space="preserve">How </w:t>
+            </w:r>
+            <w:r>
+              <w:rPr>
+                <w:rFonts w:asciiTheme="majorHAnsi" w:eastAsia="Calibri" w:hAnsiTheme="majorHAnsi" w:cstheme="majorHAnsi"/>
+                <w:sz w:val="18"/>
+                <w:szCs w:val="18"/>
+                <w:highlight w:val="yellow"/>
+                <w:lang w:val="en-US"/>
+              </w:rPr>
+              <w:t>a new</w:t>
+            </w:r>
+            <w:r>
+              <w:rPr>
+                <w:rFonts w:asciiTheme="majorHAnsi" w:eastAsia="Calibri" w:hAnsiTheme="majorHAnsi" w:cstheme="majorHAnsi"/>
+                <w:sz w:val="18"/>
+                <w:szCs w:val="18"/>
+                <w:highlight w:val="yellow"/>
+                <w:lang w:val="en-US"/>
+              </w:rPr>
+              <w:t xml:space="preserve"> workflow process is created</w:t>
+            </w:r>
+            <w:r>
+              <w:rPr>
+                <w:rFonts w:asciiTheme="majorHAnsi" w:eastAsia="Calibri" w:hAnsiTheme="majorHAnsi" w:cstheme="majorHAnsi"/>
+                <w:sz w:val="18"/>
+                <w:szCs w:val="18"/>
+                <w:highlight w:val="yellow"/>
+                <w:lang w:val="en-US"/>
+              </w:rPr>
+              <w:t xml:space="preserve"> and </w:t>
+            </w:r>
+            <w:r>
+              <w:rPr>
+                <w:rFonts w:asciiTheme="majorHAnsi" w:eastAsia="Calibri" w:hAnsiTheme="majorHAnsi" w:cstheme="majorHAnsi"/>
+                <w:sz w:val="18"/>
+                <w:szCs w:val="18"/>
+                <w:highlight w:val="yellow"/>
+                <w:lang w:val="en-US"/>
+              </w:rPr>
+              <w:t>used</w:t>
             </w:r>
           </w:p>
           <w:p>
@@ -6016,7 +6101,7 @@
                 <w:highlight w:val="yellow"/>
                 <w:lang w:val="en-US"/>
               </w:rPr>
-              <w:t>{{extra_76}}</w:t>
+              <w:t xml:space="preserve">Whether onboarding is done through workflows or if you have a specific onboarding section (please provide details if so)  </w:t>
             </w:r>
           </w:p>
           <w:p>
@@ -6042,7 +6127,7 @@
                 <w:highlight w:val="yellow"/>
                 <w:lang w:val="en-US"/>
               </w:rPr>
-              <w:t>{{extra_77}}</w:t>
+              <w:t>Whether the workflows can request approvals for tasks (from managers for example) and signatures on documents as well as provide notifications</w:t>
             </w:r>
             <w:r>
               <w:rPr>
@@ -6052,6 +6137,7 @@
                 <w:highlight w:val="yellow"/>
                 <w:lang w:val="en-US"/>
               </w:rPr>
+              <w:t xml:space="preserve"> to specific people or groups of people</w:t>
             </w:r>
           </w:p>
           <w:p>
@@ -6077,7 +6163,7 @@
                 <w:highlight w:val="yellow"/>
                 <w:lang w:val="en-US"/>
               </w:rPr>
-              <w:t>{{extra_78}}</w:t>
+              <w:t xml:space="preserve">Whether there is any limitation on workflows including the number that can be set up or are active at any one time or the data that can be </w:t>
             </w:r>
             <w:proofErr w:type="spellStart"/>
             <w:r>
@@ -6088,6 +6174,7 @@
                 <w:highlight w:val="yellow"/>
                 <w:lang w:val="en-US"/>
               </w:rPr>
+              <w:t>utilised</w:t>
             </w:r>
             <w:proofErr w:type="spellEnd"/>
           </w:p>
@@ -6108,7 +6195,7 @@
                 <w:highlight w:val="yellow"/>
                 <w:lang w:val="en-US"/>
               </w:rPr>
-              <w:t>{{extra_79}}</w:t>
+              <w:t xml:space="preserve">  </w:t>
             </w:r>
           </w:p>
           <w:p>
@@ -6130,55 +6217,58 @@
                 <w:highlight w:val="yellow"/>
                 <w:lang w:val="en-US"/>
               </w:rPr>
-              <w:t>{{extra_80}}</w:t>
-            </w:r>
-            <w:r>
-              <w:rPr>
-                <w:rFonts w:asciiTheme="majorHAnsi" w:eastAsia="Calibri" w:hAnsiTheme="majorHAnsi" w:cstheme="majorHAnsi"/>
-                <w:sz w:val="18"/>
-                <w:szCs w:val="18"/>
-                <w:highlight w:val="yellow"/>
-                <w:lang w:val="en-US"/>
-              </w:rPr>
-            </w:r>
-          </w:p>
-          <w:p>
-            <w:pPr>
-              <w:rPr>
-                <w:rFonts w:asciiTheme="majorHAnsi" w:eastAsia="Calibri" w:hAnsiTheme="majorHAnsi" w:cstheme="majorHAnsi"/>
-                <w:sz w:val="18"/>
-                <w:szCs w:val="18"/>
-                <w:highlight w:val="yellow"/>
-                <w:lang w:val="en-US"/>
-              </w:rPr>
-            </w:pPr>
-            <w:r>
-              <w:rPr>
-                <w:rFonts w:asciiTheme="majorHAnsi" w:eastAsia="Calibri" w:hAnsiTheme="majorHAnsi" w:cstheme="majorHAnsi"/>
-                <w:sz w:val="18"/>
-                <w:szCs w:val="18"/>
-                <w:highlight w:val="yellow"/>
-                <w:lang w:val="en-US"/>
-              </w:rPr>
-              <w:t>{{extra_81}}</w:t>
-            </w:r>
-            <w:r>
-              <w:rPr>
-                <w:rFonts w:asciiTheme="majorHAnsi" w:eastAsia="Calibri" w:hAnsiTheme="majorHAnsi" w:cstheme="majorHAnsi"/>
-                <w:sz w:val="18"/>
-                <w:szCs w:val="18"/>
-                <w:highlight w:val="yellow"/>
-                <w:lang w:val="en-US"/>
-              </w:rPr>
-            </w:r>
-            <w:r>
-              <w:rPr>
-                <w:rFonts w:asciiTheme="majorHAnsi" w:eastAsia="Calibri" w:hAnsiTheme="majorHAnsi" w:cstheme="majorHAnsi"/>
-                <w:sz w:val="18"/>
-                <w:szCs w:val="18"/>
-                <w:highlight w:val="yellow"/>
-                <w:lang w:val="en-US"/>
-              </w:rPr>
+              <w:t>Documentation</w:t>
+            </w:r>
+            <w:r>
+              <w:rPr>
+                <w:rFonts w:asciiTheme="majorHAnsi" w:eastAsia="Calibri" w:hAnsiTheme="majorHAnsi" w:cstheme="majorHAnsi"/>
+                <w:sz w:val="18"/>
+                <w:szCs w:val="18"/>
+                <w:highlight w:val="yellow"/>
+                <w:lang w:val="en-US"/>
+              </w:rPr>
+              <w:t xml:space="preserve"> </w:t>
+            </w:r>
+          </w:p>
+          <w:p>
+            <w:pPr>
+              <w:rPr>
+                <w:rFonts w:asciiTheme="majorHAnsi" w:eastAsia="Calibri" w:hAnsiTheme="majorHAnsi" w:cstheme="majorHAnsi"/>
+                <w:sz w:val="18"/>
+                <w:szCs w:val="18"/>
+                <w:highlight w:val="yellow"/>
+                <w:lang w:val="en-US"/>
+              </w:rPr>
+            </w:pPr>
+            <w:r>
+              <w:rPr>
+                <w:rFonts w:asciiTheme="majorHAnsi" w:eastAsia="Calibri" w:hAnsiTheme="majorHAnsi" w:cstheme="majorHAnsi"/>
+                <w:sz w:val="18"/>
+                <w:szCs w:val="18"/>
+                <w:highlight w:val="yellow"/>
+                <w:lang w:val="en-US"/>
+              </w:rPr>
+              <w:t>We need the system to be able to generate documents automatically (letters, contracts etc.) based on uploaded templates</w:t>
+            </w:r>
+            <w:r>
+              <w:rPr>
+                <w:rFonts w:asciiTheme="majorHAnsi" w:eastAsia="Calibri" w:hAnsiTheme="majorHAnsi" w:cstheme="majorHAnsi"/>
+                <w:sz w:val="18"/>
+                <w:szCs w:val="18"/>
+                <w:highlight w:val="yellow"/>
+                <w:lang w:val="en-US"/>
+              </w:rPr>
+              <w:t xml:space="preserve"> as well as store a variety of documents related to each individual employee</w:t>
+            </w:r>
+            <w:r>
+              <w:rPr>
+                <w:rFonts w:asciiTheme="majorHAnsi" w:eastAsia="Calibri" w:hAnsiTheme="majorHAnsi" w:cstheme="majorHAnsi"/>
+                <w:sz w:val="18"/>
+                <w:szCs w:val="18"/>
+                <w:highlight w:val="yellow"/>
+                <w:lang w:val="en-US"/>
+              </w:rPr>
+              <w:t xml:space="preserve">. Does your system allow us to generate documents for employees from templates? If so, please </w:t>
             </w:r>
             <w:proofErr w:type="spellStart"/>
             <w:r>
@@ -6189,6 +6279,7 @@
                 <w:highlight w:val="yellow"/>
                 <w:lang w:val="en-US"/>
               </w:rPr>
+              <w:t>summarise</w:t>
             </w:r>
             <w:proofErr w:type="spellEnd"/>
             <w:r>
@@ -6199,178 +6290,191 @@
                 <w:highlight w:val="yellow"/>
                 <w:lang w:val="en-US"/>
               </w:rPr>
-            </w:r>
-          </w:p>
-          <w:p>
-            <w:pPr>
-              <w:rPr>
-                <w:rFonts w:asciiTheme="majorHAnsi" w:eastAsia="Calibri" w:hAnsiTheme="majorHAnsi" w:cstheme="majorHAnsi"/>
-                <w:sz w:val="18"/>
-                <w:szCs w:val="18"/>
-                <w:highlight w:val="yellow"/>
-                <w:lang w:val="en-US"/>
-              </w:rPr>
-            </w:pPr>
-          </w:p>
-          <w:p>
-            <w:pPr>
-              <w:rPr>
-                <w:rFonts w:asciiTheme="majorHAnsi" w:eastAsia="Calibri" w:hAnsiTheme="majorHAnsi" w:cstheme="majorHAnsi"/>
-                <w:sz w:val="18"/>
-                <w:szCs w:val="18"/>
-                <w:highlight w:val="yellow"/>
-                <w:lang w:val="en-US"/>
-              </w:rPr>
-            </w:pPr>
-            <w:r>
-              <w:rPr>
-                <w:rFonts w:asciiTheme="majorHAnsi" w:eastAsia="Calibri" w:hAnsiTheme="majorHAnsi" w:cstheme="majorHAnsi"/>
-                <w:sz w:val="18"/>
-                <w:szCs w:val="18"/>
-                <w:highlight w:val="yellow"/>
-                <w:lang w:val="en-US"/>
-              </w:rPr>
-              <w:t>{{extra_82}}</w:t>
-            </w:r>
-          </w:p>
-          <w:p>
-            <w:pPr>
-              <w:rPr>
-                <w:rFonts w:asciiTheme="majorHAnsi" w:eastAsia="Calibri" w:hAnsiTheme="majorHAnsi" w:cstheme="majorHAnsi"/>
-                <w:sz w:val="18"/>
-                <w:szCs w:val="18"/>
-                <w:highlight w:val="yellow"/>
-                <w:lang w:val="en-US"/>
-              </w:rPr>
-            </w:pPr>
-          </w:p>
-          <w:p>
-            <w:pPr>
-              <w:rPr>
-                <w:rFonts w:asciiTheme="majorHAnsi" w:eastAsia="Calibri" w:hAnsiTheme="majorHAnsi" w:cstheme="majorHAnsi"/>
-                <w:sz w:val="18"/>
-                <w:szCs w:val="18"/>
-                <w:highlight w:val="yellow"/>
-                <w:lang w:val="en-US"/>
-              </w:rPr>
-            </w:pPr>
-            <w:r>
-              <w:rPr>
-                <w:rFonts w:asciiTheme="majorHAnsi" w:eastAsia="Calibri" w:hAnsiTheme="majorHAnsi" w:cstheme="majorHAnsi"/>
-                <w:sz w:val="18"/>
-                <w:szCs w:val="18"/>
-                <w:highlight w:val="yellow"/>
-                <w:lang w:val="en-US"/>
-              </w:rPr>
-              <w:t>{{extra_83}}</w:t>
-            </w:r>
-            <w:r>
-              <w:rPr>
-                <w:rFonts w:asciiTheme="majorHAnsi" w:eastAsia="Calibri" w:hAnsiTheme="majorHAnsi" w:cstheme="majorHAnsi"/>
-                <w:sz w:val="18"/>
-                <w:szCs w:val="18"/>
-                <w:highlight w:val="yellow"/>
-                <w:lang w:val="en-US"/>
-              </w:rPr>
-            </w:r>
-            <w:r>
-              <w:rPr>
-                <w:rFonts w:asciiTheme="majorHAnsi" w:eastAsia="Calibri" w:hAnsiTheme="majorHAnsi" w:cstheme="majorHAnsi"/>
-                <w:sz w:val="18"/>
-                <w:szCs w:val="18"/>
-                <w:highlight w:val="yellow"/>
-                <w:lang w:val="en-US"/>
-              </w:rPr>
-            </w:r>
-            <w:r>
-              <w:rPr>
-                <w:rFonts w:asciiTheme="majorHAnsi" w:eastAsia="Calibri" w:hAnsiTheme="majorHAnsi" w:cstheme="majorHAnsi"/>
-                <w:sz w:val="18"/>
-                <w:szCs w:val="18"/>
-                <w:highlight w:val="yellow"/>
-                <w:lang w:val="en-US"/>
-              </w:rPr>
-            </w:r>
-            <w:r>
-              <w:rPr>
-                <w:rFonts w:asciiTheme="majorHAnsi" w:eastAsia="Calibri" w:hAnsiTheme="majorHAnsi" w:cstheme="majorHAnsi"/>
-                <w:sz w:val="18"/>
-                <w:szCs w:val="18"/>
-                <w:highlight w:val="yellow"/>
-                <w:lang w:val="en-US"/>
-              </w:rPr>
-            </w:r>
-            <w:r>
-              <w:rPr>
-                <w:rFonts w:asciiTheme="majorHAnsi" w:eastAsia="Calibri" w:hAnsiTheme="majorHAnsi" w:cstheme="majorHAnsi"/>
-                <w:sz w:val="18"/>
-                <w:szCs w:val="18"/>
-                <w:highlight w:val="yellow"/>
-                <w:lang w:val="en-US"/>
-              </w:rPr>
-            </w:r>
-            <w:r>
-              <w:rPr>
-                <w:rFonts w:asciiTheme="majorHAnsi" w:eastAsia="Calibri" w:hAnsiTheme="majorHAnsi" w:cstheme="majorHAnsi"/>
-                <w:sz w:val="18"/>
-                <w:szCs w:val="18"/>
-                <w:highlight w:val="yellow"/>
-                <w:lang w:val="en-US"/>
-              </w:rPr>
-            </w:r>
-            <w:r>
-              <w:rPr>
-                <w:rFonts w:asciiTheme="majorHAnsi" w:eastAsia="Calibri" w:hAnsiTheme="majorHAnsi" w:cstheme="majorHAnsi"/>
-                <w:sz w:val="18"/>
-                <w:szCs w:val="18"/>
-                <w:highlight w:val="yellow"/>
-                <w:lang w:val="en-US"/>
-              </w:rPr>
-            </w:r>
-            <w:r>
-              <w:rPr>
-                <w:rFonts w:asciiTheme="majorHAnsi" w:eastAsia="Calibri" w:hAnsiTheme="majorHAnsi" w:cstheme="majorHAnsi"/>
-                <w:sz w:val="18"/>
-                <w:szCs w:val="18"/>
-                <w:highlight w:val="yellow"/>
-                <w:lang w:val="en-US"/>
-              </w:rPr>
-            </w:r>
-            <w:r>
-              <w:rPr>
-                <w:rFonts w:asciiTheme="majorHAnsi" w:eastAsia="Calibri" w:hAnsiTheme="majorHAnsi" w:cstheme="majorHAnsi"/>
-                <w:sz w:val="18"/>
-                <w:szCs w:val="18"/>
-                <w:highlight w:val="yellow"/>
-                <w:lang w:val="en-US"/>
-              </w:rPr>
-            </w:r>
-            <w:r>
-              <w:rPr>
-                <w:rFonts w:asciiTheme="majorHAnsi" w:eastAsia="Calibri" w:hAnsiTheme="majorHAnsi" w:cstheme="majorHAnsi"/>
-                <w:sz w:val="18"/>
-                <w:szCs w:val="18"/>
-                <w:highlight w:val="yellow"/>
-                <w:lang w:val="en-US"/>
-              </w:rPr>
-            </w:r>
-            <w:r>
-              <w:rPr>
-                <w:rFonts w:asciiTheme="majorHAnsi" w:eastAsia="Calibri" w:hAnsiTheme="majorHAnsi" w:cstheme="majorHAnsi"/>
-                <w:sz w:val="18"/>
-                <w:szCs w:val="18"/>
-                <w:highlight w:val="yellow"/>
-                <w:lang w:val="en-US"/>
-              </w:rPr>
-            </w:r>
-            <w:r>
-              <w:rPr>
-                <w:rFonts w:asciiTheme="majorHAnsi" w:eastAsia="Calibri" w:hAnsiTheme="majorHAnsi" w:cstheme="majorHAnsi"/>
-                <w:sz w:val="18"/>
-                <w:szCs w:val="18"/>
-                <w:highlight w:val="yellow"/>
-                <w:lang w:val="en-US"/>
-              </w:rPr>
+              <w:t xml:space="preserve"> how this works and how it is set-up. </w:t>
+            </w:r>
+          </w:p>
+          <w:p>
+            <w:pPr>
+              <w:rPr>
+                <w:rFonts w:asciiTheme="majorHAnsi" w:eastAsia="Calibri" w:hAnsiTheme="majorHAnsi" w:cstheme="majorHAnsi"/>
+                <w:sz w:val="18"/>
+                <w:szCs w:val="18"/>
+                <w:highlight w:val="yellow"/>
+                <w:lang w:val="en-US"/>
+              </w:rPr>
+            </w:pPr>
+          </w:p>
+          <w:p>
+            <w:pPr>
+              <w:rPr>
+                <w:rFonts w:asciiTheme="majorHAnsi" w:eastAsia="Calibri" w:hAnsiTheme="majorHAnsi" w:cstheme="majorHAnsi"/>
+                <w:sz w:val="18"/>
+                <w:szCs w:val="18"/>
+                <w:highlight w:val="yellow"/>
+                <w:lang w:val="en-US"/>
+              </w:rPr>
+            </w:pPr>
+            <w:r>
+              <w:rPr>
+                <w:rFonts w:asciiTheme="majorHAnsi" w:eastAsia="Calibri" w:hAnsiTheme="majorHAnsi" w:cstheme="majorHAnsi"/>
+                <w:sz w:val="18"/>
+                <w:szCs w:val="18"/>
+                <w:highlight w:val="yellow"/>
+                <w:lang w:val="en-US"/>
+              </w:rPr>
+              <w:t xml:space="preserve">Please also detail whether documents can be electronically signed via the system and if this is in-built or requires subscription to an external app. </w:t>
+            </w:r>
+          </w:p>
+          <w:p>
+            <w:pPr>
+              <w:rPr>
+                <w:rFonts w:asciiTheme="majorHAnsi" w:eastAsia="Calibri" w:hAnsiTheme="majorHAnsi" w:cstheme="majorHAnsi"/>
+                <w:sz w:val="18"/>
+                <w:szCs w:val="18"/>
+                <w:highlight w:val="yellow"/>
+                <w:lang w:val="en-US"/>
+              </w:rPr>
+            </w:pPr>
+          </w:p>
+          <w:p>
+            <w:pPr>
+              <w:rPr>
+                <w:rFonts w:asciiTheme="majorHAnsi" w:eastAsia="Calibri" w:hAnsiTheme="majorHAnsi" w:cstheme="majorHAnsi"/>
+                <w:sz w:val="18"/>
+                <w:szCs w:val="18"/>
+                <w:highlight w:val="yellow"/>
+                <w:lang w:val="en-US"/>
+              </w:rPr>
+            </w:pPr>
+            <w:r>
+              <w:rPr>
+                <w:rFonts w:asciiTheme="majorHAnsi" w:eastAsia="Calibri" w:hAnsiTheme="majorHAnsi" w:cstheme="majorHAnsi"/>
+                <w:sz w:val="18"/>
+                <w:szCs w:val="18"/>
+                <w:highlight w:val="yellow"/>
+                <w:lang w:val="en-US"/>
+              </w:rPr>
+              <w:t xml:space="preserve">In addition, please detail </w:t>
+            </w:r>
+            <w:r>
+              <w:rPr>
+                <w:rFonts w:asciiTheme="majorHAnsi" w:eastAsia="Calibri" w:hAnsiTheme="majorHAnsi" w:cstheme="majorHAnsi"/>
+                <w:sz w:val="18"/>
+                <w:szCs w:val="18"/>
+                <w:highlight w:val="yellow"/>
+                <w:lang w:val="en-US"/>
+              </w:rPr>
+              <w:t xml:space="preserve">exactly </w:t>
+            </w:r>
+            <w:r>
+              <w:rPr>
+                <w:rFonts w:asciiTheme="majorHAnsi" w:eastAsia="Calibri" w:hAnsiTheme="majorHAnsi" w:cstheme="majorHAnsi"/>
+                <w:sz w:val="18"/>
+                <w:szCs w:val="18"/>
+                <w:highlight w:val="yellow"/>
+                <w:lang w:val="en-US"/>
+              </w:rPr>
+              <w:t>how documents are stored against individual records</w:t>
+            </w:r>
+            <w:r>
+              <w:rPr>
+                <w:rFonts w:asciiTheme="majorHAnsi" w:eastAsia="Calibri" w:hAnsiTheme="majorHAnsi" w:cstheme="majorHAnsi"/>
+                <w:sz w:val="18"/>
+                <w:szCs w:val="18"/>
+                <w:highlight w:val="yellow"/>
+                <w:lang w:val="en-US"/>
+              </w:rPr>
+              <w:t>, what type of files can be stored (word</w:t>
+            </w:r>
+            <w:r>
+              <w:rPr>
+                <w:rFonts w:asciiTheme="majorHAnsi" w:eastAsia="Calibri" w:hAnsiTheme="majorHAnsi" w:cstheme="majorHAnsi"/>
+                <w:sz w:val="18"/>
+                <w:szCs w:val="18"/>
+                <w:highlight w:val="yellow"/>
+                <w:lang w:val="en-US"/>
+              </w:rPr>
+              <w:t xml:space="preserve"> document</w:t>
+            </w:r>
+            <w:r>
+              <w:rPr>
+                <w:rFonts w:asciiTheme="majorHAnsi" w:eastAsia="Calibri" w:hAnsiTheme="majorHAnsi" w:cstheme="majorHAnsi"/>
+                <w:sz w:val="18"/>
+                <w:szCs w:val="18"/>
+                <w:highlight w:val="yellow"/>
+                <w:lang w:val="en-US"/>
+              </w:rPr>
+              <w:t>, pdf</w:t>
+            </w:r>
+            <w:r>
+              <w:rPr>
+                <w:rFonts w:asciiTheme="majorHAnsi" w:eastAsia="Calibri" w:hAnsiTheme="majorHAnsi" w:cstheme="majorHAnsi"/>
+                <w:sz w:val="18"/>
+                <w:szCs w:val="18"/>
+                <w:highlight w:val="yellow"/>
+                <w:lang w:val="en-US"/>
+              </w:rPr>
+              <w:t>, excel file,</w:t>
+            </w:r>
+            <w:r>
+              <w:rPr>
+                <w:rFonts w:asciiTheme="majorHAnsi" w:eastAsia="Calibri" w:hAnsiTheme="majorHAnsi" w:cstheme="majorHAnsi"/>
+                <w:sz w:val="18"/>
+                <w:szCs w:val="18"/>
+                <w:highlight w:val="yellow"/>
+                <w:lang w:val="en-US"/>
+              </w:rPr>
+              <w:t xml:space="preserve"> etc</w:t>
+            </w:r>
+            <w:r>
+              <w:rPr>
+                <w:rFonts w:asciiTheme="majorHAnsi" w:eastAsia="Calibri" w:hAnsiTheme="majorHAnsi" w:cstheme="majorHAnsi"/>
+                <w:sz w:val="18"/>
+                <w:szCs w:val="18"/>
+                <w:highlight w:val="yellow"/>
+                <w:lang w:val="en-US"/>
+              </w:rPr>
+              <w:t>.</w:t>
+            </w:r>
+            <w:r>
+              <w:rPr>
+                <w:rFonts w:asciiTheme="majorHAnsi" w:eastAsia="Calibri" w:hAnsiTheme="majorHAnsi" w:cstheme="majorHAnsi"/>
+                <w:sz w:val="18"/>
+                <w:szCs w:val="18"/>
+                <w:highlight w:val="yellow"/>
+                <w:lang w:val="en-US"/>
+              </w:rPr>
+              <w:t>)</w:t>
+            </w:r>
+            <w:r>
+              <w:rPr>
+                <w:rFonts w:asciiTheme="majorHAnsi" w:eastAsia="Calibri" w:hAnsiTheme="majorHAnsi" w:cstheme="majorHAnsi"/>
+                <w:sz w:val="18"/>
+                <w:szCs w:val="18"/>
+                <w:highlight w:val="yellow"/>
+                <w:lang w:val="en-US"/>
+              </w:rPr>
+              <w:t xml:space="preserve"> and if there is a way of </w:t>
+            </w:r>
+            <w:r>
+              <w:rPr>
+                <w:rFonts w:asciiTheme="majorHAnsi" w:eastAsia="Calibri" w:hAnsiTheme="majorHAnsi" w:cstheme="majorHAnsi"/>
+                <w:sz w:val="18"/>
+                <w:szCs w:val="18"/>
+                <w:highlight w:val="yellow"/>
+                <w:lang w:val="en-US"/>
+              </w:rPr>
+              <w:t xml:space="preserve">easily </w:t>
+            </w:r>
+            <w:r>
+              <w:rPr>
+                <w:rFonts w:asciiTheme="majorHAnsi" w:eastAsia="Calibri" w:hAnsiTheme="majorHAnsi" w:cstheme="majorHAnsi"/>
+                <w:sz w:val="18"/>
+                <w:szCs w:val="18"/>
+                <w:highlight w:val="yellow"/>
+                <w:lang w:val="en-US"/>
+              </w:rPr>
+              <w:t>locating specific documents (</w:t>
             </w:r>
             <w:proofErr w:type="spellStart"/>
             <w:r>
@@ -6381,6 +6485,7 @@
                 <w:highlight w:val="yellow"/>
                 <w:lang w:val="en-US"/>
               </w:rPr>
+              <w:t>ie</w:t>
             </w:r>
             <w:proofErr w:type="spellEnd"/>
             <w:r>
@@ -6391,6 +6496,7 @@
                 <w:highlight w:val="yellow"/>
                 <w:lang w:val="en-US"/>
               </w:rPr>
+              <w:t xml:space="preserve"> search facility or ability to </w:t>
             </w:r>
             <w:proofErr w:type="spellStart"/>
             <w:r>
@@ -6401,6 +6507,7 @@
                 <w:highlight w:val="yellow"/>
                 <w:lang w:val="en-US"/>
               </w:rPr>
+              <w:t>categorise</w:t>
             </w:r>
             <w:proofErr w:type="spellEnd"/>
             <w:r>
@@ -6411,6 +6518,7 @@
                 <w:highlight w:val="yellow"/>
                 <w:lang w:val="en-US"/>
               </w:rPr>
+              <w:t xml:space="preserve"> stored documents).</w:t>
             </w:r>
           </w:p>
           <w:p>
@@ -6442,16 +6550,17 @@
                 <w:highlight w:val="yellow"/>
                 <w:lang w:val="en-US"/>
               </w:rPr>
-              <w:t>{{extra_84}}</w:t>
-            </w:r>
-            <w:r>
-              <w:rPr>
-                <w:rFonts w:asciiTheme="majorHAnsi" w:eastAsia="Calibri" w:hAnsiTheme="majorHAnsi" w:cstheme="majorHAnsi"/>
-                <w:sz w:val="18"/>
-                <w:szCs w:val="18"/>
-                <w:highlight w:val="yellow"/>
-                <w:lang w:val="en-US"/>
-              </w:rPr>
+              <w:t>Absence Recording</w:t>
+            </w:r>
+            <w:r>
+              <w:rPr>
+                <w:rFonts w:asciiTheme="majorHAnsi" w:eastAsia="Calibri" w:hAnsiTheme="majorHAnsi" w:cstheme="majorHAnsi"/>
+                <w:sz w:val="18"/>
+                <w:szCs w:val="18"/>
+                <w:highlight w:val="yellow"/>
+                <w:lang w:val="en-US"/>
+              </w:rPr>
+              <w:t xml:space="preserve"> </w:t>
             </w:r>
           </w:p>
           <w:p>
@@ -6471,7 +6580,7 @@
                 <w:highlight w:val="yellow"/>
                 <w:lang w:val="en-US"/>
               </w:rPr>
-              <w:t>{{extra_85}}</w:t>
+              <w:t xml:space="preserve">We need to be able to set up a variety of sometimes complex, and usually different leave rules for each country. We offer: </w:t>
             </w:r>
           </w:p>
           <w:p>
@@ -6491,7 +6600,7 @@
                 <w:highlight w:val="yellow"/>
                 <w:lang w:val="en-US"/>
               </w:rPr>
-              <w:t>{{extra_86}}</w:t>
+              <w:t xml:space="preserve"> </w:t>
             </w:r>
           </w:p>
           <w:p>
@@ -6517,7 +6626,7 @@
                 <w:highlight w:val="yellow"/>
                 <w:lang w:val="en-US"/>
               </w:rPr>
-              <w:t>{{extra_87}}</w:t>
+              <w:t xml:space="preserve">Sick leave in UK which increases with service and applies at both 100% and 50% pay </w:t>
             </w:r>
           </w:p>
           <w:p>
@@ -6543,7 +6652,7 @@
                 <w:highlight w:val="yellow"/>
                 <w:lang w:val="en-US"/>
               </w:rPr>
-              <w:t>{{extra_88}}</w:t>
+              <w:t xml:space="preserve">Special leave which allows employees to take up to 10 days per year fully paid in certain circumstances </w:t>
             </w:r>
           </w:p>
           <w:p>
@@ -6569,7 +6678,7 @@
                 <w:highlight w:val="yellow"/>
                 <w:lang w:val="en-US"/>
               </w:rPr>
-              <w:t>{{extra_89}}</w:t>
+              <w:t xml:space="preserve">Time off in lieu – subject to certain parameters </w:t>
             </w:r>
           </w:p>
           <w:p>
@@ -6595,7 +6704,7 @@
                 <w:highlight w:val="yellow"/>
                 <w:lang w:val="en-US"/>
               </w:rPr>
-              <w:t>{{extra_90}}</w:t>
+              <w:t xml:space="preserve">Partner leave over and above statutory (paternity leave) </w:t>
             </w:r>
           </w:p>
           <w:p>
@@ -6621,7 +6730,7 @@
                 <w:highlight w:val="yellow"/>
                 <w:lang w:val="en-US"/>
               </w:rPr>
-              <w:t>{{extra_91}}</w:t>
+              <w:t xml:space="preserve">Parental leave – different in UK and NL </w:t>
             </w:r>
           </w:p>
           <w:p>
@@ -6647,7 +6756,7 @@
                 <w:highlight w:val="yellow"/>
                 <w:lang w:val="en-US"/>
               </w:rPr>
-              <w:t>{{extra_92}}</w:t>
+              <w:t>30 days holiday in UK, 31 days in NL</w:t>
             </w:r>
           </w:p>
           <w:p>
@@ -6673,28 +6782,28 @@
                 <w:highlight w:val="yellow"/>
                 <w:lang w:val="en-US"/>
               </w:rPr>
-              <w:t>{{extra_93}}</w:t>
-            </w:r>
-          </w:p>
-          <w:p>
-            <w:pPr>
-              <w:rPr>
-                <w:rFonts w:asciiTheme="majorHAnsi" w:eastAsia="Calibri" w:hAnsiTheme="majorHAnsi" w:cstheme="majorHAnsi"/>
-                <w:sz w:val="18"/>
-                <w:szCs w:val="18"/>
-                <w:highlight w:val="yellow"/>
-                <w:lang w:val="en-US"/>
-              </w:rPr>
-            </w:pPr>
-            <w:r>
-              <w:rPr>
-                <w:rFonts w:asciiTheme="majorHAnsi" w:eastAsia="Calibri" w:hAnsiTheme="majorHAnsi" w:cstheme="majorHAnsi"/>
-                <w:sz w:val="18"/>
-                <w:szCs w:val="18"/>
-                <w:highlight w:val="yellow"/>
-                <w:lang w:val="en-US"/>
-              </w:rPr>
-              <w:t>{{extra_94}}</w:t>
+              <w:t xml:space="preserve">Bank holidays, a number of which can be taken on a day of choice rather than on the actual holiday date </w:t>
+            </w:r>
+          </w:p>
+          <w:p>
+            <w:pPr>
+              <w:rPr>
+                <w:rFonts w:asciiTheme="majorHAnsi" w:eastAsia="Calibri" w:hAnsiTheme="majorHAnsi" w:cstheme="majorHAnsi"/>
+                <w:sz w:val="18"/>
+                <w:szCs w:val="18"/>
+                <w:highlight w:val="yellow"/>
+                <w:lang w:val="en-US"/>
+              </w:rPr>
+            </w:pPr>
+            <w:r>
+              <w:rPr>
+                <w:rFonts w:asciiTheme="majorHAnsi" w:eastAsia="Calibri" w:hAnsiTheme="majorHAnsi" w:cstheme="majorHAnsi"/>
+                <w:sz w:val="18"/>
+                <w:szCs w:val="18"/>
+                <w:highlight w:val="yellow"/>
+                <w:lang w:val="en-US"/>
+              </w:rPr>
+              <w:t xml:space="preserve"> </w:t>
             </w:r>
           </w:p>
           <w:p>
@@ -6724,7 +6833,8 @@
                 <w:highlight w:val="yellow"/>
                 <w:lang w:val="en-US"/>
               </w:rPr>
-              <w:t>{{extra_95}}</w:t>
+              <w:lastRenderedPageBreak/>
+              <w:t xml:space="preserve">Please detail your absence recording functionality with focus on the following: </w:t>
             </w:r>
           </w:p>
           <w:p>
@@ -6744,7 +6854,7 @@
                 <w:highlight w:val="yellow"/>
                 <w:lang w:val="en-US"/>
               </w:rPr>
-              <w:t>{{extra_96}}</w:t>
+              <w:t xml:space="preserve"> </w:t>
             </w:r>
           </w:p>
           <w:p>
@@ -6770,7 +6880,7 @@
                 <w:highlight w:val="yellow"/>
                 <w:lang w:val="en-US"/>
               </w:rPr>
-              <w:t>{{extra_97}}</w:t>
+              <w:t xml:space="preserve">How </w:t>
             </w:r>
             <w:proofErr w:type="spellStart"/>
             <w:r>
@@ -6781,6 +6891,7 @@
                 <w:highlight w:val="yellow"/>
                 <w:lang w:val="en-US"/>
               </w:rPr>
+              <w:t>customisable</w:t>
             </w:r>
             <w:proofErr w:type="spellEnd"/>
             <w:r>
@@ -6791,15 +6902,17 @@
                 <w:highlight w:val="yellow"/>
                 <w:lang w:val="en-US"/>
               </w:rPr>
-            </w:r>
-            <w:r>
-              <w:rPr>
-                <w:rFonts w:asciiTheme="majorHAnsi" w:eastAsia="Calibri" w:hAnsiTheme="majorHAnsi" w:cstheme="majorHAnsi"/>
-                <w:sz w:val="18"/>
-                <w:szCs w:val="18"/>
-                <w:highlight w:val="yellow"/>
-                <w:lang w:val="en-US"/>
-              </w:rPr>
+              <w:t xml:space="preserve"> absence recording is </w:t>
+            </w:r>
+            <w:r>
+              <w:rPr>
+                <w:rFonts w:asciiTheme="majorHAnsi" w:eastAsia="Calibri" w:hAnsiTheme="majorHAnsi" w:cstheme="majorHAnsi"/>
+                <w:sz w:val="18"/>
+                <w:szCs w:val="18"/>
+                <w:highlight w:val="yellow"/>
+                <w:lang w:val="en-US"/>
+              </w:rPr>
+              <w:t>given the above details</w:t>
             </w:r>
           </w:p>
           <w:p>
@@ -6825,7 +6938,7 @@
                 <w:highlight w:val="yellow"/>
                 <w:lang w:val="en-US"/>
               </w:rPr>
-              <w:t>{{extra_98}}</w:t>
+              <w:t xml:space="preserve">The level of complexity the system is able to manage (for example, calculating sickness absence based on entitlement which increases with service and includes 100% paid time and 50% paid time) </w:t>
             </w:r>
           </w:p>
           <w:p>
@@ -6851,116 +6964,121 @@
                 <w:highlight w:val="yellow"/>
                 <w:lang w:val="en-US"/>
               </w:rPr>
-              <w:t>{{extra_99}}</w:t>
-            </w:r>
-            <w:r>
-              <w:rPr>
-                <w:rFonts w:asciiTheme="majorHAnsi" w:eastAsia="Calibri" w:hAnsiTheme="majorHAnsi" w:cstheme="majorHAnsi"/>
-                <w:sz w:val="18"/>
-                <w:szCs w:val="18"/>
-                <w:highlight w:val="yellow"/>
-                <w:lang w:val="en-US"/>
-              </w:rPr>
-            </w:r>
-            <w:r>
-              <w:rPr>
-                <w:rFonts w:asciiTheme="majorHAnsi" w:eastAsia="Calibri" w:hAnsiTheme="majorHAnsi" w:cstheme="majorHAnsi"/>
-                <w:sz w:val="18"/>
-                <w:szCs w:val="18"/>
-                <w:highlight w:val="yellow"/>
-                <w:lang w:val="en-US"/>
-              </w:rPr>
-            </w:r>
-            <w:r>
-              <w:rPr>
-                <w:rFonts w:asciiTheme="majorHAnsi" w:eastAsia="Calibri" w:hAnsiTheme="majorHAnsi" w:cstheme="majorHAnsi"/>
-                <w:sz w:val="18"/>
-                <w:szCs w:val="18"/>
-                <w:highlight w:val="yellow"/>
-                <w:lang w:val="en-US"/>
-              </w:rPr>
-            </w:r>
-          </w:p>
-          <w:p>
-            <w:pPr>
-              <w:rPr>
-                <w:rFonts w:asciiTheme="majorHAnsi" w:eastAsia="Calibri" w:hAnsiTheme="majorHAnsi" w:cstheme="majorHAnsi"/>
-                <w:sz w:val="18"/>
-                <w:szCs w:val="18"/>
-                <w:highlight w:val="yellow"/>
-                <w:lang w:val="en-US"/>
-              </w:rPr>
-            </w:pPr>
-          </w:p>
-          <w:p>
-            <w:pPr>
-              <w:rPr>
-                <w:rFonts w:asciiTheme="majorHAnsi" w:eastAsia="Calibri" w:hAnsiTheme="majorHAnsi" w:cstheme="majorHAnsi"/>
-                <w:sz w:val="18"/>
-                <w:szCs w:val="18"/>
-                <w:highlight w:val="yellow"/>
-                <w:lang w:val="en-US"/>
-              </w:rPr>
-            </w:pPr>
-            <w:r>
-              <w:rPr>
-                <w:rFonts w:asciiTheme="majorHAnsi" w:eastAsia="Calibri" w:hAnsiTheme="majorHAnsi" w:cstheme="majorHAnsi"/>
-                <w:sz w:val="18"/>
-                <w:szCs w:val="18"/>
-                <w:highlight w:val="yellow"/>
-                <w:lang w:val="en-US"/>
-              </w:rPr>
-              <w:t>{{extra_100}}</w:t>
-            </w:r>
-          </w:p>
-          <w:p>
-            <w:pPr>
-              <w:rPr>
-                <w:rFonts w:asciiTheme="majorHAnsi" w:eastAsia="Calibri" w:hAnsiTheme="majorHAnsi" w:cstheme="majorHAnsi"/>
-                <w:sz w:val="18"/>
-                <w:szCs w:val="18"/>
-                <w:highlight w:val="yellow"/>
-                <w:lang w:val="en-US"/>
-              </w:rPr>
-            </w:pPr>
-          </w:p>
-          <w:p>
-            <w:pPr>
-              <w:rPr>
-                <w:rFonts w:asciiTheme="majorHAnsi" w:eastAsia="Calibri" w:hAnsiTheme="majorHAnsi" w:cstheme="majorHAnsi"/>
-                <w:sz w:val="18"/>
-                <w:szCs w:val="18"/>
-                <w:highlight w:val="yellow"/>
-                <w:lang w:val="en-US"/>
-              </w:rPr>
-            </w:pPr>
-            <w:r>
-              <w:rPr>
-                <w:rFonts w:asciiTheme="majorHAnsi" w:eastAsia="Calibri" w:hAnsiTheme="majorHAnsi" w:cstheme="majorHAnsi"/>
-                <w:sz w:val="18"/>
-                <w:szCs w:val="18"/>
-                <w:highlight w:val="yellow"/>
-                <w:lang w:val="en-US"/>
-              </w:rPr>
-              <w:t>{{extra_101}}</w:t>
-            </w:r>
-            <w:r>
-              <w:rPr>
-                <w:rFonts w:asciiTheme="majorHAnsi" w:eastAsia="Calibri" w:hAnsiTheme="majorHAnsi" w:cstheme="majorHAnsi"/>
-                <w:sz w:val="18"/>
-                <w:szCs w:val="18"/>
-                <w:highlight w:val="yellow"/>
-                <w:lang w:val="en-US"/>
-              </w:rPr>
-            </w:r>
-            <w:r>
-              <w:rPr>
-                <w:rFonts w:asciiTheme="majorHAnsi" w:eastAsia="Calibri" w:hAnsiTheme="majorHAnsi" w:cstheme="majorHAnsi"/>
-                <w:sz w:val="18"/>
-                <w:szCs w:val="18"/>
-                <w:highlight w:val="yellow"/>
-                <w:lang w:val="en-US"/>
-              </w:rPr>
+              <w:t>Whether absence can be recorded in hours or day</w:t>
+            </w:r>
+            <w:r>
+              <w:rPr>
+                <w:rFonts w:asciiTheme="majorHAnsi" w:eastAsia="Calibri" w:hAnsiTheme="majorHAnsi" w:cstheme="majorHAnsi"/>
+                <w:sz w:val="18"/>
+                <w:szCs w:val="18"/>
+                <w:highlight w:val="yellow"/>
+                <w:lang w:val="en-US"/>
+              </w:rPr>
+              <w:t xml:space="preserve">s, </w:t>
+            </w:r>
+            <w:r>
+              <w:rPr>
+                <w:rFonts w:asciiTheme="majorHAnsi" w:eastAsia="Calibri" w:hAnsiTheme="majorHAnsi" w:cstheme="majorHAnsi"/>
+                <w:sz w:val="18"/>
+                <w:szCs w:val="18"/>
+                <w:highlight w:val="yellow"/>
+                <w:lang w:val="en-US"/>
+              </w:rPr>
+              <w:t>if there are any limitations around this</w:t>
+            </w:r>
+            <w:r>
+              <w:rPr>
+                <w:rFonts w:asciiTheme="majorHAnsi" w:eastAsia="Calibri" w:hAnsiTheme="majorHAnsi" w:cstheme="majorHAnsi"/>
+                <w:sz w:val="18"/>
+                <w:szCs w:val="18"/>
+                <w:highlight w:val="yellow"/>
+                <w:lang w:val="en-US"/>
+              </w:rPr>
+              <w:t>, and if absence can be recorded in hours for an employee where their working pattern is calculated in days</w:t>
+            </w:r>
+          </w:p>
+          <w:p>
+            <w:pPr>
+              <w:rPr>
+                <w:rFonts w:asciiTheme="majorHAnsi" w:eastAsia="Calibri" w:hAnsiTheme="majorHAnsi" w:cstheme="majorHAnsi"/>
+                <w:sz w:val="18"/>
+                <w:szCs w:val="18"/>
+                <w:highlight w:val="yellow"/>
+                <w:lang w:val="en-US"/>
+              </w:rPr>
+            </w:pPr>
+          </w:p>
+          <w:p>
+            <w:pPr>
+              <w:rPr>
+                <w:rFonts w:asciiTheme="majorHAnsi" w:eastAsia="Calibri" w:hAnsiTheme="majorHAnsi" w:cstheme="majorHAnsi"/>
+                <w:sz w:val="18"/>
+                <w:szCs w:val="18"/>
+                <w:highlight w:val="yellow"/>
+                <w:lang w:val="en-US"/>
+              </w:rPr>
+            </w:pPr>
+            <w:r>
+              <w:rPr>
+                <w:rFonts w:asciiTheme="majorHAnsi" w:eastAsia="Calibri" w:hAnsiTheme="majorHAnsi" w:cstheme="majorHAnsi"/>
+                <w:sz w:val="18"/>
+                <w:szCs w:val="18"/>
+                <w:highlight w:val="yellow"/>
+                <w:lang w:val="en-US"/>
+              </w:rPr>
+              <w:t>Please also detail how your system would manage the following situation:</w:t>
+            </w:r>
+          </w:p>
+          <w:p>
+            <w:pPr>
+              <w:rPr>
+                <w:rFonts w:asciiTheme="majorHAnsi" w:eastAsia="Calibri" w:hAnsiTheme="majorHAnsi" w:cstheme="majorHAnsi"/>
+                <w:sz w:val="18"/>
+                <w:szCs w:val="18"/>
+                <w:highlight w:val="yellow"/>
+                <w:lang w:val="en-US"/>
+              </w:rPr>
+            </w:pPr>
+          </w:p>
+          <w:p>
+            <w:pPr>
+              <w:rPr>
+                <w:rFonts w:asciiTheme="majorHAnsi" w:eastAsia="Calibri" w:hAnsiTheme="majorHAnsi" w:cstheme="majorHAnsi"/>
+                <w:sz w:val="18"/>
+                <w:szCs w:val="18"/>
+                <w:highlight w:val="yellow"/>
+                <w:lang w:val="en-US"/>
+              </w:rPr>
+            </w:pPr>
+            <w:r>
+              <w:rPr>
+                <w:rFonts w:asciiTheme="majorHAnsi" w:eastAsia="Calibri" w:hAnsiTheme="majorHAnsi" w:cstheme="majorHAnsi"/>
+                <w:sz w:val="18"/>
+                <w:szCs w:val="18"/>
+                <w:highlight w:val="yellow"/>
+                <w:lang w:val="en-US"/>
+              </w:rPr>
+              <w:t>An employee in the UK is in their first year of service. Due to illness they took a period of 8 days sick leave after which they returned to work. One week after their return they go off on sick leave again</w:t>
+            </w:r>
+            <w:r>
+              <w:rPr>
+                <w:rFonts w:asciiTheme="majorHAnsi" w:eastAsia="Calibri" w:hAnsiTheme="majorHAnsi" w:cstheme="majorHAnsi"/>
+                <w:sz w:val="18"/>
+                <w:szCs w:val="18"/>
+                <w:highlight w:val="yellow"/>
+                <w:lang w:val="en-US"/>
+              </w:rPr>
+              <w:t xml:space="preserve"> (for the same illness)</w:t>
+            </w:r>
+            <w:r>
+              <w:rPr>
+                <w:rFonts w:asciiTheme="majorHAnsi" w:eastAsia="Calibri" w:hAnsiTheme="majorHAnsi" w:cstheme="majorHAnsi"/>
+                <w:sz w:val="18"/>
+                <w:szCs w:val="18"/>
+                <w:highlight w:val="yellow"/>
+                <w:lang w:val="en-US"/>
+              </w:rPr>
+              <w:t xml:space="preserve"> and are likely to be away from work for an extended period of time as they are due to have an operation followed by several weeks recovery. Their sickness entitlement is 10 days at full pay, 10 days at half pay, followed by SSP. We need the system to tell us:</w:t>
             </w:r>
           </w:p>
           <w:p>
@@ -6997,25 +7115,27 @@
                 <w:highlight w:val="yellow"/>
                 <w:lang w:val="en-US"/>
               </w:rPr>
-              <w:t>{{extra_102}}</w:t>
-            </w:r>
-            <w:r>
-              <w:rPr>
-                <w:rFonts w:asciiTheme="majorHAnsi" w:eastAsia="Calibri" w:hAnsiTheme="majorHAnsi" w:cstheme="majorHAnsi"/>
-                <w:sz w:val="18"/>
-                <w:szCs w:val="18"/>
-                <w:highlight w:val="yellow"/>
-                <w:lang w:val="en-US"/>
-              </w:rPr>
-            </w:r>
-            <w:r>
-              <w:rPr>
-                <w:rFonts w:asciiTheme="majorHAnsi" w:eastAsia="Calibri" w:hAnsiTheme="majorHAnsi" w:cstheme="majorHAnsi"/>
-                <w:sz w:val="18"/>
-                <w:szCs w:val="18"/>
-                <w:highlight w:val="yellow"/>
-                <w:lang w:val="en-US"/>
-              </w:rPr>
+              <w:t>On what date the</w:t>
+            </w:r>
+            <w:r>
+              <w:rPr>
+                <w:rFonts w:asciiTheme="majorHAnsi" w:eastAsia="Calibri" w:hAnsiTheme="majorHAnsi" w:cstheme="majorHAnsi"/>
+                <w:sz w:val="18"/>
+                <w:szCs w:val="18"/>
+                <w:highlight w:val="yellow"/>
+                <w:lang w:val="en-US"/>
+              </w:rPr>
+              <w:t xml:space="preserve">ir entitlement </w:t>
+            </w:r>
+            <w:r>
+              <w:rPr>
+                <w:rFonts w:asciiTheme="majorHAnsi" w:eastAsia="Calibri" w:hAnsiTheme="majorHAnsi" w:cstheme="majorHAnsi"/>
+                <w:sz w:val="18"/>
+                <w:szCs w:val="18"/>
+                <w:highlight w:val="yellow"/>
+                <w:lang w:val="en-US"/>
+              </w:rPr>
+              <w:t>will reduce to half pay</w:t>
             </w:r>
           </w:p>
           <w:p>
@@ -7041,25 +7161,27 @@
                 <w:highlight w:val="yellow"/>
                 <w:lang w:val="en-US"/>
               </w:rPr>
-              <w:t>{{extra_103}}</w:t>
-            </w:r>
-            <w:r>
-              <w:rPr>
-                <w:rFonts w:asciiTheme="majorHAnsi" w:eastAsia="Calibri" w:hAnsiTheme="majorHAnsi" w:cstheme="majorHAnsi"/>
-                <w:sz w:val="18"/>
-                <w:szCs w:val="18"/>
-                <w:highlight w:val="yellow"/>
-                <w:lang w:val="en-US"/>
-              </w:rPr>
-            </w:r>
-            <w:r>
-              <w:rPr>
-                <w:rFonts w:asciiTheme="majorHAnsi" w:eastAsia="Calibri" w:hAnsiTheme="majorHAnsi" w:cstheme="majorHAnsi"/>
-                <w:sz w:val="18"/>
-                <w:szCs w:val="18"/>
-                <w:highlight w:val="yellow"/>
-                <w:lang w:val="en-US"/>
-              </w:rPr>
+              <w:t>On what date th</w:t>
+            </w:r>
+            <w:r>
+              <w:rPr>
+                <w:rFonts w:asciiTheme="majorHAnsi" w:eastAsia="Calibri" w:hAnsiTheme="majorHAnsi" w:cstheme="majorHAnsi"/>
+                <w:sz w:val="18"/>
+                <w:szCs w:val="18"/>
+                <w:highlight w:val="yellow"/>
+                <w:lang w:val="en-US"/>
+              </w:rPr>
+              <w:t xml:space="preserve">eir entitlement </w:t>
+            </w:r>
+            <w:r>
+              <w:rPr>
+                <w:rFonts w:asciiTheme="majorHAnsi" w:eastAsia="Calibri" w:hAnsiTheme="majorHAnsi" w:cstheme="majorHAnsi"/>
+                <w:sz w:val="18"/>
+                <w:szCs w:val="18"/>
+                <w:highlight w:val="yellow"/>
+                <w:lang w:val="en-US"/>
+              </w:rPr>
+              <w:t>will reduce to SSP only</w:t>
             </w:r>
           </w:p>
           <w:p>
@@ -7085,7 +7207,7 @@
                 <w:highlight w:val="yellow"/>
                 <w:lang w:val="en-US"/>
               </w:rPr>
-              <w:t>{{extra_104}}</w:t>
+              <w:t>On what date SSP will stop (if the absence continues)</w:t>
             </w:r>
           </w:p>
           <w:p>
@@ -7118,16 +7240,17 @@
                 <w:highlight w:val="yellow"/>
                 <w:lang w:val="en-US"/>
               </w:rPr>
-              <w:t>{{extra_105}}</w:t>
-            </w:r>
-            <w:r>
-              <w:rPr>
-                <w:rFonts w:asciiTheme="majorHAnsi" w:eastAsia="Calibri" w:hAnsiTheme="majorHAnsi" w:cstheme="majorHAnsi"/>
-                <w:sz w:val="18"/>
-                <w:szCs w:val="18"/>
-                <w:highlight w:val="yellow"/>
-                <w:lang w:val="en-US"/>
-              </w:rPr>
+              <w:t xml:space="preserve">Accessibility </w:t>
+            </w:r>
+            <w:r>
+              <w:rPr>
+                <w:rFonts w:asciiTheme="majorHAnsi" w:eastAsia="Calibri" w:hAnsiTheme="majorHAnsi" w:cstheme="majorHAnsi"/>
+                <w:sz w:val="18"/>
+                <w:szCs w:val="18"/>
+                <w:highlight w:val="yellow"/>
+                <w:lang w:val="en-US"/>
+              </w:rPr>
+              <w:t xml:space="preserve"> </w:t>
             </w:r>
           </w:p>
           <w:p>
@@ -7147,7 +7270,7 @@
                 <w:highlight w:val="yellow"/>
                 <w:lang w:val="en-US"/>
               </w:rPr>
-              <w:t>{{extra_106}}</w:t>
+              <w:t xml:space="preserve">The system should be easily accessible by our employees remotely, using any type of device.  Please detail how the system can be accessed including: </w:t>
             </w:r>
           </w:p>
           <w:p>
@@ -7167,7 +7290,7 @@
                 <w:highlight w:val="yellow"/>
                 <w:lang w:val="en-US"/>
               </w:rPr>
-              <w:t>{{extra_107}}</w:t>
+              <w:t xml:space="preserve"> </w:t>
             </w:r>
           </w:p>
           <w:p>
@@ -7193,7 +7316,7 @@
                 <w:highlight w:val="yellow"/>
                 <w:lang w:val="en-US"/>
               </w:rPr>
-              <w:t>{{extra_108}}</w:t>
+              <w:t xml:space="preserve">Whether the system is cloud-based  </w:t>
             </w:r>
           </w:p>
           <w:p>
@@ -7219,7 +7342,7 @@
                 <w:highlight w:val="yellow"/>
                 <w:lang w:val="en-US"/>
               </w:rPr>
-              <w:t>{{extra_109}}</w:t>
+              <w:t>Whether the system website is optimized for mobile use (please provide screenshot)</w:t>
             </w:r>
           </w:p>
           <w:p>
@@ -7245,7 +7368,7 @@
                 <w:highlight w:val="yellow"/>
                 <w:lang w:val="en-US"/>
               </w:rPr>
-              <w:t>{{extra_110}}</w:t>
+              <w:t xml:space="preserve">Whether an app is available for use on Apple and Android devices </w:t>
             </w:r>
           </w:p>
           <w:p>
@@ -7278,48 +7401,49 @@
                 <w:highlight w:val="yellow"/>
                 <w:lang w:val="en-US"/>
               </w:rPr>
-              <w:t>{{extra_111}}</w:t>
-            </w:r>
-            <w:r>
-              <w:rPr>
-                <w:rFonts w:asciiTheme="majorHAnsi" w:eastAsia="Calibri" w:hAnsiTheme="majorHAnsi" w:cstheme="majorHAnsi"/>
-                <w:sz w:val="18"/>
-                <w:szCs w:val="18"/>
-                <w:highlight w:val="yellow"/>
-                <w:lang w:val="en-US"/>
-              </w:rPr>
-            </w:r>
-          </w:p>
-          <w:p>
-            <w:pPr>
-              <w:rPr>
-                <w:rFonts w:asciiTheme="majorHAnsi" w:eastAsia="Calibri" w:hAnsiTheme="majorHAnsi" w:cstheme="majorHAnsi"/>
-                <w:sz w:val="18"/>
-                <w:szCs w:val="18"/>
-                <w:highlight w:val="yellow"/>
-                <w:lang w:val="en-US"/>
-              </w:rPr>
-            </w:pPr>
-          </w:p>
-          <w:p>
-            <w:pPr>
-              <w:rPr>
-                <w:rFonts w:asciiTheme="majorHAnsi" w:eastAsia="Calibri" w:hAnsiTheme="majorHAnsi" w:cstheme="majorHAnsi"/>
-                <w:sz w:val="18"/>
-                <w:szCs w:val="18"/>
-                <w:highlight w:val="yellow"/>
-                <w:lang w:val="en-US"/>
-              </w:rPr>
-            </w:pPr>
-            <w:r>
-              <w:rPr>
-                <w:rFonts w:asciiTheme="majorHAnsi" w:eastAsia="Calibri" w:hAnsiTheme="majorHAnsi" w:cstheme="majorHAnsi"/>
-                <w:sz w:val="18"/>
-                <w:szCs w:val="18"/>
-                <w:highlight w:val="yellow"/>
-                <w:lang w:val="en-US"/>
-              </w:rPr>
-              <w:t>{{extra_112}}</w:t>
+              <w:t>In case an app is available, what functionality does it have (is it limited compared to accessing via the website)?</w:t>
+            </w:r>
+            <w:r>
+              <w:rPr>
+                <w:rFonts w:asciiTheme="majorHAnsi" w:eastAsia="Calibri" w:hAnsiTheme="majorHAnsi" w:cstheme="majorHAnsi"/>
+                <w:sz w:val="18"/>
+                <w:szCs w:val="18"/>
+                <w:highlight w:val="yellow"/>
+                <w:lang w:val="en-US"/>
+              </w:rPr>
+              <w:t xml:space="preserve"> Please provide screenshot.</w:t>
+            </w:r>
+          </w:p>
+          <w:p>
+            <w:pPr>
+              <w:rPr>
+                <w:rFonts w:asciiTheme="majorHAnsi" w:eastAsia="Calibri" w:hAnsiTheme="majorHAnsi" w:cstheme="majorHAnsi"/>
+                <w:sz w:val="18"/>
+                <w:szCs w:val="18"/>
+                <w:highlight w:val="yellow"/>
+                <w:lang w:val="en-US"/>
+              </w:rPr>
+            </w:pPr>
+          </w:p>
+          <w:p>
+            <w:pPr>
+              <w:rPr>
+                <w:rFonts w:asciiTheme="majorHAnsi" w:eastAsia="Calibri" w:hAnsiTheme="majorHAnsi" w:cstheme="majorHAnsi"/>
+                <w:sz w:val="18"/>
+                <w:szCs w:val="18"/>
+                <w:highlight w:val="yellow"/>
+                <w:lang w:val="en-US"/>
+              </w:rPr>
+            </w:pPr>
+            <w:r>
+              <w:rPr>
+                <w:rFonts w:asciiTheme="majorHAnsi" w:eastAsia="Calibri" w:hAnsiTheme="majorHAnsi" w:cstheme="majorHAnsi"/>
+                <w:sz w:val="18"/>
+                <w:szCs w:val="18"/>
+                <w:highlight w:val="yellow"/>
+                <w:lang w:val="en-US"/>
+              </w:rPr>
+              <w:t xml:space="preserve">In addition, it is a requirement that data is well protected by User Permissions which must also be easy to set up, use and </w:t>
             </w:r>
             <w:proofErr w:type="spellStart"/>
             <w:r>
@@ -7330,6 +7454,7 @@
                 <w:highlight w:val="yellow"/>
                 <w:lang w:val="en-US"/>
               </w:rPr>
+              <w:t>customise</w:t>
             </w:r>
             <w:proofErr w:type="spellEnd"/>
             <w:r>
@@ -7340,6 +7465,7 @@
                 <w:highlight w:val="yellow"/>
                 <w:lang w:val="en-US"/>
               </w:rPr>
+              <w:t xml:space="preserve"> in the system so we can give different permission levels to different groups of people (in addition to standard employees / managers / HR admin). For example:</w:t>
             </w:r>
           </w:p>
           <w:p>
@@ -7376,7 +7502,7 @@
                 <w:highlight w:val="yellow"/>
                 <w:lang w:val="en-US"/>
               </w:rPr>
-              <w:t>{{extra_113}}</w:t>
+              <w:t>Our admin team need access to passport details, contact numbers and home addresses</w:t>
             </w:r>
           </w:p>
           <w:p>
@@ -7402,7 +7528,7 @@
                 <w:highlight w:val="yellow"/>
                 <w:lang w:val="en-US"/>
               </w:rPr>
-              <w:t>{{extra_114}}</w:t>
+              <w:t xml:space="preserve">Our IT team need access to home addresses </w:t>
             </w:r>
           </w:p>
           <w:p>
@@ -7428,48 +7554,49 @@
                 <w:highlight w:val="yellow"/>
                 <w:lang w:val="en-US"/>
               </w:rPr>
-              <w:t>{{extra_115}}</w:t>
-            </w:r>
-          </w:p>
-          <w:p>
-            <w:pPr>
-              <w:rPr>
-                <w:rFonts w:asciiTheme="majorHAnsi" w:eastAsia="Calibri" w:hAnsiTheme="majorHAnsi" w:cstheme="majorHAnsi"/>
-                <w:sz w:val="18"/>
-                <w:szCs w:val="18"/>
-                <w:highlight w:val="yellow"/>
-                <w:lang w:val="en-US"/>
-              </w:rPr>
-            </w:pPr>
-          </w:p>
-          <w:p>
-            <w:pPr>
-              <w:rPr>
-                <w:rFonts w:asciiTheme="majorHAnsi" w:eastAsia="Calibri" w:hAnsiTheme="majorHAnsi" w:cstheme="majorHAnsi"/>
-                <w:sz w:val="18"/>
-                <w:szCs w:val="18"/>
-                <w:highlight w:val="yellow"/>
-                <w:lang w:val="en-US"/>
-              </w:rPr>
-            </w:pPr>
-            <w:r>
-              <w:rPr>
-                <w:rFonts w:asciiTheme="majorHAnsi" w:eastAsia="Calibri" w:hAnsiTheme="majorHAnsi" w:cstheme="majorHAnsi"/>
-                <w:sz w:val="18"/>
-                <w:szCs w:val="18"/>
-                <w:highlight w:val="yellow"/>
-                <w:lang w:val="en-US"/>
-              </w:rPr>
-              <w:t>{{extra_116}}</w:t>
-            </w:r>
-            <w:r>
-              <w:rPr>
-                <w:rFonts w:asciiTheme="majorHAnsi" w:eastAsia="Calibri" w:hAnsiTheme="majorHAnsi" w:cstheme="majorHAnsi"/>
-                <w:sz w:val="18"/>
-                <w:szCs w:val="18"/>
-                <w:highlight w:val="yellow"/>
-                <w:lang w:val="en-US"/>
-              </w:rPr>
+              <w:t>Our training team need access to training records</w:t>
+            </w:r>
+          </w:p>
+          <w:p>
+            <w:pPr>
+              <w:rPr>
+                <w:rFonts w:asciiTheme="majorHAnsi" w:eastAsia="Calibri" w:hAnsiTheme="majorHAnsi" w:cstheme="majorHAnsi"/>
+                <w:sz w:val="18"/>
+                <w:szCs w:val="18"/>
+                <w:highlight w:val="yellow"/>
+                <w:lang w:val="en-US"/>
+              </w:rPr>
+            </w:pPr>
+          </w:p>
+          <w:p>
+            <w:pPr>
+              <w:rPr>
+                <w:rFonts w:asciiTheme="majorHAnsi" w:eastAsia="Calibri" w:hAnsiTheme="majorHAnsi" w:cstheme="majorHAnsi"/>
+                <w:sz w:val="18"/>
+                <w:szCs w:val="18"/>
+                <w:highlight w:val="yellow"/>
+                <w:lang w:val="en-US"/>
+              </w:rPr>
+            </w:pPr>
+            <w:r>
+              <w:rPr>
+                <w:rFonts w:asciiTheme="majorHAnsi" w:eastAsia="Calibri" w:hAnsiTheme="majorHAnsi" w:cstheme="majorHAnsi"/>
+                <w:sz w:val="18"/>
+                <w:szCs w:val="18"/>
+                <w:highlight w:val="yellow"/>
+                <w:lang w:val="en-US"/>
+              </w:rPr>
+              <w:t>Does your system allow us to define an unlimited and bespoke set of User Permissions for different types of users who need to be allowed to see and do different things in the system? Please explain how this works in your system and how easy it is to set up</w:t>
+            </w:r>
+            <w:r>
+              <w:rPr>
+                <w:rFonts w:asciiTheme="majorHAnsi" w:eastAsia="Calibri" w:hAnsiTheme="majorHAnsi" w:cstheme="majorHAnsi"/>
+                <w:sz w:val="18"/>
+                <w:szCs w:val="18"/>
+                <w:highlight w:val="yellow"/>
+                <w:lang w:val="en-US"/>
+              </w:rPr>
+              <w:t>.</w:t>
             </w:r>
           </w:p>
           <w:p>
@@ -7501,7 +7628,7 @@
                 <w:highlight w:val="yellow"/>
                 <w:lang w:val="en-US"/>
               </w:rPr>
-              <w:t>{{extra_117}}</w:t>
+              <w:t>Employee Engagement</w:t>
             </w:r>
           </w:p>
           <w:p>
@@ -7521,43 +7648,47 @@
                 <w:highlight w:val="yellow"/>
                 <w:lang w:val="en-US"/>
               </w:rPr>
-              <w:t>{{extra_118}}</w:t>
-            </w:r>
-            <w:r>
-              <w:rPr>
-                <w:rFonts w:asciiTheme="majorHAnsi" w:eastAsia="Calibri" w:hAnsiTheme="majorHAnsi" w:cstheme="majorHAnsi"/>
-                <w:sz w:val="18"/>
-                <w:szCs w:val="18"/>
-                <w:highlight w:val="yellow"/>
-                <w:lang w:val="en-US"/>
-              </w:rPr>
-            </w:r>
-            <w:r>
-              <w:rPr>
-                <w:rFonts w:asciiTheme="majorHAnsi" w:eastAsia="Calibri" w:hAnsiTheme="majorHAnsi" w:cstheme="majorHAnsi"/>
-                <w:sz w:val="18"/>
-                <w:szCs w:val="18"/>
-                <w:highlight w:val="yellow"/>
-                <w:lang w:val="en-US"/>
-              </w:rPr>
-            </w:r>
-            <w:r>
-              <w:rPr>
-                <w:rFonts w:asciiTheme="majorHAnsi" w:eastAsia="Calibri" w:hAnsiTheme="majorHAnsi" w:cstheme="majorHAnsi"/>
-                <w:sz w:val="18"/>
-                <w:szCs w:val="18"/>
-                <w:highlight w:val="yellow"/>
-                <w:lang w:val="en-US"/>
-              </w:rPr>
-            </w:r>
-            <w:r>
-              <w:rPr>
-                <w:rFonts w:asciiTheme="majorHAnsi" w:eastAsia="Calibri" w:hAnsiTheme="majorHAnsi" w:cstheme="majorHAnsi"/>
-                <w:sz w:val="18"/>
-                <w:szCs w:val="18"/>
-                <w:highlight w:val="yellow"/>
-                <w:lang w:val="en-US"/>
-              </w:rPr>
+              <w:t xml:space="preserve">Ideally, we would like to have easy ways of getting quick feedback from employees – for example through ad-hoc short polls or ‘how are you feeling today’ options. </w:t>
+            </w:r>
+            <w:r>
+              <w:rPr>
+                <w:rFonts w:asciiTheme="majorHAnsi" w:eastAsia="Calibri" w:hAnsiTheme="majorHAnsi" w:cstheme="majorHAnsi"/>
+                <w:sz w:val="18"/>
+                <w:szCs w:val="18"/>
+                <w:highlight w:val="yellow"/>
+                <w:lang w:val="en-US"/>
+              </w:rPr>
+              <w:t xml:space="preserve"> </w:t>
+            </w:r>
+            <w:r>
+              <w:rPr>
+                <w:rFonts w:asciiTheme="majorHAnsi" w:eastAsia="Calibri" w:hAnsiTheme="majorHAnsi" w:cstheme="majorHAnsi"/>
+                <w:sz w:val="18"/>
+                <w:szCs w:val="18"/>
+                <w:highlight w:val="yellow"/>
+                <w:lang w:val="en-US"/>
+              </w:rPr>
+              <w:t>In addition, options for employee recognition would be a nice to have – for example, being able to say ‘thank you’ to a peer or team member via the system. Please detail whether you offer any functionality around employee engagement</w:t>
+            </w:r>
+            <w:r>
+              <w:rPr>
+                <w:rFonts w:asciiTheme="majorHAnsi" w:eastAsia="Calibri" w:hAnsiTheme="majorHAnsi" w:cstheme="majorHAnsi"/>
+                <w:sz w:val="18"/>
+                <w:szCs w:val="18"/>
+                <w:highlight w:val="yellow"/>
+                <w:lang w:val="en-US"/>
+              </w:rPr>
+              <w:t xml:space="preserve"> as above</w:t>
+            </w:r>
+            <w:r>
+              <w:rPr>
+                <w:rFonts w:asciiTheme="majorHAnsi" w:eastAsia="Calibri" w:hAnsiTheme="majorHAnsi" w:cstheme="majorHAnsi"/>
+                <w:sz w:val="18"/>
+                <w:szCs w:val="18"/>
+                <w:highlight w:val="yellow"/>
+                <w:lang w:val="en-US"/>
+              </w:rPr>
+              <w:t xml:space="preserve"> and what this entails.</w:t>
             </w:r>
           </w:p>
           <w:p>
@@ -7596,7 +7727,7 @@
                 <w:highlight w:val="yellow"/>
                 <w:lang w:val="en-US"/>
               </w:rPr>
-              <w:t>{{extra_119}}</w:t>
+              <w:t>Evaluation aspects</w:t>
             </w:r>
           </w:p>
           <w:p>
@@ -7621,7 +7752,7 @@
                 <w:highlight w:val="yellow"/>
                 <w:lang w:val="en-US"/>
               </w:rPr>
-              <w:t>{{extra_120}}</w:t>
+              <w:t>For each category, the evaluation team will assess how closely the system meets</w:t>
             </w:r>
             <w:r>
               <w:rPr>
@@ -7633,6 +7764,7 @@
                 <w:highlight w:val="yellow"/>
                 <w:lang w:val="en-US"/>
               </w:rPr>
+              <w:t xml:space="preserve"> each of</w:t>
             </w:r>
             <w:r>
               <w:rPr>
@@ -7644,6 +7776,7 @@
                 <w:highlight w:val="yellow"/>
                 <w:lang w:val="en-US"/>
               </w:rPr>
+              <w:t xml:space="preserve"> the criteria specified</w:t>
             </w:r>
             <w:r>
               <w:rPr>
@@ -7655,6 +7788,7 @@
                 <w:highlight w:val="yellow"/>
                 <w:lang w:val="en-US"/>
               </w:rPr>
+              <w:t xml:space="preserve"> and to what extent </w:t>
             </w:r>
             <w:r>
               <w:rPr>
@@ -7666,6 +7800,7 @@
                 <w:highlight w:val="yellow"/>
                 <w:lang w:val="en-US"/>
               </w:rPr>
+              <w:t>any additional</w:t>
             </w:r>
             <w:r>
               <w:rPr>
@@ -7677,6 +7812,7 @@
                 <w:highlight w:val="yellow"/>
                 <w:lang w:val="en-US"/>
               </w:rPr>
+              <w:t xml:space="preserve"> functionality adds value.</w:t>
             </w:r>
             <w:r>
               <w:rPr>
@@ -7688,6 +7824,7 @@
                 <w:highlight w:val="yellow"/>
                 <w:lang w:val="en-US"/>
               </w:rPr>
+              <w:t xml:space="preserve"> Higher points will be awarded to those who are able to </w:t>
             </w:r>
             <w:r>
               <w:rPr>
@@ -7699,6 +7836,7 @@
                 <w:highlight w:val="yellow"/>
                 <w:lang w:val="en-US"/>
               </w:rPr>
+              <w:t>show that they are a close match to or</w:t>
             </w:r>
             <w:r>
               <w:rPr>
@@ -7710,6 +7848,7 @@
                 <w:highlight w:val="yellow"/>
                 <w:lang w:val="en-US"/>
               </w:rPr>
+              <w:t xml:space="preserve"> exceed requirements for </w:t>
             </w:r>
             <w:r>
               <w:rPr>
@@ -7721,6 +7860,7 @@
                 <w:highlight w:val="yellow"/>
                 <w:lang w:val="en-US"/>
               </w:rPr>
+              <w:t>that</w:t>
             </w:r>
             <w:r>
               <w:rPr>
@@ -7732,6 +7872,7 @@
                 <w:highlight w:val="yellow"/>
                 <w:lang w:val="en-US"/>
               </w:rPr>
+              <w:t xml:space="preserve"> category</w:t>
             </w:r>
             <w:r>
               <w:rPr>
@@ -7743,6 +7884,7 @@
                 <w:highlight w:val="yellow"/>
                 <w:lang w:val="en-US"/>
               </w:rPr>
+              <w:t>.</w:t>
             </w:r>
             <w:r>
               <w:rPr>
@@ -7754,6 +7896,7 @@
                 <w:highlight w:val="yellow"/>
                 <w:lang w:val="en-US"/>
               </w:rPr>
+              <w:t xml:space="preserve"> The first six categories will each be allocated 15% of the total score available</w:t>
             </w:r>
             <w:r>
               <w:rPr>
@@ -7765,6 +7908,7 @@
                 <w:highlight w:val="yellow"/>
                 <w:lang w:val="en-US"/>
               </w:rPr>
+              <w:t xml:space="preserve"> in Q1</w:t>
             </w:r>
             <w:r>
               <w:rPr>
@@ -7776,6 +7920,7 @@
                 <w:highlight w:val="yellow"/>
                 <w:lang w:val="en-US"/>
               </w:rPr>
+              <w:t>; the remaining two categories (Accessibility and Employee Engagement) will each be allocated a maximum of 5% of the total score</w:t>
             </w:r>
             <w:r>
               <w:rPr>
@@ -7787,6 +7932,7 @@
                 <w:highlight w:val="yellow"/>
                 <w:lang w:val="en-US"/>
               </w:rPr>
+              <w:t xml:space="preserve"> available in Q1</w:t>
             </w:r>
             <w:r>
               <w:rPr>
@@ -7798,6 +7944,7 @@
                 <w:highlight w:val="yellow"/>
                 <w:lang w:val="en-US"/>
               </w:rPr>
+              <w:t xml:space="preserve">. </w:t>
             </w:r>
           </w:p>
           <w:p>
@@ -7834,7 +7981,7 @@
                 <w:highlight w:val="yellow"/>
                 <w:lang w:val="en-US"/>
               </w:rPr>
-              <w:t>{{extra_121}}</w:t>
+              <w:t xml:space="preserve">Feedback from the system demonstration to the working group following submission of the RFQ will be used to verify the scoring from the initial evaluation of </w:t>
             </w:r>
             <w:r>
               <w:rPr>
@@ -7846,6 +7993,7 @@
                 <w:highlight w:val="yellow"/>
                 <w:lang w:val="en-US"/>
               </w:rPr>
+              <w:t>this question</w:t>
             </w:r>
             <w:r>
               <w:rPr>
@@ -7857,6 +8005,7 @@
                 <w:highlight w:val="yellow"/>
                 <w:lang w:val="en-US"/>
               </w:rPr>
+              <w:t xml:space="preserve"> (see section 6).</w:t>
             </w:r>
           </w:p>
           <w:p>
@@ -7876,7 +8025,7 @@
                 <w:highlight w:val="yellow"/>
                 <w:lang w:val="en-US"/>
               </w:rPr>
-              <w:t>{{extra_122}}</w:t>
+              <w:t xml:space="preserve"> </w:t>
             </w:r>
           </w:p>
         </w:tc>
@@ -7920,7 +8069,8 @@
                 <w:highlight w:val="yellow"/>
                 <w:lang w:val="en-US"/>
               </w:rPr>
-              <w:t>{{extra_123}}</w:t>
+              <w:lastRenderedPageBreak/>
+              <w:t xml:space="preserve">Weighting: </w:t>
             </w:r>
             <w:r>
               <w:rPr>
@@ -7933,6 +8083,7 @@
                 <w:highlight w:val="yellow"/>
                 <w:lang w:val="en-US"/>
               </w:rPr>
+              <w:t>50%</w:t>
             </w:r>
           </w:p>
           <w:p>
@@ -7954,7 +8105,7 @@
                 <w:highlight w:val="yellow"/>
                 <w:lang w:val="en-US"/>
               </w:rPr>
-              <w:t>{{extra_124}}</w:t>
+              <w:t xml:space="preserve"> </w:t>
             </w:r>
           </w:p>
         </w:tc>
@@ -7997,7 +8148,8 @@
                 <w:szCs w:val="18"/>
                 <w:highlight w:val="yellow"/>
               </w:rPr>
-              <w:t>{{extra_125}}</w:t>
+              <w:lastRenderedPageBreak/>
+              <w:t>Q2 – Technical Support &amp; Reliability</w:t>
             </w:r>
           </w:p>
           <w:p>
@@ -8018,7 +8170,7 @@
                 <w:szCs w:val="18"/>
                 <w:highlight w:val="yellow"/>
               </w:rPr>
-              <w:t>{{extra_126}}</w:t>
+              <w:t xml:space="preserve"> </w:t>
             </w:r>
           </w:p>
         </w:tc>
@@ -8060,7 +8212,7 @@
                 <w:highlight w:val="yellow"/>
                 <w:lang w:val="en-US"/>
               </w:rPr>
-              <w:t>{{extra_127}}</w:t>
+              <w:t xml:space="preserve"> </w:t>
             </w:r>
           </w:p>
           <w:p>
@@ -8082,16 +8234,17 @@
                 <w:highlight w:val="yellow"/>
                 <w:lang w:val="en-US"/>
               </w:rPr>
-              <w:t>{{extra_128}}</w:t>
-            </w:r>
-            <w:r>
-              <w:rPr>
-                <w:rFonts w:asciiTheme="majorHAnsi" w:eastAsia="Calibri" w:hAnsiTheme="majorHAnsi" w:cstheme="majorHAnsi"/>
-                <w:sz w:val="18"/>
-                <w:szCs w:val="18"/>
-                <w:highlight w:val="yellow"/>
-                <w:lang w:val="en-US"/>
-              </w:rPr>
+              <w:t>Implementation</w:t>
+            </w:r>
+            <w:r>
+              <w:rPr>
+                <w:rFonts w:asciiTheme="majorHAnsi" w:eastAsia="Calibri" w:hAnsiTheme="majorHAnsi" w:cstheme="majorHAnsi"/>
+                <w:sz w:val="18"/>
+                <w:szCs w:val="18"/>
+                <w:highlight w:val="yellow"/>
+                <w:lang w:val="en-US"/>
+              </w:rPr>
+              <w:t xml:space="preserve"> </w:t>
             </w:r>
           </w:p>
           <w:p>
@@ -8111,7 +8264,7 @@
                 <w:highlight w:val="yellow"/>
                 <w:lang w:val="en-US"/>
               </w:rPr>
-              <w:t>{{extra_129}}</w:t>
+              <w:t>Please provide details on your implementation process, ensuring that the following points are covered:</w:t>
             </w:r>
           </w:p>
           <w:p>
@@ -8131,7 +8284,7 @@
                 <w:highlight w:val="yellow"/>
                 <w:lang w:val="en-US"/>
               </w:rPr>
-              <w:t>{{extra_130}}</w:t>
+              <w:t xml:space="preserve"> </w:t>
             </w:r>
           </w:p>
           <w:p>
@@ -8157,7 +8310,7 @@
                 <w:highlight w:val="yellow"/>
                 <w:lang w:val="en-US"/>
               </w:rPr>
-              <w:t>{{extra_131}}</w:t>
+              <w:t xml:space="preserve">Whether the person leading the implementation will have experience of successfully implementing your system in other </w:t>
             </w:r>
             <w:proofErr w:type="spellStart"/>
             <w:r>
@@ -8168,6 +8321,7 @@
                 <w:highlight w:val="yellow"/>
                 <w:lang w:val="en-US"/>
               </w:rPr>
+              <w:t>organisations</w:t>
             </w:r>
             <w:proofErr w:type="spellEnd"/>
             <w:r>
@@ -8178,6 +8332,7 @@
                 <w:highlight w:val="yellow"/>
                 <w:lang w:val="en-US"/>
               </w:rPr>
+              <w:t xml:space="preserve"> </w:t>
             </w:r>
           </w:p>
           <w:p>
@@ -8203,7 +8358,7 @@
                 <w:highlight w:val="yellow"/>
                 <w:lang w:val="en-US"/>
               </w:rPr>
-              <w:t>{{extra_132}}</w:t>
+              <w:t xml:space="preserve">To what extent the process is managed by you and how much involvement you will require from GÉANT </w:t>
             </w:r>
           </w:p>
           <w:p>
@@ -8229,7 +8384,7 @@
                 <w:highlight w:val="yellow"/>
                 <w:lang w:val="en-US"/>
               </w:rPr>
-              <w:t>{{extra_133}}</w:t>
+              <w:t xml:space="preserve">How data is transferred from our current system to yours </w:t>
             </w:r>
           </w:p>
           <w:p>
@@ -8255,7 +8410,7 @@
                 <w:highlight w:val="yellow"/>
                 <w:lang w:val="en-US"/>
               </w:rPr>
-              <w:t>{{extra_134}}</w:t>
+              <w:t xml:space="preserve">The amount of training included in the implementation package </w:t>
             </w:r>
           </w:p>
           <w:p>
@@ -8281,7 +8436,7 @@
                 <w:highlight w:val="yellow"/>
                 <w:lang w:val="en-US"/>
               </w:rPr>
-              <w:t>{{extra_135}}</w:t>
+              <w:t xml:space="preserve">Will we have one point of contact during the implementation period? </w:t>
             </w:r>
           </w:p>
           <w:p>
@@ -8307,7 +8462,7 @@
                 <w:highlight w:val="yellow"/>
                 <w:lang w:val="en-US"/>
               </w:rPr>
-              <w:t>{{extra_136}}</w:t>
+              <w:t>The average length of time for a successful system implementation</w:t>
             </w:r>
           </w:p>
           <w:p>
@@ -8328,7 +8483,7 @@
                 <w:highlight w:val="yellow"/>
                 <w:lang w:val="en-US"/>
               </w:rPr>
-              <w:t>{{extra_137}}</w:t>
+              <w:t xml:space="preserve"> </w:t>
             </w:r>
           </w:p>
           <w:p>
@@ -8350,16 +8505,17 @@
                 <w:highlight w:val="yellow"/>
                 <w:lang w:val="en-US"/>
               </w:rPr>
-              <w:t>{{extra_138}}</w:t>
-            </w:r>
-            <w:r>
-              <w:rPr>
-                <w:rFonts w:asciiTheme="majorHAnsi" w:eastAsia="Calibri" w:hAnsiTheme="majorHAnsi" w:cstheme="majorHAnsi"/>
-                <w:sz w:val="18"/>
-                <w:szCs w:val="18"/>
-                <w:highlight w:val="yellow"/>
-                <w:lang w:val="en-US"/>
-              </w:rPr>
+              <w:t>Day to day support</w:t>
+            </w:r>
+            <w:r>
+              <w:rPr>
+                <w:rFonts w:asciiTheme="majorHAnsi" w:eastAsia="Calibri" w:hAnsiTheme="majorHAnsi" w:cstheme="majorHAnsi"/>
+                <w:sz w:val="18"/>
+                <w:szCs w:val="18"/>
+                <w:highlight w:val="yellow"/>
+                <w:lang w:val="en-US"/>
+              </w:rPr>
+              <w:t xml:space="preserve"> </w:t>
             </w:r>
           </w:p>
           <w:p>
@@ -8379,7 +8535,7 @@
                 <w:highlight w:val="yellow"/>
                 <w:lang w:val="en-US"/>
               </w:rPr>
-              <w:t>{{extra_139}}</w:t>
+              <w:t xml:space="preserve">We require easily accessible support during normal business hours in both the UK and NL and a quick resolution time for any issues that arise.   </w:t>
             </w:r>
           </w:p>
           <w:p>
@@ -8399,7 +8555,7 @@
                 <w:highlight w:val="yellow"/>
                 <w:lang w:val="en-US"/>
               </w:rPr>
-              <w:t>{{extra_140}}</w:t>
+              <w:t xml:space="preserve"> </w:t>
             </w:r>
           </w:p>
           <w:p>
@@ -8425,7 +8581,7 @@
                 <w:highlight w:val="yellow"/>
                 <w:lang w:val="en-US"/>
               </w:rPr>
-              <w:t>{{extra_141}}</w:t>
+              <w:t xml:space="preserve">What support options do you offer and what are the operating hours?  </w:t>
             </w:r>
           </w:p>
           <w:p>
@@ -8451,7 +8607,7 @@
                 <w:highlight w:val="yellow"/>
                 <w:lang w:val="en-US"/>
               </w:rPr>
-              <w:t>{{extra_142}}</w:t>
+              <w:t>Do you offer any help options directly from the system for users?</w:t>
             </w:r>
           </w:p>
           <w:p>
@@ -8477,7 +8633,7 @@
                 <w:highlight w:val="yellow"/>
                 <w:lang w:val="en-US"/>
               </w:rPr>
-              <w:t>{{extra_143}}</w:t>
+              <w:t xml:space="preserve">Is the cost of support included in your quoted prices?  </w:t>
             </w:r>
           </w:p>
           <w:p>
@@ -8503,7 +8659,7 @@
                 <w:highlight w:val="yellow"/>
                 <w:lang w:val="en-US"/>
               </w:rPr>
-              <w:t>{{extra_144}}</w:t>
+              <w:t xml:space="preserve">Will we have a dedicated account manager?  </w:t>
             </w:r>
           </w:p>
           <w:p>
@@ -8529,7 +8685,7 @@
                 <w:highlight w:val="yellow"/>
                 <w:lang w:val="en-US"/>
               </w:rPr>
-              <w:t>{{extra_145}}</w:t>
+              <w:t xml:space="preserve">Please describe your workflow escalation process. </w:t>
             </w:r>
           </w:p>
           <w:p>
@@ -8549,7 +8705,7 @@
                 <w:highlight w:val="yellow"/>
                 <w:lang w:val="en-US"/>
               </w:rPr>
-              <w:t>{{extra_146}}</w:t>
+              <w:t xml:space="preserve"> </w:t>
             </w:r>
           </w:p>
           <w:p>
@@ -8571,16 +8727,17 @@
                 <w:highlight w:val="yellow"/>
                 <w:lang w:val="en-US"/>
               </w:rPr>
-              <w:t>{{extra_147}}</w:t>
-            </w:r>
-            <w:r>
-              <w:rPr>
-                <w:rFonts w:asciiTheme="majorHAnsi" w:eastAsia="Calibri" w:hAnsiTheme="majorHAnsi" w:cstheme="majorHAnsi"/>
-                <w:sz w:val="18"/>
-                <w:szCs w:val="18"/>
-                <w:highlight w:val="yellow"/>
-                <w:lang w:val="en-US"/>
-              </w:rPr>
+              <w:t>System reliability &amp; recovery</w:t>
+            </w:r>
+            <w:r>
+              <w:rPr>
+                <w:rFonts w:asciiTheme="majorHAnsi" w:eastAsia="Calibri" w:hAnsiTheme="majorHAnsi" w:cstheme="majorHAnsi"/>
+                <w:sz w:val="18"/>
+                <w:szCs w:val="18"/>
+                <w:highlight w:val="yellow"/>
+                <w:lang w:val="en-US"/>
+              </w:rPr>
+              <w:t xml:space="preserve"> </w:t>
             </w:r>
           </w:p>
           <w:p>
@@ -8600,7 +8757,7 @@
                 <w:highlight w:val="yellow"/>
                 <w:lang w:val="en-US"/>
               </w:rPr>
-              <w:t>{{extra_148}}</w:t>
+              <w:t>Please detail the following:</w:t>
             </w:r>
           </w:p>
           <w:p>
@@ -8620,7 +8777,7 @@
                 <w:highlight w:val="yellow"/>
                 <w:lang w:val="en-US"/>
               </w:rPr>
-              <w:t>{{extra_149}}</w:t>
+              <w:t xml:space="preserve"> </w:t>
             </w:r>
           </w:p>
           <w:p>
@@ -8646,7 +8803,7 @@
                 <w:highlight w:val="yellow"/>
                 <w:lang w:val="en-US"/>
               </w:rPr>
-              <w:t>{{extra_150}}</w:t>
+              <w:t xml:space="preserve">Actual uptime over the last 12 months, vs published SLA. Target 99.9   </w:t>
             </w:r>
           </w:p>
           <w:p>
@@ -8672,7 +8829,7 @@
                 <w:highlight w:val="yellow"/>
                 <w:lang w:val="en-US"/>
               </w:rPr>
-              <w:t>{{extra_151}}</w:t>
+              <w:t xml:space="preserve">Time to recover access to full system and all of our data in the event of a disaster. Target within 8 working hours   </w:t>
             </w:r>
           </w:p>
           <w:p>
@@ -8698,7 +8855,7 @@
                 <w:highlight w:val="yellow"/>
                 <w:lang w:val="en-US"/>
               </w:rPr>
-              <w:t>{{extra_152}}</w:t>
+              <w:t xml:space="preserve">Average time to respond to Urgent/P1 support requests from the past 3 months. Target within 4 hours   </w:t>
             </w:r>
           </w:p>
           <w:p>
@@ -8724,7 +8881,7 @@
                 <w:highlight w:val="yellow"/>
                 <w:lang w:val="en-US"/>
               </w:rPr>
-              <w:t>{{extra_153}}</w:t>
+              <w:t>Logging of all logins and all activities performed by users and admins – to enable investigation in the event of unauthorized access. Target 1 month of logs or more. </w:t>
             </w:r>
           </w:p>
           <w:p>
@@ -8750,28 +8907,28 @@
                 <w:highlight w:val="yellow"/>
                 <w:lang w:val="en-US"/>
               </w:rPr>
-              <w:t>{{extra_154}}</w:t>
-            </w:r>
-          </w:p>
-          <w:p>
-            <w:pPr>
-              <w:rPr>
-                <w:rFonts w:asciiTheme="majorHAnsi" w:eastAsia="Calibri" w:hAnsiTheme="majorHAnsi" w:cstheme="majorHAnsi"/>
-                <w:sz w:val="18"/>
-                <w:szCs w:val="18"/>
-                <w:highlight w:val="yellow"/>
-                <w:lang w:val="en-US"/>
-              </w:rPr>
-            </w:pPr>
-            <w:r>
-              <w:rPr>
-                <w:rFonts w:asciiTheme="majorHAnsi" w:eastAsia="Calibri" w:hAnsiTheme="majorHAnsi" w:cstheme="majorHAnsi"/>
-                <w:sz w:val="18"/>
-                <w:szCs w:val="18"/>
-                <w:highlight w:val="yellow"/>
-                <w:lang w:val="en-US"/>
-              </w:rPr>
-              <w:t>{{extra_155}}</w:t>
+              <w:t>When is your maintenance work typically carried out and how much notice to do you give for normal maintenance?</w:t>
+            </w:r>
+          </w:p>
+          <w:p>
+            <w:pPr>
+              <w:rPr>
+                <w:rFonts w:asciiTheme="majorHAnsi" w:eastAsia="Calibri" w:hAnsiTheme="majorHAnsi" w:cstheme="majorHAnsi"/>
+                <w:sz w:val="18"/>
+                <w:szCs w:val="18"/>
+                <w:highlight w:val="yellow"/>
+                <w:lang w:val="en-US"/>
+              </w:rPr>
+            </w:pPr>
+            <w:r>
+              <w:rPr>
+                <w:rFonts w:asciiTheme="majorHAnsi" w:eastAsia="Calibri" w:hAnsiTheme="majorHAnsi" w:cstheme="majorHAnsi"/>
+                <w:sz w:val="18"/>
+                <w:szCs w:val="18"/>
+                <w:highlight w:val="yellow"/>
+                <w:lang w:val="en-US"/>
+              </w:rPr>
+              <w:t xml:space="preserve"> </w:t>
             </w:r>
           </w:p>
           <w:p>
@@ -8793,7 +8950,7 @@
                 <w:highlight w:val="yellow"/>
                 <w:lang w:val="en-US"/>
               </w:rPr>
-              <w:t>{{extra_156}}</w:t>
+              <w:t>Evaluation aspects:</w:t>
             </w:r>
           </w:p>
           <w:p>
@@ -8815,7 +8972,7 @@
                 <w:highlight w:val="yellow"/>
                 <w:lang w:val="en-US"/>
               </w:rPr>
-              <w:t>{{extra_157}}</w:t>
+              <w:t>The evaluation team will assess</w:t>
             </w:r>
             <w:r>
               <w:rPr>
@@ -8827,6 +8984,7 @@
                 <w:highlight w:val="yellow"/>
                 <w:lang w:val="en-US"/>
               </w:rPr>
+              <w:t xml:space="preserve"> whether the elements of technical support and reliability meet our requirements as specified above. Higher points will be awarded where </w:t>
             </w:r>
             <w:r>
               <w:rPr>
@@ -8838,6 +8996,7 @@
                 <w:highlight w:val="yellow"/>
                 <w:lang w:val="en-US"/>
               </w:rPr>
+              <w:t>all criteria</w:t>
             </w:r>
             <w:r>
               <w:rPr>
@@ -8849,6 +9008,7 @@
                 <w:highlight w:val="yellow"/>
                 <w:lang w:val="en-US"/>
               </w:rPr>
+              <w:t xml:space="preserve"> are met or exceeded.</w:t>
             </w:r>
           </w:p>
           <w:p>
@@ -8868,7 +9028,7 @@
                 <w:szCs w:val="18"/>
                 <w:highlight w:val="yellow"/>
               </w:rPr>
-              <w:t>{{extra_158}}</w:t>
+              <w:t xml:space="preserve"> </w:t>
             </w:r>
           </w:p>
         </w:tc>
@@ -8908,7 +9068,7 @@
                 <w:highlight w:val="yellow"/>
                 <w:lang w:val="en-US"/>
               </w:rPr>
-              <w:t>{{extra_159}}</w:t>
+              <w:t xml:space="preserve">Weighting: </w:t>
             </w:r>
             <w:r>
               <w:rPr>
@@ -8920,6 +9080,7 @@
                 <w:highlight w:val="yellow"/>
                 <w:lang w:val="en-US"/>
               </w:rPr>
+              <w:t>20%</w:t>
             </w:r>
           </w:p>
           <w:p>
@@ -8939,7 +9100,7 @@
                 <w:highlight w:val="yellow"/>
                 <w:lang w:val="en-US"/>
               </w:rPr>
-              <w:t>{{extra_160}}</w:t>
+              <w:t xml:space="preserve"> </w:t>
             </w:r>
           </w:p>
         </w:tc>
@@ -8982,7 +9143,7 @@
                 <w:szCs w:val="18"/>
                 <w:highlight w:val="yellow"/>
               </w:rPr>
-              <w:t>{{extra_161}}</w:t>
+              <w:t>Q3 – System Integration</w:t>
             </w:r>
           </w:p>
           <w:p>
@@ -9003,7 +9164,7 @@
                 <w:szCs w:val="18"/>
                 <w:highlight w:val="yellow"/>
               </w:rPr>
-              <w:t>{{extra_162}}</w:t>
+              <w:t xml:space="preserve"> </w:t>
             </w:r>
           </w:p>
         </w:tc>
@@ -9045,7 +9206,7 @@
                 <w:highlight w:val="yellow"/>
                 <w:lang w:val="en-US"/>
               </w:rPr>
-              <w:t>{{extra_163}}</w:t>
+              <w:t xml:space="preserve"> </w:t>
             </w:r>
           </w:p>
           <w:p>
@@ -9067,16 +9228,17 @@
                 <w:highlight w:val="yellow"/>
                 <w:lang w:val="en-US"/>
               </w:rPr>
-              <w:t>{{extra_164}}</w:t>
-            </w:r>
-            <w:r>
-              <w:rPr>
-                <w:rFonts w:asciiTheme="majorHAnsi" w:eastAsia="Calibri" w:hAnsiTheme="majorHAnsi" w:cstheme="majorHAnsi"/>
-                <w:sz w:val="18"/>
-                <w:szCs w:val="18"/>
-                <w:highlight w:val="yellow"/>
-                <w:lang w:val="en-US"/>
-              </w:rPr>
+              <w:t xml:space="preserve">App integration </w:t>
+            </w:r>
+            <w:r>
+              <w:rPr>
+                <w:rFonts w:asciiTheme="majorHAnsi" w:eastAsia="Calibri" w:hAnsiTheme="majorHAnsi" w:cstheme="majorHAnsi"/>
+                <w:sz w:val="18"/>
+                <w:szCs w:val="18"/>
+                <w:highlight w:val="yellow"/>
+                <w:lang w:val="en-US"/>
+              </w:rPr>
+              <w:t xml:space="preserve"> </w:t>
             </w:r>
           </w:p>
           <w:p>
@@ -9096,7 +9258,7 @@
                 <w:highlight w:val="yellow"/>
                 <w:lang w:val="en-US"/>
               </w:rPr>
-              <w:t>{{extra_165}}</w:t>
+              <w:t xml:space="preserve">Please detail if your system is able to integrate with the following apps and to what extent (i.e. what functionality does the integration allow):  </w:t>
             </w:r>
           </w:p>
           <w:p>
@@ -9116,7 +9278,7 @@
                 <w:highlight w:val="yellow"/>
                 <w:lang w:val="en-US"/>
               </w:rPr>
-              <w:t>{{extra_166}}</w:t>
+              <w:t xml:space="preserve"> </w:t>
             </w:r>
           </w:p>
           <w:p>
@@ -9142,7 +9304,7 @@
                 <w:highlight w:val="yellow"/>
                 <w:lang w:val="en-US"/>
               </w:rPr>
-              <w:t>{{extra_167}}</w:t>
+              <w:t xml:space="preserve">Office 365 including Outlook  </w:t>
             </w:r>
           </w:p>
           <w:p>
@@ -9168,7 +9330,7 @@
                 <w:highlight w:val="yellow"/>
                 <w:lang w:val="en-US"/>
               </w:rPr>
-              <w:t>{{extra_168}}</w:t>
+              <w:t xml:space="preserve">Slack  </w:t>
             </w:r>
           </w:p>
           <w:p>
@@ -9194,7 +9356,7 @@
                 <w:highlight w:val="yellow"/>
                 <w:lang w:val="en-US"/>
               </w:rPr>
-              <w:t>{{extra_169}}</w:t>
+              <w:t xml:space="preserve">Zoom   </w:t>
             </w:r>
           </w:p>
           <w:p>
@@ -9220,7 +9382,7 @@
                 <w:highlight w:val="yellow"/>
                 <w:lang w:val="en-US"/>
               </w:rPr>
-              <w:t>{{extra_170}}</w:t>
+              <w:t xml:space="preserve">Adobe Sign  </w:t>
             </w:r>
           </w:p>
           <w:p>
@@ -9240,7 +9402,7 @@
                 <w:highlight w:val="yellow"/>
                 <w:lang w:val="en-US"/>
               </w:rPr>
-              <w:t>{{extra_171}}</w:t>
+              <w:t xml:space="preserve"> </w:t>
             </w:r>
           </w:p>
           <w:p>
@@ -9262,16 +9424,17 @@
                 <w:highlight w:val="yellow"/>
                 <w:lang w:val="en-US"/>
               </w:rPr>
-              <w:t>{{extra_172}}</w:t>
-            </w:r>
-            <w:r>
-              <w:rPr>
-                <w:rFonts w:asciiTheme="majorHAnsi" w:eastAsia="Calibri" w:hAnsiTheme="majorHAnsi" w:cstheme="majorHAnsi"/>
-                <w:sz w:val="18"/>
-                <w:szCs w:val="18"/>
-                <w:highlight w:val="yellow"/>
-                <w:lang w:val="en-US"/>
-              </w:rPr>
+              <w:t>System integration</w:t>
+            </w:r>
+            <w:r>
+              <w:rPr>
+                <w:rFonts w:asciiTheme="majorHAnsi" w:eastAsia="Calibri" w:hAnsiTheme="majorHAnsi" w:cstheme="majorHAnsi"/>
+                <w:sz w:val="18"/>
+                <w:szCs w:val="18"/>
+                <w:highlight w:val="yellow"/>
+                <w:lang w:val="en-US"/>
+              </w:rPr>
+              <w:t xml:space="preserve"> </w:t>
             </w:r>
           </w:p>
           <w:p>
@@ -9291,7 +9454,7 @@
                 <w:highlight w:val="yellow"/>
                 <w:lang w:val="en-US"/>
               </w:rPr>
-              <w:t>{{extra_173}}</w:t>
+              <w:t xml:space="preserve">We currently use </w:t>
             </w:r>
             <w:proofErr w:type="spellStart"/>
             <w:r>
@@ -9302,6 +9465,7 @@
                 <w:highlight w:val="yellow"/>
                 <w:lang w:val="en-US"/>
               </w:rPr>
+              <w:t>Eploy</w:t>
             </w:r>
             <w:proofErr w:type="spellEnd"/>
             <w:r>
@@ -9312,6 +9476,7 @@
                 <w:highlight w:val="yellow"/>
                 <w:lang w:val="en-US"/>
               </w:rPr>
+              <w:t xml:space="preserve"> as our Applicant Tracking System. Are you able to integrate directly with </w:t>
             </w:r>
             <w:proofErr w:type="spellStart"/>
             <w:r>
@@ -9322,6 +9487,7 @@
                 <w:highlight w:val="yellow"/>
                 <w:lang w:val="en-US"/>
               </w:rPr>
+              <w:t>Eploy</w:t>
             </w:r>
             <w:proofErr w:type="spellEnd"/>
             <w:r>
@@ -9332,6 +9498,7 @@
                 <w:highlight w:val="yellow"/>
                 <w:lang w:val="en-US"/>
               </w:rPr>
+              <w:t xml:space="preserve"> so that we do not have to duplicate candidate information? If this can only be done via an API please give further details as to what that involves and how reliable and secure the connection is. </w:t>
             </w:r>
           </w:p>
           <w:p>
@@ -9351,28 +9518,28 @@
                 <w:highlight w:val="yellow"/>
                 <w:lang w:val="en-US"/>
               </w:rPr>
-              <w:t>{{extra_174}}</w:t>
-            </w:r>
-          </w:p>
-          <w:p>
-            <w:pPr>
-              <w:rPr>
-                <w:rFonts w:asciiTheme="majorHAnsi" w:eastAsia="Calibri" w:hAnsiTheme="majorHAnsi" w:cstheme="majorHAnsi"/>
-                <w:sz w:val="18"/>
-                <w:szCs w:val="18"/>
-                <w:highlight w:val="yellow"/>
-                <w:lang w:val="en-US"/>
-              </w:rPr>
-            </w:pPr>
-            <w:r>
-              <w:rPr>
-                <w:rFonts w:asciiTheme="majorHAnsi" w:eastAsia="Calibri" w:hAnsiTheme="majorHAnsi" w:cstheme="majorHAnsi"/>
-                <w:sz w:val="18"/>
-                <w:szCs w:val="18"/>
-                <w:highlight w:val="yellow"/>
-                <w:lang w:val="en-US"/>
-              </w:rPr>
-              <w:t>{{extra_175}}</w:t>
+              <w:t xml:space="preserve"> </w:t>
+            </w:r>
+          </w:p>
+          <w:p>
+            <w:pPr>
+              <w:rPr>
+                <w:rFonts w:asciiTheme="majorHAnsi" w:eastAsia="Calibri" w:hAnsiTheme="majorHAnsi" w:cstheme="majorHAnsi"/>
+                <w:sz w:val="18"/>
+                <w:szCs w:val="18"/>
+                <w:highlight w:val="yellow"/>
+                <w:lang w:val="en-US"/>
+              </w:rPr>
+            </w:pPr>
+            <w:r>
+              <w:rPr>
+                <w:rFonts w:asciiTheme="majorHAnsi" w:eastAsia="Calibri" w:hAnsiTheme="majorHAnsi" w:cstheme="majorHAnsi"/>
+                <w:sz w:val="18"/>
+                <w:szCs w:val="18"/>
+                <w:highlight w:val="yellow"/>
+                <w:lang w:val="en-US"/>
+              </w:rPr>
+              <w:t xml:space="preserve">Please detail if you have any integrations set up for Learning Management Systems and if so, with which providers. </w:t>
             </w:r>
           </w:p>
           <w:p>
@@ -9405,7 +9572,8 @@
                 <w:highlight w:val="yellow"/>
                 <w:lang w:val="en-US"/>
               </w:rPr>
-              <w:t>{{extra_176}}</w:t>
+              <w:lastRenderedPageBreak/>
+              <w:t>Evaluation aspects:</w:t>
             </w:r>
           </w:p>
           <w:p>
@@ -9427,7 +9595,7 @@
                 <w:highlight w:val="yellow"/>
                 <w:lang w:val="en-US"/>
               </w:rPr>
-              <w:t>{{extra_177}}</w:t>
+              <w:t xml:space="preserve">The evaluation team will award points for each integration available. Higher points will be awarded for integrated apps with </w:t>
             </w:r>
             <w:r>
               <w:rPr>
@@ -9439,6 +9607,7 @@
                 <w:highlight w:val="yellow"/>
                 <w:lang w:val="en-US"/>
               </w:rPr>
+              <w:t>more than</w:t>
             </w:r>
             <w:r>
               <w:rPr>
@@ -9450,6 +9619,7 @@
                 <w:highlight w:val="yellow"/>
                 <w:lang w:val="en-US"/>
               </w:rPr>
+              <w:t xml:space="preserve"> basic functionality and where a direct integration is available </w:t>
             </w:r>
             <w:r>
               <w:rPr>
@@ -9461,6 +9631,7 @@
                 <w:highlight w:val="yellow"/>
                 <w:lang w:val="en-US"/>
               </w:rPr>
+              <w:t xml:space="preserve">for </w:t>
             </w:r>
             <w:r>
               <w:rPr>
@@ -9472,6 +9643,7 @@
                 <w:highlight w:val="yellow"/>
                 <w:lang w:val="en-US"/>
               </w:rPr>
+              <w:t xml:space="preserve">our ATS, </w:t>
             </w:r>
             <w:r>
               <w:rPr>
@@ -9483,6 +9655,7 @@
                 <w:highlight w:val="yellow"/>
                 <w:lang w:val="en-US"/>
               </w:rPr>
+              <w:t>Eploy.</w:t>
             </w:r>
           </w:p>
           <w:p>
@@ -9501,7 +9674,7 @@
                 <w:szCs w:val="18"/>
                 <w:highlight w:val="yellow"/>
               </w:rPr>
-              <w:t>{{extra_178}}</w:t>
+              <w:t xml:space="preserve"> </w:t>
             </w:r>
           </w:p>
         </w:tc>
@@ -9543,7 +9716,8 @@
                 <w:highlight w:val="yellow"/>
                 <w:lang w:val="en-US"/>
               </w:rPr>
-              <w:t>{{extra_179}}</w:t>
+              <w:lastRenderedPageBreak/>
+              <w:t xml:space="preserve">Weighting: </w:t>
             </w:r>
             <w:r>
               <w:rPr>
@@ -9555,6 +9729,7 @@
                 <w:highlight w:val="yellow"/>
                 <w:lang w:val="en-US"/>
               </w:rPr>
+              <w:t>10%</w:t>
             </w:r>
           </w:p>
           <w:p>
@@ -9574,7 +9749,7 @@
                 <w:highlight w:val="yellow"/>
                 <w:lang w:val="en-US"/>
               </w:rPr>
-              <w:t>{{extra_180}}</w:t>
+              <w:t xml:space="preserve"> </w:t>
             </w:r>
           </w:p>
         </w:tc>
@@ -9734,7 +9909,7 @@
           <w:szCs w:val="18"/>
           <w:highlight w:val="yellow"/>
         </w:rPr>
-        <w:t>{{extra_6}}</w:t>
+        <w:t>Price per license/employee</w:t>
       </w:r>
     </w:p>
     <w:p>
@@ -9759,7 +9934,7 @@
           <w:szCs w:val="18"/>
           <w:highlight w:val="yellow"/>
         </w:rPr>
-        <w:t>{{extra_7}}</w:t>
+        <w:t>Note: we expect to have 180 employees in a year’s time. The price will be based on this number of employees multiplied by the price per license/employee.</w:t>
       </w:r>
     </w:p>
     <w:p>
@@ -9784,7 +9959,7 @@
           <w:szCs w:val="18"/>
           <w:highlight w:val="yellow"/>
         </w:rPr>
-        <w:t>{{extra_8}}</w:t>
+        <w:t>One-off implementation costs (if applicable)</w:t>
       </w:r>
     </w:p>
     <w:p>
@@ -9811,7 +9986,7 @@
           <w:szCs w:val="18"/>
           <w:highlight w:val="yellow"/>
         </w:rPr>
-        <w:t>{{extra_9}}</w:t>
+        <w:t>The score will be based on the final price for 180 employee licenses + one-off implementation costs (if applicable). All price</w:t>
       </w:r>
       <w:r>
         <w:rPr>
@@ -9820,6 +9995,7 @@
           <w:szCs w:val="18"/>
           <w:highlight w:val="yellow"/>
         </w:rPr>
+        <w:t>s are</w:t>
       </w:r>
       <w:r>
         <w:rPr>
@@ -9828,6 +10004,7 @@
           <w:szCs w:val="18"/>
           <w:highlight w:val="yellow"/>
         </w:rPr>
+        <w:t xml:space="preserve"> in EUR (excl. VAT).</w:t>
       </w:r>
     </w:p>
     <w:p>
@@ -9992,7 +10169,7 @@
           <w:szCs w:val="18"/>
           <w:highlight w:val="yellow"/>
         </w:rPr>
-        <w:t>{{extra_10}}</w:t>
+        <w:t xml:space="preserve">The Evaluation Phase will be divided into two phases. </w:t>
       </w:r>
     </w:p>
     <w:p>
@@ -10016,7 +10193,7 @@
           <w:szCs w:val="18"/>
           <w:highlight w:val="yellow"/>
         </w:rPr>
-        <w:t>{{extra_11}}</w:t>
+        <w:t>Phase 1 will consist of all Qualitative Awarding criteria being assessed and scored individually by the members of the Evaluation Team. When all individual scores are determined, the Evaluation team will reach consensus on the score that is awarded for the Qualitative Awarding criterium after Phase 1.</w:t>
       </w:r>
     </w:p>
     <w:p>
@@ -10033,7 +10210,7 @@
           <w:szCs w:val="18"/>
           <w:highlight w:val="yellow"/>
         </w:rPr>
-        <w:t>{{extra_12}}</w:t>
+        <w:t xml:space="preserve"> </w:t>
       </w:r>
     </w:p>
     <w:p>
@@ -10057,7 +10234,7 @@
           <w:szCs w:val="18"/>
           <w:highlight w:val="yellow"/>
         </w:rPr>
-        <w:t>{{extra_13}}</w:t>
+        <w:t xml:space="preserve">Phase 2 will be conducted based solely on the performance of </w:t>
       </w:r>
       <w:r>
         <w:rPr>
@@ -10068,6 +10245,7 @@
           <w:szCs w:val="18"/>
           <w:highlight w:val="yellow"/>
         </w:rPr>
+        <w:t>Q1 – User Experience</w:t>
       </w:r>
       <w:r>
         <w:rPr>
@@ -10076,6 +10254,7 @@
           <w:szCs w:val="18"/>
           <w:highlight w:val="yellow"/>
         </w:rPr>
+        <w:t xml:space="preserve">, which will be tested and </w:t>
       </w:r>
       <w:r>
         <w:rPr>
@@ -10086,6 +10265,7 @@
           <w:szCs w:val="18"/>
           <w:highlight w:val="yellow"/>
         </w:rPr>
+        <w:t>possibly</w:t>
       </w:r>
       <w:r>
         <w:rPr>
@@ -10094,6 +10274,7 @@
           <w:szCs w:val="18"/>
           <w:highlight w:val="yellow"/>
         </w:rPr>
+        <w:t xml:space="preserve"> re-scored based on demos. All Bidders that are theoretically able to win the Tender after Evaluation Phase 1, will be invited to take part in Evaluation Phase 2. Based on the scoring criteria in this document, the original score given to the Bidder in Phase 1 for Q1 may be amended to a new score based on the Bidder’s performance during Phase 2.</w:t>
       </w:r>
     </w:p>
     <w:p>
@@ -10922,7 +11103,7 @@
           <w:highlight w:val="yellow"/>
           <w:lang w:val="en-US"/>
         </w:rPr>
-        <w:t>{{extra_14}}</w:t>
+        <w:t>For Quantitative scoring criteria</w:t>
       </w:r>
       <w:r>
         <w:rPr>
@@ -10932,6 +11113,7 @@
           <w:highlight w:val="yellow"/>
           <w:lang w:val="en-US"/>
         </w:rPr>
+        <w:t xml:space="preserve">, </w:t>
       </w:r>
       <w:r>
         <w:rPr>
@@ -10941,6 +11123,7 @@
           <w:highlight w:val="yellow"/>
           <w:lang w:val="en-US"/>
         </w:rPr>
+        <w:t xml:space="preserve">a lower value </w:t>
       </w:r>
       <w:r>
         <w:rPr>
@@ -10950,6 +11133,7 @@
           <w:highlight w:val="yellow"/>
           <w:lang w:val="en-US"/>
         </w:rPr>
+        <w:t>will lead</w:t>
       </w:r>
       <w:r>
         <w:rPr>
@@ -10959,6 +11143,7 @@
           <w:highlight w:val="yellow"/>
           <w:lang w:val="en-US"/>
         </w:rPr>
+        <w:t xml:space="preserve"> to a higher score (e.g., to determine a score for a price)</w:t>
       </w:r>
       <w:r>
         <w:rPr>
@@ -10968,6 +11153,7 @@
           <w:highlight w:val="yellow"/>
           <w:lang w:val="en-US"/>
         </w:rPr>
+        <w:t>.</w:t>
       </w:r>
       <w:r>
         <w:rPr>
@@ -10977,6 +11163,7 @@
           <w:highlight w:val="yellow"/>
           <w:lang w:val="en-US"/>
         </w:rPr>
+        <w:t xml:space="preserve"> </w:t>
       </w:r>
       <w:r>
         <w:rPr>
@@ -10986,6 +11173,7 @@
           <w:highlight w:val="yellow"/>
           <w:lang w:val="en-US"/>
         </w:rPr>
+        <w:t xml:space="preserve">In this case, our target price of €15.000 </w:t>
       </w:r>
       <w:r>
         <w:rPr>
@@ -10995,6 +11183,7 @@
           <w:highlight w:val="yellow"/>
           <w:lang w:val="en-US"/>
         </w:rPr>
+        <w:t xml:space="preserve">(total cost) </w:t>
       </w:r>
       <w:r>
         <w:rPr>
@@ -11004,6 +11193,7 @@
           <w:highlight w:val="yellow"/>
           <w:lang w:val="en-US"/>
         </w:rPr>
+        <w:t xml:space="preserve">will be used </w:t>
       </w:r>
       <w:r>
         <w:rPr>
@@ -11013,6 +11203,7 @@
           <w:highlight w:val="yellow"/>
           <w:lang w:val="en-US"/>
         </w:rPr>
+        <w:t xml:space="preserve">as </w:t>
       </w:r>
       <w:r>
         <w:rPr>
@@ -11022,6 +11213,7 @@
           <w:highlight w:val="yellow"/>
           <w:lang w:val="en-US"/>
         </w:rPr>
+        <w:t>a relative scoring benchmark, representing the highest score you can achieve for the quantitative pricing element. Any offer below €15.000 will automatically be scored with full marks, it is not possible to exceed 100 points for this element.</w:t>
       </w:r>
     </w:p>
     <w:p>
@@ -11051,7 +11243,7 @@
           <w:highlight w:val="yellow"/>
           <w:lang w:val="en-US"/>
         </w:rPr>
-        <w:t>{{extra_15}}</w:t>
+        <w:t>The</w:t>
       </w:r>
       <w:r>
         <w:rPr>
@@ -11061,6 +11253,7 @@
           <w:highlight w:val="yellow"/>
           <w:lang w:val="en-US"/>
         </w:rPr>
+        <w:t xml:space="preserve"> following formula will be used:</w:t>
       </w:r>
     </w:p>
     <w:p>
@@ -11078,7 +11271,7 @@
           <w:highlight w:val="yellow"/>
           <w:lang w:val="en-US"/>
         </w:rPr>
-        <w:t>{{extra_16}}</w:t>
+        <w:t xml:space="preserve"> </w:t>
       </w:r>
     </w:p>
     <w:p>
@@ -11107,7 +11300,7 @@
           <w:highlight w:val="yellow"/>
           <w:lang w:val="en-US"/>
         </w:rPr>
-        <w:t>{{extra_17}}</w:t>
+        <w:t>Score = 100 * (15.000 / offered value by you)</w:t>
       </w:r>
       <w:bookmarkStart w:id="1" w:name="_Toc513650344"/>
       <w:bookmarkStart w:id="2" w:name="_Toc433286319"/>

</xml_diff>